<commit_message>
feat:  update DOCX templates.
</commit_message>
<xml_diff>
--- a/estimate_template.docx
+++ b/estimate_template.docx
@@ -124,8 +124,14 @@
     <w:p>
       <w:pPr>
         <w:pStyle w:val="Default"/>
+        <w:rPr>
+          <w:rFonts w:ascii="Open Sans Medium" w:hAnsi="Open Sans Medium" w:cs="Open Sans Medium"/>
+        </w:rPr>
       </w:pPr>
       <w:r>
+        <w:rPr>
+          <w:rFonts w:ascii="Open Sans Medium" w:hAnsi="Open Sans Medium" w:cs="Open Sans Medium"/>
+        </w:rPr>
         <w:t xml:space="preserve"> </w:t>
       </w:r>
     </w:p>
@@ -133,6 +139,7 @@
       <w:pPr>
         <w:pStyle w:val="Default"/>
         <w:rPr>
+          <w:rFonts w:ascii="Open Sans Medium" w:hAnsi="Open Sans Medium" w:cs="Open Sans Medium"/>
           <w:color w:val="612D4A"/>
           <w:sz w:val="57"/>
         </w:rPr>
@@ -140,6 +147,7 @@
       <w:proofErr w:type="spellStart"/>
       <w:r>
         <w:rPr>
+          <w:rFonts w:ascii="Open Sans Medium" w:hAnsi="Open Sans Medium" w:cs="Open Sans Medium"/>
           <w:b/>
           <w:color w:val="612D4A"/>
           <w:sz w:val="57"/>
@@ -149,6 +157,7 @@
       <w:proofErr w:type="spellEnd"/>
       <w:r>
         <w:rPr>
+          <w:rFonts w:ascii="Open Sans Medium" w:hAnsi="Open Sans Medium" w:cs="Open Sans Medium"/>
           <w:b/>
           <w:color w:val="612D4A"/>
           <w:sz w:val="57"/>
@@ -158,6 +167,7 @@
       <w:proofErr w:type="spellStart"/>
       <w:r>
         <w:rPr>
+          <w:rFonts w:ascii="Open Sans Medium" w:hAnsi="Open Sans Medium" w:cs="Open Sans Medium"/>
           <w:b/>
           <w:color w:val="612D4A"/>
           <w:sz w:val="57"/>
@@ -169,23 +179,25 @@
     <w:p>
       <w:pPr>
         <w:rPr>
-          <w:rFonts w:ascii="Georgia" w:hAnsi="Georgia"/>
+          <w:rFonts w:ascii="Open Sans Medium" w:hAnsi="Open Sans Medium" w:cs="Open Sans Medium"/>
           <w:b/>
           <w:sz w:val="56"/>
         </w:rPr>
       </w:pPr>
       <w:r>
         <w:rPr>
-          <w:rFonts w:ascii="Georgia" w:hAnsi="Georgia"/>
+          <w:rFonts w:ascii="Open Sans Medium" w:hAnsi="Open Sans Medium" w:cs="Open Sans Medium"/>
           <w:b/>
           <w:sz w:val="56"/>
         </w:rPr>
+        <w:lastRenderedPageBreak/>
         <w:br/>
       </w:r>
     </w:p>
     <w:p>
       <w:pPr>
         <w:rPr>
+          <w:rFonts w:ascii="Open Sans Medium" w:hAnsi="Open Sans Medium" w:cs="Open Sans Medium"/>
           <w:color w:val="323232"/>
           <w:sz w:val="24"/>
           <w:szCs w:val="24"/>
@@ -202,34 +214,47 @@
       </w:pPr>
     </w:p>
     <w:p>
+      <w:pPr>
+        <w:rPr>
+          <w:rFonts w:ascii="Open Sans Medium" w:hAnsi="Open Sans Medium" w:cs="Open Sans Medium"/>
+          <w:sz w:val="20"/>
+          <w:szCs w:val="20"/>
+        </w:rPr>
+      </w:pPr>
       <w:r>
         <w:rPr>
+          <w:rFonts w:ascii="Open Sans Medium" w:hAnsi="Open Sans Medium" w:cs="Open Sans Medium"/>
           <w:color w:val="323232"/>
-          <w:sz w:val="24"/>
-          <w:szCs w:val="24"/>
+          <w:sz w:val="20"/>
+          <w:szCs w:val="20"/>
         </w:rPr>
         <w:lastRenderedPageBreak/>
         <w:t>Dear {{CLIENT_NAME}},</w:t>
       </w:r>
       <w:r>
         <w:rPr>
-          <w:sz w:val="24"/>
+          <w:rFonts w:ascii="Open Sans Medium" w:hAnsi="Open Sans Medium" w:cs="Open Sans Medium"/>
+          <w:sz w:val="20"/>
+          <w:szCs w:val="20"/>
         </w:rPr>
         <w:br/>
       </w:r>
       <w:r>
         <w:rPr>
+          <w:rFonts w:ascii="Open Sans Medium" w:hAnsi="Open Sans Medium" w:cs="Open Sans Medium"/>
           <w:b/>
           <w:color w:val="612D4B"/>
-          <w:sz w:val="28"/>
+          <w:sz w:val="20"/>
+          <w:szCs w:val="20"/>
         </w:rPr>
         <w:br/>
       </w:r>
       <w:r>
         <w:rPr>
+          <w:rFonts w:ascii="Open Sans Medium" w:hAnsi="Open Sans Medium" w:cs="Open Sans Medium"/>
           <w:color w:val="323232"/>
-          <w:sz w:val="24"/>
-          <w:szCs w:val="24"/>
+          <w:sz w:val="20"/>
+          <w:szCs w:val="20"/>
         </w:rPr>
         <w:t>Thank you for the opportunity, to provide our services for your events. We look forward to sharing our services with you and your guests. Booking staff, planning and directing an event can be stressful. Therefore, we promise to do everything we can to ease the burden on you.</w:t>
       </w:r>
@@ -238,34 +263,40 @@
       <w:pPr>
         <w:pStyle w:val="Default"/>
         <w:rPr>
-          <w:rFonts w:asciiTheme="minorHAnsi" w:eastAsiaTheme="minorEastAsia" w:hAnsiTheme="minorHAnsi"/>
+          <w:rFonts w:ascii="Open Sans Medium" w:eastAsiaTheme="minorEastAsia" w:hAnsi="Open Sans Medium" w:cs="Open Sans Medium"/>
           <w:color w:val="323232"/>
-          <w:szCs w:val="24"/>
+          <w:sz w:val="20"/>
+          <w:szCs w:val="20"/>
         </w:rPr>
       </w:pPr>
       <w:r>
         <w:rPr>
-          <w:rFonts w:asciiTheme="minorHAnsi" w:eastAsiaTheme="minorEastAsia" w:hAnsiTheme="minorHAnsi"/>
+          <w:rFonts w:ascii="Open Sans Medium" w:eastAsiaTheme="minorEastAsia" w:hAnsi="Open Sans Medium" w:cs="Open Sans Medium"/>
           <w:color w:val="323232"/>
-          <w:szCs w:val="24"/>
+          <w:sz w:val="20"/>
+          <w:szCs w:val="20"/>
         </w:rPr>
         <w:t xml:space="preserve">We have taken all of your concerns and requests into consideration as we developed this proposal and quote. We would like to assure you that our wait </w:t>
       </w:r>
       <w:proofErr w:type="spellStart"/>
+      <w:proofErr w:type="gramStart"/>
       <w:r>
         <w:rPr>
-          <w:rFonts w:asciiTheme="minorHAnsi" w:eastAsiaTheme="minorEastAsia" w:hAnsiTheme="minorHAnsi"/>
+          <w:rFonts w:ascii="Open Sans Medium" w:eastAsiaTheme="minorEastAsia" w:hAnsi="Open Sans Medium" w:cs="Open Sans Medium"/>
           <w:color w:val="323232"/>
-          <w:szCs w:val="24"/>
+          <w:sz w:val="20"/>
+          <w:szCs w:val="20"/>
         </w:rPr>
         <w:t>staff,catering</w:t>
       </w:r>
       <w:proofErr w:type="spellEnd"/>
+      <w:proofErr w:type="gramEnd"/>
       <w:r>
         <w:rPr>
-          <w:rFonts w:asciiTheme="minorHAnsi" w:eastAsiaTheme="minorEastAsia" w:hAnsiTheme="minorHAnsi"/>
+          <w:rFonts w:ascii="Open Sans Medium" w:eastAsiaTheme="minorEastAsia" w:hAnsi="Open Sans Medium" w:cs="Open Sans Medium"/>
           <w:color w:val="323232"/>
-          <w:szCs w:val="24"/>
+          <w:sz w:val="20"/>
+          <w:szCs w:val="20"/>
         </w:rPr>
         <w:t xml:space="preserve"> and event services will meet your high food standards and suit your personal tastes.</w:t>
       </w:r>
@@ -274,70 +305,82 @@
       <w:pPr>
         <w:pStyle w:val="Default"/>
         <w:rPr>
-          <w:rFonts w:asciiTheme="minorHAnsi" w:eastAsiaTheme="minorEastAsia" w:hAnsiTheme="minorHAnsi"/>
+          <w:rFonts w:ascii="Open Sans Medium" w:eastAsiaTheme="minorEastAsia" w:hAnsi="Open Sans Medium" w:cs="Open Sans Medium"/>
           <w:color w:val="323232"/>
-          <w:szCs w:val="24"/>
+          <w:sz w:val="20"/>
+          <w:szCs w:val="20"/>
         </w:rPr>
       </w:pPr>
       <w:r>
         <w:rPr>
-          <w:rFonts w:asciiTheme="minorHAnsi" w:eastAsiaTheme="minorEastAsia" w:hAnsiTheme="minorHAnsi"/>
+          <w:rFonts w:ascii="Open Sans Medium" w:eastAsiaTheme="minorEastAsia" w:hAnsi="Open Sans Medium" w:cs="Open Sans Medium"/>
           <w:color w:val="323232"/>
-          <w:szCs w:val="24"/>
+          <w:sz w:val="20"/>
+          <w:szCs w:val="20"/>
         </w:rPr>
         <w:t xml:space="preserve">In this proposal, we have only included the services that you have </w:t>
       </w:r>
       <w:proofErr w:type="spellStart"/>
+      <w:proofErr w:type="gramStart"/>
       <w:r>
         <w:rPr>
-          <w:rFonts w:asciiTheme="minorHAnsi" w:eastAsiaTheme="minorEastAsia" w:hAnsiTheme="minorHAnsi"/>
+          <w:rFonts w:ascii="Open Sans Medium" w:eastAsiaTheme="minorEastAsia" w:hAnsi="Open Sans Medium" w:cs="Open Sans Medium"/>
           <w:color w:val="323232"/>
-          <w:szCs w:val="24"/>
+          <w:sz w:val="20"/>
+          <w:szCs w:val="20"/>
         </w:rPr>
         <w:t>selected.Please</w:t>
       </w:r>
       <w:proofErr w:type="spellEnd"/>
+      <w:proofErr w:type="gramEnd"/>
       <w:r>
         <w:rPr>
-          <w:rFonts w:asciiTheme="minorHAnsi" w:eastAsiaTheme="minorEastAsia" w:hAnsiTheme="minorHAnsi"/>
+          <w:rFonts w:ascii="Open Sans Medium" w:eastAsiaTheme="minorEastAsia" w:hAnsi="Open Sans Medium" w:cs="Open Sans Medium"/>
           <w:color w:val="323232"/>
-          <w:szCs w:val="24"/>
+          <w:sz w:val="20"/>
+          <w:szCs w:val="20"/>
         </w:rPr>
         <w:t xml:space="preserve"> feel free to notify us if you have any concerns or additional services </w:t>
       </w:r>
       <w:proofErr w:type="spellStart"/>
       <w:r>
         <w:rPr>
-          <w:rFonts w:asciiTheme="minorHAnsi" w:eastAsiaTheme="minorEastAsia" w:hAnsiTheme="minorHAnsi"/>
+          <w:rFonts w:ascii="Open Sans Medium" w:eastAsiaTheme="minorEastAsia" w:hAnsi="Open Sans Medium" w:cs="Open Sans Medium"/>
           <w:color w:val="323232"/>
-          <w:szCs w:val="24"/>
+          <w:sz w:val="20"/>
+          <w:szCs w:val="20"/>
         </w:rPr>
         <w:t>thatyou</w:t>
       </w:r>
       <w:proofErr w:type="spellEnd"/>
       <w:r>
         <w:rPr>
-          <w:rFonts w:asciiTheme="minorHAnsi" w:eastAsiaTheme="minorEastAsia" w:hAnsiTheme="minorHAnsi"/>
+          <w:rFonts w:ascii="Open Sans Medium" w:eastAsiaTheme="minorEastAsia" w:hAnsi="Open Sans Medium" w:cs="Open Sans Medium"/>
           <w:color w:val="323232"/>
-          <w:szCs w:val="24"/>
+          <w:sz w:val="20"/>
+          <w:szCs w:val="20"/>
         </w:rPr>
         <w:t xml:space="preserve"> would like to request. We hope that you will find this proposal to your </w:t>
       </w:r>
       <w:proofErr w:type="spellStart"/>
+      <w:proofErr w:type="gramStart"/>
       <w:r>
         <w:rPr>
-          <w:rFonts w:asciiTheme="minorHAnsi" w:eastAsiaTheme="minorEastAsia" w:hAnsiTheme="minorHAnsi"/>
+          <w:rFonts w:ascii="Open Sans Medium" w:eastAsiaTheme="minorEastAsia" w:hAnsi="Open Sans Medium" w:cs="Open Sans Medium"/>
           <w:color w:val="323232"/>
-          <w:szCs w:val="24"/>
+          <w:sz w:val="20"/>
+          <w:szCs w:val="20"/>
         </w:rPr>
         <w:t>liking.We</w:t>
       </w:r>
       <w:proofErr w:type="spellEnd"/>
+      <w:proofErr w:type="gramEnd"/>
       <w:r>
         <w:rPr>
-          <w:rFonts w:asciiTheme="minorHAnsi" w:eastAsiaTheme="minorEastAsia" w:hAnsiTheme="minorHAnsi"/>
+          <w:rFonts w:ascii="Open Sans Medium" w:eastAsiaTheme="minorEastAsia" w:hAnsi="Open Sans Medium" w:cs="Open Sans Medium"/>
           <w:color w:val="323232"/>
-          <w:szCs w:val="24"/>
+          <w:sz w:val="20"/>
+          <w:szCs w:val="20"/>
         </w:rPr>
         <w:t xml:space="preserve"> are looking forward to helping provide all your guests with an enjoyable and unforgettable experience.</w:t>
       </w:r>
@@ -346,112 +389,167 @@
       <w:pPr>
         <w:pStyle w:val="Default"/>
         <w:rPr>
-          <w:rFonts w:asciiTheme="minorHAnsi" w:eastAsiaTheme="minorEastAsia" w:hAnsiTheme="minorHAnsi"/>
+          <w:rFonts w:ascii="Open Sans Medium" w:eastAsiaTheme="minorEastAsia" w:hAnsi="Open Sans Medium" w:cs="Open Sans Medium"/>
           <w:color w:val="323232"/>
-          <w:szCs w:val="24"/>
+          <w:sz w:val="20"/>
+          <w:szCs w:val="20"/>
         </w:rPr>
       </w:pPr>
       <w:r>
         <w:rPr>
-          <w:rFonts w:asciiTheme="minorHAnsi" w:eastAsiaTheme="minorEastAsia" w:hAnsiTheme="minorHAnsi"/>
+          <w:rFonts w:ascii="Open Sans Medium" w:eastAsiaTheme="minorEastAsia" w:hAnsi="Open Sans Medium" w:cs="Open Sans Medium"/>
           <w:color w:val="323232"/>
-          <w:szCs w:val="24"/>
+          <w:sz w:val="20"/>
+          <w:szCs w:val="20"/>
         </w:rPr>
-        <w:t>Sincerely</w:t>
-      </w:r>
-      <w:r>
-        <w:rPr>
-          <w:rFonts w:asciiTheme="minorHAnsi" w:eastAsiaTheme="minorEastAsia" w:hAnsiTheme="minorHAnsi"/>
-          <w:color w:val="323232"/>
-          <w:szCs w:val="24"/>
-        </w:rPr>
-        <w:t>.</w:t>
+        <w:t>Sincerely.</w:t>
       </w:r>
     </w:p>
     <w:p>
       <w:pPr>
         <w:pStyle w:val="Default"/>
         <w:rPr>
-          <w:rFonts w:asciiTheme="minorHAnsi" w:eastAsiaTheme="minorEastAsia" w:hAnsiTheme="minorHAnsi"/>
+          <w:rFonts w:ascii="Open Sans Medium" w:eastAsiaTheme="minorEastAsia" w:hAnsi="Open Sans Medium" w:cs="Open Sans Medium"/>
           <w:color w:val="323232"/>
-          <w:szCs w:val="24"/>
+          <w:sz w:val="20"/>
+          <w:szCs w:val="20"/>
         </w:rPr>
       </w:pPr>
       <w:r>
         <w:rPr>
-          <w:rFonts w:asciiTheme="minorHAnsi" w:eastAsiaTheme="minorEastAsia" w:hAnsiTheme="minorHAnsi"/>
+          <w:rFonts w:ascii="Open Sans Medium" w:eastAsiaTheme="minorEastAsia" w:hAnsi="Open Sans Medium" w:cs="Open Sans Medium"/>
           <w:color w:val="323232"/>
-          <w:szCs w:val="24"/>
+          <w:sz w:val="20"/>
+          <w:szCs w:val="20"/>
         </w:rPr>
-        <w:t>_______________________</w:t>
-      </w:r>
-      <w:r>
-        <w:rPr>
-          <w:rFonts w:asciiTheme="minorHAnsi" w:eastAsiaTheme="minorEastAsia" w:hAnsiTheme="minorHAnsi"/>
-          <w:color w:val="323232"/>
-          <w:szCs w:val="24"/>
-        </w:rPr>
-        <w:t>_____________</w:t>
+        <w:t>____________________________________</w:t>
       </w:r>
     </w:p>
     <w:p>
       <w:pPr>
         <w:pStyle w:val="Default"/>
         <w:rPr>
-          <w:rFonts w:asciiTheme="minorHAnsi" w:eastAsiaTheme="minorEastAsia" w:hAnsiTheme="minorHAnsi"/>
+          <w:rFonts w:ascii="Open Sans Medium" w:eastAsiaTheme="minorEastAsia" w:hAnsi="Open Sans Medium" w:cs="Open Sans Medium"/>
           <w:color w:val="323232"/>
-          <w:szCs w:val="24"/>
+          <w:sz w:val="20"/>
+          <w:szCs w:val="20"/>
         </w:rPr>
       </w:pPr>
       <w:r>
         <w:rPr>
-          <w:rFonts w:asciiTheme="minorHAnsi" w:eastAsiaTheme="minorEastAsia" w:hAnsiTheme="minorHAnsi"/>
+          <w:rFonts w:ascii="Open Sans Medium" w:eastAsiaTheme="minorEastAsia" w:hAnsi="Open Sans Medium" w:cs="Open Sans Medium"/>
           <w:color w:val="323232"/>
-          <w:szCs w:val="24"/>
+          <w:sz w:val="20"/>
+          <w:szCs w:val="20"/>
         </w:rPr>
         <w:t>{{REPRESENTATIVE_NAME}}</w:t>
       </w:r>
     </w:p>
-    <w:p/>
-    <w:p/>
-    <w:p/>
-    <w:p/>
-    <w:p/>
-    <w:p/>
-    <w:p/>
-    <w:p/>
-    <w:p/>
-    <w:p/>
-    <w:p/>
-    <w:p/>
-    <w:p/>
-    <w:p/>
     <w:p>
+      <w:pPr>
+        <w:rPr>
+          <w:rFonts w:ascii="Open Sans Medium" w:hAnsi="Open Sans Medium" w:cs="Open Sans Medium"/>
+        </w:rPr>
+      </w:pPr>
+    </w:p>
+    <w:p>
+      <w:pPr>
+        <w:rPr>
+          <w:rFonts w:ascii="Open Sans Medium" w:hAnsi="Open Sans Medium" w:cs="Open Sans Medium"/>
+        </w:rPr>
+      </w:pPr>
+    </w:p>
+    <w:p>
+      <w:pPr>
+        <w:rPr>
+          <w:rFonts w:ascii="Open Sans Medium" w:hAnsi="Open Sans Medium" w:cs="Open Sans Medium"/>
+        </w:rPr>
+      </w:pPr>
+    </w:p>
+    <w:p>
+      <w:pPr>
+        <w:rPr>
+          <w:rFonts w:ascii="Open Sans Medium" w:hAnsi="Open Sans Medium" w:cs="Open Sans Medium"/>
+        </w:rPr>
+      </w:pPr>
+    </w:p>
+    <w:p>
+      <w:pPr>
+        <w:rPr>
+          <w:rFonts w:ascii="Open Sans Medium" w:hAnsi="Open Sans Medium" w:cs="Open Sans Medium"/>
+        </w:rPr>
+      </w:pPr>
+    </w:p>
+    <w:p>
+      <w:pPr>
+        <w:rPr>
+          <w:rFonts w:ascii="Open Sans Medium" w:hAnsi="Open Sans Medium" w:cs="Open Sans Medium"/>
+        </w:rPr>
+      </w:pPr>
+    </w:p>
+    <w:p>
+      <w:pPr>
+        <w:rPr>
+          <w:rFonts w:ascii="Open Sans Medium" w:hAnsi="Open Sans Medium" w:cs="Open Sans Medium"/>
+        </w:rPr>
+      </w:pPr>
+    </w:p>
+    <w:p>
+      <w:pPr>
+        <w:rPr>
+          <w:rFonts w:ascii="Open Sans Medium" w:hAnsi="Open Sans Medium" w:cs="Open Sans Medium"/>
+        </w:rPr>
+      </w:pPr>
+    </w:p>
+    <w:p>
+      <w:pPr>
+        <w:rPr>
+          <w:rFonts w:ascii="Open Sans Medium" w:hAnsi="Open Sans Medium" w:cs="Open Sans Medium"/>
+          <w:sz w:val="20"/>
+          <w:szCs w:val="20"/>
+        </w:rPr>
+      </w:pPr>
       <w:r>
+        <w:rPr>
+          <w:rFonts w:ascii="Open Sans Medium" w:hAnsi="Open Sans Medium" w:cs="Open Sans Medium"/>
+          <w:sz w:val="20"/>
+          <w:szCs w:val="20"/>
+        </w:rPr>
+        <w:lastRenderedPageBreak/>
         <w:t>[DYNAMIC_CONTENT_START]</w:t>
       </w:r>
     </w:p>
     <w:p>
       <w:pPr>
         <w:spacing w:after="0" w:line="240" w:lineRule="auto"/>
+        <w:rPr>
+          <w:rFonts w:ascii="Open Sans Medium" w:hAnsi="Open Sans Medium" w:cs="Open Sans Medium"/>
+        </w:rPr>
       </w:pPr>
       <w:r>
+        <w:rPr>
+          <w:rFonts w:ascii="Open Sans Medium" w:hAnsi="Open Sans Medium" w:cs="Open Sans Medium"/>
+        </w:rPr>
         <w:br w:type="page"/>
       </w:r>
     </w:p>
     <w:p>
       <w:pPr>
         <w:rPr>
+          <w:rFonts w:ascii="Open Sans Medium" w:hAnsi="Open Sans Medium" w:cs="Open Sans Medium"/>
           <w:b/>
           <w:color w:val="612D4B"/>
           <w:sz w:val="24"/>
+          <w:szCs w:val="24"/>
         </w:rPr>
       </w:pPr>
       <w:r>
         <w:rPr>
+          <w:rFonts w:ascii="Open Sans Medium" w:hAnsi="Open Sans Medium" w:cs="Open Sans Medium"/>
           <w:b/>
           <w:color w:val="612D4B"/>
           <w:sz w:val="24"/>
+          <w:szCs w:val="24"/>
         </w:rPr>
         <w:lastRenderedPageBreak/>
         <w:t>Explanation of Fees</w:t>
@@ -460,18 +558,20 @@
     <w:p>
       <w:pPr>
         <w:rPr>
+          <w:rFonts w:ascii="Open Sans Medium" w:hAnsi="Open Sans Medium" w:cs="Open Sans Medium"/>
           <w:b/>
           <w:bCs/>
-          <w:sz w:val="20"/>
-          <w:szCs w:val="20"/>
+          <w:sz w:val="18"/>
+          <w:szCs w:val="18"/>
         </w:rPr>
       </w:pPr>
       <w:r>
         <w:rPr>
+          <w:rFonts w:ascii="Open Sans Medium" w:hAnsi="Open Sans Medium" w:cs="Open Sans Medium"/>
           <w:b/>
           <w:bCs/>
-          <w:sz w:val="20"/>
-          <w:szCs w:val="20"/>
+          <w:sz w:val="18"/>
+          <w:szCs w:val="18"/>
         </w:rPr>
         <w:t>Event Planning Service</w:t>
       </w:r>
@@ -480,49 +580,73 @@
       <w:pPr>
         <w:jc w:val="both"/>
         <w:rPr>
-          <w:sz w:val="20"/>
-          <w:szCs w:val="20"/>
+          <w:rFonts w:ascii="Open Sans Medium" w:hAnsi="Open Sans Medium" w:cs="Open Sans Medium"/>
+          <w:sz w:val="18"/>
+          <w:szCs w:val="18"/>
         </w:rPr>
       </w:pPr>
       <w:r>
         <w:rPr>
-          <w:sz w:val="20"/>
-          <w:szCs w:val="20"/>
+          <w:rFonts w:ascii="Open Sans Medium" w:hAnsi="Open Sans Medium" w:cs="Open Sans Medium"/>
+          <w:sz w:val="18"/>
+          <w:szCs w:val="18"/>
         </w:rPr>
         <w:t xml:space="preserve">If a client </w:t>
       </w:r>
       <w:proofErr w:type="spellStart"/>
       <w:r>
         <w:rPr>
-          <w:sz w:val="20"/>
-          <w:szCs w:val="20"/>
+          <w:rFonts w:ascii="Open Sans Medium" w:hAnsi="Open Sans Medium" w:cs="Open Sans Medium"/>
+          <w:sz w:val="18"/>
+          <w:szCs w:val="18"/>
         </w:rPr>
         <w:t>resquets</w:t>
       </w:r>
       <w:proofErr w:type="spellEnd"/>
       <w:r>
         <w:rPr>
-          <w:sz w:val="20"/>
-          <w:szCs w:val="20"/>
+          <w:rFonts w:ascii="Open Sans Medium" w:hAnsi="Open Sans Medium" w:cs="Open Sans Medium"/>
+          <w:sz w:val="18"/>
+          <w:szCs w:val="18"/>
         </w:rPr>
-        <w:t xml:space="preserve"> that the caterer coordinate the venue rental &amp; décor, entertainment, photography, valet parking, flower arranging, or other aspects of planning the event, there will be a small fee charged for this service to account for the labor needed to plan the event as agreed upon in writing by the parties at the time of such request.</w:t>
+        <w:t xml:space="preserve"> that the caterer </w:t>
+      </w:r>
+      <w:proofErr w:type="gramStart"/>
+      <w:r>
+        <w:rPr>
+          <w:rFonts w:ascii="Open Sans Medium" w:hAnsi="Open Sans Medium" w:cs="Open Sans Medium"/>
+          <w:sz w:val="18"/>
+          <w:szCs w:val="18"/>
+        </w:rPr>
+        <w:t>coordinate</w:t>
+      </w:r>
+      <w:proofErr w:type="gramEnd"/>
+      <w:r>
+        <w:rPr>
+          <w:rFonts w:ascii="Open Sans Medium" w:hAnsi="Open Sans Medium" w:cs="Open Sans Medium"/>
+          <w:sz w:val="18"/>
+          <w:szCs w:val="18"/>
+        </w:rPr>
+        <w:t xml:space="preserve"> the venue rental &amp; décor, entertainment, photography, valet parking, flower arranging, or other aspects of planning the event, there will be a small fee charged for this service to account for the labor needed to plan the event as agreed upon in writing by the parties at the time of such request.</w:t>
       </w:r>
     </w:p>
     <w:p>
       <w:pPr>
         <w:rPr>
+          <w:rFonts w:ascii="Open Sans Medium" w:hAnsi="Open Sans Medium" w:cs="Open Sans Medium"/>
           <w:b/>
           <w:bCs/>
-          <w:sz w:val="20"/>
-          <w:szCs w:val="20"/>
+          <w:sz w:val="18"/>
+          <w:szCs w:val="18"/>
         </w:rPr>
       </w:pPr>
       <w:r>
         <w:rPr>
+          <w:rFonts w:ascii="Open Sans Medium" w:hAnsi="Open Sans Medium" w:cs="Open Sans Medium"/>
           <w:b/>
           <w:bCs/>
-          <w:sz w:val="20"/>
-          <w:szCs w:val="20"/>
+          <w:sz w:val="18"/>
+          <w:szCs w:val="18"/>
         </w:rPr>
         <w:t>Delivery Fee</w:t>
       </w:r>
@@ -530,14 +654,16 @@
     <w:p>
       <w:pPr>
         <w:rPr>
-          <w:sz w:val="20"/>
-          <w:szCs w:val="20"/>
+          <w:rFonts w:ascii="Open Sans Medium" w:hAnsi="Open Sans Medium" w:cs="Open Sans Medium"/>
+          <w:sz w:val="18"/>
+          <w:szCs w:val="18"/>
         </w:rPr>
       </w:pPr>
       <w:r>
         <w:rPr>
-          <w:sz w:val="20"/>
-          <w:szCs w:val="20"/>
+          <w:rFonts w:ascii="Open Sans Medium" w:hAnsi="Open Sans Medium" w:cs="Open Sans Medium"/>
+          <w:sz w:val="18"/>
+          <w:szCs w:val="18"/>
         </w:rPr>
         <w:t>Not Applicable</w:t>
       </w:r>
@@ -545,18 +671,20 @@
     <w:p>
       <w:pPr>
         <w:rPr>
+          <w:rFonts w:ascii="Open Sans Medium" w:hAnsi="Open Sans Medium" w:cs="Open Sans Medium"/>
           <w:b/>
           <w:bCs/>
-          <w:sz w:val="20"/>
-          <w:szCs w:val="20"/>
+          <w:sz w:val="18"/>
+          <w:szCs w:val="18"/>
         </w:rPr>
       </w:pPr>
       <w:r>
         <w:rPr>
+          <w:rFonts w:ascii="Open Sans Medium" w:hAnsi="Open Sans Medium" w:cs="Open Sans Medium"/>
           <w:b/>
           <w:bCs/>
-          <w:sz w:val="20"/>
-          <w:szCs w:val="20"/>
+          <w:sz w:val="18"/>
+          <w:szCs w:val="18"/>
         </w:rPr>
         <w:t>Service Charge</w:t>
       </w:r>
@@ -565,47 +693,37 @@
       <w:pPr>
         <w:jc w:val="both"/>
         <w:rPr>
-          <w:sz w:val="20"/>
-          <w:szCs w:val="20"/>
+          <w:rFonts w:ascii="Open Sans Medium" w:hAnsi="Open Sans Medium" w:cs="Open Sans Medium"/>
+          <w:sz w:val="18"/>
+          <w:szCs w:val="18"/>
         </w:rPr>
       </w:pPr>
       <w:r>
         <w:rPr>
-          <w:sz w:val="20"/>
-          <w:szCs w:val="20"/>
+          <w:rFonts w:ascii="Open Sans Medium" w:hAnsi="Open Sans Medium" w:cs="Open Sans Medium"/>
+          <w:sz w:val="18"/>
+          <w:szCs w:val="18"/>
         </w:rPr>
-        <w:t>A service charge of 18,00 % is Indicated in your proposal of service.</w:t>
-      </w:r>
-      <w:r>
-        <w:rPr>
-          <w:sz w:val="20"/>
-          <w:szCs w:val="20"/>
-        </w:rPr>
-        <w:t xml:space="preserve"> </w:t>
-      </w:r>
-      <w:r>
-        <w:rPr>
-          <w:sz w:val="20"/>
-          <w:szCs w:val="20"/>
-        </w:rPr>
-        <w:t>This fee covers all administration, insurance fees, transportation, site visits, trucking, &amp; supplemental costs associated with the event planning.</w:t>
+        <w:t>A service charge of 18,00 % is Indicated in your proposal of service. This fee covers all administration, insurance fees, transportation, site visits, trucking, &amp; supplemental costs associated with the event planning.</w:t>
       </w:r>
     </w:p>
     <w:p>
       <w:pPr>
         <w:rPr>
+          <w:rFonts w:ascii="Open Sans Medium" w:hAnsi="Open Sans Medium" w:cs="Open Sans Medium"/>
           <w:b/>
           <w:bCs/>
-          <w:sz w:val="20"/>
-          <w:szCs w:val="20"/>
+          <w:sz w:val="18"/>
+          <w:szCs w:val="18"/>
         </w:rPr>
       </w:pPr>
       <w:r>
         <w:rPr>
+          <w:rFonts w:ascii="Open Sans Medium" w:hAnsi="Open Sans Medium" w:cs="Open Sans Medium"/>
           <w:b/>
           <w:bCs/>
-          <w:sz w:val="20"/>
-          <w:szCs w:val="20"/>
+          <w:sz w:val="18"/>
+          <w:szCs w:val="18"/>
         </w:rPr>
         <w:t>Gratuities</w:t>
       </w:r>
@@ -614,14 +732,16 @@
       <w:pPr>
         <w:jc w:val="both"/>
         <w:rPr>
-          <w:sz w:val="20"/>
-          <w:szCs w:val="20"/>
+          <w:rFonts w:ascii="Open Sans Medium" w:hAnsi="Open Sans Medium" w:cs="Open Sans Medium"/>
+          <w:sz w:val="18"/>
+          <w:szCs w:val="18"/>
         </w:rPr>
       </w:pPr>
       <w:r>
         <w:rPr>
-          <w:sz w:val="20"/>
-          <w:szCs w:val="20"/>
+          <w:rFonts w:ascii="Open Sans Medium" w:hAnsi="Open Sans Medium" w:cs="Open Sans Medium"/>
+          <w:sz w:val="18"/>
+          <w:szCs w:val="18"/>
         </w:rPr>
         <w:t>Gratuities are not included in the proposal and are at the sole discretion of the client.</w:t>
       </w:r>
@@ -629,18 +749,20 @@
     <w:p>
       <w:pPr>
         <w:rPr>
+          <w:rFonts w:ascii="Open Sans Medium" w:hAnsi="Open Sans Medium" w:cs="Open Sans Medium"/>
           <w:b/>
           <w:bCs/>
-          <w:sz w:val="20"/>
-          <w:szCs w:val="20"/>
+          <w:sz w:val="18"/>
+          <w:szCs w:val="18"/>
         </w:rPr>
       </w:pPr>
       <w:r>
         <w:rPr>
+          <w:rFonts w:ascii="Open Sans Medium" w:hAnsi="Open Sans Medium" w:cs="Open Sans Medium"/>
           <w:b/>
           <w:bCs/>
-          <w:sz w:val="20"/>
-          <w:szCs w:val="20"/>
+          <w:sz w:val="18"/>
+          <w:szCs w:val="18"/>
         </w:rPr>
         <w:t>Taxes and Insurance</w:t>
       </w:r>
@@ -648,14 +770,16 @@
     <w:p>
       <w:pPr>
         <w:rPr>
-          <w:sz w:val="20"/>
-          <w:szCs w:val="20"/>
+          <w:rFonts w:ascii="Open Sans Medium" w:hAnsi="Open Sans Medium" w:cs="Open Sans Medium"/>
+          <w:sz w:val="18"/>
+          <w:szCs w:val="18"/>
         </w:rPr>
       </w:pPr>
       <w:r>
         <w:rPr>
-          <w:sz w:val="20"/>
-          <w:szCs w:val="20"/>
+          <w:rFonts w:ascii="Open Sans Medium" w:hAnsi="Open Sans Medium" w:cs="Open Sans Medium"/>
+          <w:sz w:val="18"/>
+          <w:szCs w:val="18"/>
         </w:rPr>
         <w:t>All prices are subject to a 18,00 % service and</w:t>
       </w:r>
@@ -663,18 +787,20 @@
     <w:p>
       <w:pPr>
         <w:rPr>
+          <w:rFonts w:ascii="Open Sans Medium" w:hAnsi="Open Sans Medium" w:cs="Open Sans Medium"/>
           <w:b/>
           <w:bCs/>
-          <w:sz w:val="20"/>
-          <w:szCs w:val="20"/>
+          <w:sz w:val="18"/>
+          <w:szCs w:val="18"/>
         </w:rPr>
       </w:pPr>
       <w:r>
         <w:rPr>
+          <w:rFonts w:ascii="Open Sans Medium" w:hAnsi="Open Sans Medium" w:cs="Open Sans Medium"/>
           <w:b/>
           <w:bCs/>
-          <w:sz w:val="20"/>
-          <w:szCs w:val="20"/>
+          <w:sz w:val="18"/>
+          <w:szCs w:val="18"/>
         </w:rPr>
         <w:t>Governing Terms</w:t>
       </w:r>
@@ -683,23 +809,26 @@
       <w:pPr>
         <w:jc w:val="both"/>
         <w:rPr>
-          <w:sz w:val="20"/>
-          <w:szCs w:val="20"/>
+          <w:rFonts w:ascii="Open Sans Medium" w:hAnsi="Open Sans Medium" w:cs="Open Sans Medium"/>
+          <w:sz w:val="18"/>
+          <w:szCs w:val="18"/>
         </w:rPr>
       </w:pPr>
       <w:proofErr w:type="spellStart"/>
       <w:r>
         <w:rPr>
-          <w:sz w:val="20"/>
-          <w:szCs w:val="20"/>
+          <w:rFonts w:ascii="Open Sans Medium" w:hAnsi="Open Sans Medium" w:cs="Open Sans Medium"/>
+          <w:sz w:val="18"/>
+          <w:szCs w:val="18"/>
         </w:rPr>
         <w:t>Foodesign</w:t>
       </w:r>
       <w:proofErr w:type="spellEnd"/>
       <w:r>
         <w:rPr>
-          <w:sz w:val="20"/>
-          <w:szCs w:val="20"/>
+          <w:rFonts w:ascii="Open Sans Medium" w:hAnsi="Open Sans Medium" w:cs="Open Sans Medium"/>
+          <w:sz w:val="18"/>
+          <w:szCs w:val="18"/>
         </w:rPr>
         <w:t xml:space="preserve"> Conceptual Events and the Client acknowledge and agree that this proposal is governed by the Master Caterer Agreement executed between the parties.</w:t>
       </w:r>
@@ -707,18 +836,20 @@
     <w:p>
       <w:pPr>
         <w:rPr>
+          <w:rFonts w:ascii="Open Sans Medium" w:hAnsi="Open Sans Medium" w:cs="Open Sans Medium"/>
           <w:b/>
           <w:bCs/>
-          <w:sz w:val="20"/>
-          <w:szCs w:val="20"/>
+          <w:sz w:val="18"/>
+          <w:szCs w:val="18"/>
         </w:rPr>
       </w:pPr>
       <w:r>
         <w:rPr>
+          <w:rFonts w:ascii="Open Sans Medium" w:hAnsi="Open Sans Medium" w:cs="Open Sans Medium"/>
           <w:b/>
           <w:bCs/>
-          <w:sz w:val="20"/>
-          <w:szCs w:val="20"/>
+          <w:sz w:val="18"/>
+          <w:szCs w:val="18"/>
         </w:rPr>
         <w:t>Acceptance By Client</w:t>
       </w:r>
@@ -727,30 +858,34 @@
       <w:pPr>
         <w:jc w:val="both"/>
         <w:rPr>
-          <w:sz w:val="20"/>
-          <w:szCs w:val="20"/>
+          <w:rFonts w:ascii="Open Sans Medium" w:hAnsi="Open Sans Medium" w:cs="Open Sans Medium"/>
+          <w:sz w:val="18"/>
+          <w:szCs w:val="18"/>
         </w:rPr>
       </w:pPr>
       <w:r>
         <w:rPr>
-          <w:sz w:val="20"/>
-          <w:szCs w:val="20"/>
+          <w:rFonts w:ascii="Open Sans Medium" w:hAnsi="Open Sans Medium" w:cs="Open Sans Medium"/>
+          <w:sz w:val="18"/>
+          <w:szCs w:val="18"/>
         </w:rPr>
         <w:t xml:space="preserve">The undersigned, as a duly authorized representative of the Client, Math for America, hereby contract the services of </w:t>
       </w:r>
       <w:proofErr w:type="spellStart"/>
       <w:r>
         <w:rPr>
-          <w:sz w:val="20"/>
-          <w:szCs w:val="20"/>
+          <w:rFonts w:ascii="Open Sans Medium" w:hAnsi="Open Sans Medium" w:cs="Open Sans Medium"/>
+          <w:sz w:val="18"/>
+          <w:szCs w:val="18"/>
         </w:rPr>
         <w:t>Foodesign</w:t>
       </w:r>
       <w:proofErr w:type="spellEnd"/>
       <w:r>
         <w:rPr>
-          <w:sz w:val="20"/>
-          <w:szCs w:val="20"/>
+          <w:rFonts w:ascii="Open Sans Medium" w:hAnsi="Open Sans Medium" w:cs="Open Sans Medium"/>
+          <w:sz w:val="18"/>
+          <w:szCs w:val="18"/>
         </w:rPr>
         <w:t xml:space="preserve"> Conceptual Events as listed and quoted in this proposal on behalf of the Client according to the terms and conditions herein.</w:t>
       </w:r>
@@ -759,18 +894,20 @@
       <w:pPr>
         <w:jc w:val="both"/>
         <w:rPr>
+          <w:rFonts w:ascii="Open Sans Medium" w:hAnsi="Open Sans Medium" w:cs="Open Sans Medium"/>
           <w:b/>
           <w:bCs/>
-          <w:sz w:val="28"/>
-          <w:szCs w:val="28"/>
+          <w:sz w:val="20"/>
+          <w:szCs w:val="20"/>
         </w:rPr>
       </w:pPr>
       <w:r>
         <w:rPr>
+          <w:rFonts w:ascii="Open Sans Medium" w:hAnsi="Open Sans Medium" w:cs="Open Sans Medium"/>
           <w:b/>
           <w:bCs/>
-          <w:sz w:val="28"/>
-          <w:szCs w:val="28"/>
+          <w:sz w:val="20"/>
+          <w:szCs w:val="20"/>
         </w:rPr>
         <w:t>Signed: _______________________________</w:t>
       </w:r>
@@ -779,18 +916,20 @@
       <w:pPr>
         <w:jc w:val="both"/>
         <w:rPr>
+          <w:rFonts w:ascii="Open Sans Medium" w:hAnsi="Open Sans Medium" w:cs="Open Sans Medium"/>
           <w:b/>
           <w:bCs/>
-          <w:sz w:val="28"/>
-          <w:szCs w:val="28"/>
+          <w:sz w:val="20"/>
+          <w:szCs w:val="20"/>
         </w:rPr>
       </w:pPr>
       <w:r>
         <w:rPr>
+          <w:rFonts w:ascii="Open Sans Medium" w:hAnsi="Open Sans Medium" w:cs="Open Sans Medium"/>
           <w:b/>
           <w:bCs/>
-          <w:sz w:val="28"/>
-          <w:szCs w:val="28"/>
+          <w:sz w:val="20"/>
+          <w:szCs w:val="20"/>
         </w:rPr>
         <w:t>Name: ________________________________</w:t>
       </w:r>
@@ -799,12 +938,28 @@
       <w:pPr>
         <w:pStyle w:val="Ttulo1"/>
         <w:spacing w:before="0"/>
+        <w:rPr>
+          <w:rFonts w:ascii="Open Sans Medium" w:hAnsi="Open Sans Medium" w:cs="Open Sans Medium"/>
+          <w:sz w:val="20"/>
+          <w:szCs w:val="20"/>
+        </w:rPr>
       </w:pPr>
       <w:r>
+        <w:rPr>
+          <w:rFonts w:ascii="Open Sans Medium" w:hAnsi="Open Sans Medium" w:cs="Open Sans Medium"/>
+          <w:sz w:val="20"/>
+          <w:szCs w:val="20"/>
+        </w:rPr>
         <w:t>Data: _________________________________</w:t>
       </w:r>
     </w:p>
-    <w:p/>
+    <w:p>
+      <w:pPr>
+        <w:rPr>
+          <w:rFonts w:ascii="Open Sans Medium" w:hAnsi="Open Sans Medium" w:cs="Open Sans Medium"/>
+        </w:rPr>
+      </w:pPr>
+    </w:p>
     <w:sectPr>
       <w:pgSz w:w="12240" w:h="15840"/>
       <w:pgMar w:top="1440" w:right="1800" w:bottom="1440" w:left="4608" w:header="0" w:footer="0" w:gutter="0"/>
@@ -1129,11 +1284,6 @@
                               <w:sz w:val="20"/>
                             </w:rPr>
                             <w:br/>
-                          </w:r>
-                          <w:r>
-                            <w:rPr>
-                              <w:sz w:val="20"/>
-                            </w:rPr>
                             <w:t>{{EVENT_GUESTS}} Guests</w:t>
                           </w:r>
                         </w:p>
@@ -1418,11 +1568,6 @@
                         <w:sz w:val="20"/>
                       </w:rPr>
                       <w:br/>
-                    </w:r>
-                    <w:r>
-                      <w:rPr>
-                        <w:sz w:val="20"/>
-                      </w:rPr>
                       <w:t>{{EVENT_GUESTS}} Guests</w:t>
                     </w:r>
                   </w:p>
@@ -2933,6 +3078,7 @@
   <w:style w:type="character" w:default="1" w:styleId="Fuentedeprrafopredeter">
     <w:name w:val="Default Paragraph Font"/>
     <w:uiPriority w:val="1"/>
+    <w:semiHidden/>
     <w:unhideWhenUsed/>
   </w:style>
   <w:style w:type="table" w:default="1" w:styleId="Tablanormal">
@@ -3710,11 +3856,12 @@
   <w:style w:type="paragraph" w:customStyle="1" w:styleId="Default">
     <w:name w:val="Default"/>
     <w:qFormat/>
+    <w:rsid w:val="00FB2E22"/>
     <w:pPr>
-      <w:spacing w:after="200" w:line="276" w:lineRule="auto"/>
+      <w:spacing w:after="200" w:line="336" w:lineRule="auto"/>
     </w:pPr>
     <w:rPr>
-      <w:rFonts w:ascii="Arial" w:eastAsia="MS Mincho" w:hAnsi="Arial"/>
+      <w:rFonts w:ascii="Open Sans Condensed Medium" w:eastAsia="MS Mincho" w:hAnsi="Open Sans Condensed Medium"/>
       <w:color w:val="000000"/>
       <w:sz w:val="24"/>
     </w:rPr>

</xml_diff>

<commit_message>
fix: De-duplicate labor services and extra events during DOCX generation and add a test to verify the fix.
</commit_message>
<xml_diff>
--- a/estimate_template.docx
+++ b/estimate_template.docx
@@ -300,6 +300,14 @@
       <w:tblPr>
         <w:tblStyle w:val="Tablaconcuadrcula"/>
         <w:tblW w:w="0" w:type="auto"/>
+        <w:tblBorders>
+          <w:top w:val="none" w:sz="0" w:space="0" w:color="auto"/>
+          <w:left w:val="none" w:sz="0" w:space="0" w:color="auto"/>
+          <w:bottom w:val="none" w:sz="0" w:space="0" w:color="auto"/>
+          <w:right w:val="none" w:sz="0" w:space="0" w:color="auto"/>
+          <w:insideH w:val="none" w:sz="0" w:space="0" w:color="auto"/>
+          <w:insideV w:val="none" w:sz="0" w:space="0" w:color="auto"/>
+        </w:tblBorders>
         <w:tblLook w:val="04A0" w:firstRow="1" w:lastRow="0" w:firstColumn="1" w:lastColumn="0" w:noHBand="0" w:noVBand="1"/>
       </w:tblPr>
       <w:tblGrid>
@@ -1009,7 +1017,7 @@
           <w:lang w:val="en-US"/>
         </w:rPr>
         <w:lastRenderedPageBreak/>
-        <w:t xml:space="preserve">SIMONS SOCIETY OF FELLOWS DINNER </w:t>
+        <w:t>{{CLIENT_NAME}}</w:t>
       </w:r>
     </w:p>
     <w:p>
@@ -1027,7 +1035,7 @@
           <w:szCs w:val="20"/>
           <w:lang w:val="en-US"/>
         </w:rPr>
-        <w:t xml:space="preserve">160 5th Ave #2nd, New York, NY 10010, USA </w:t>
+        <w:t>{{CLIENT_ADDRESS}}</w:t>
       </w:r>
     </w:p>
     <w:p>
@@ -1502,6 +1510,14 @@
       <w:tblPr>
         <w:tblStyle w:val="Tablaconcuadrcula"/>
         <w:tblW w:w="0" w:type="auto"/>
+        <w:tblBorders>
+          <w:top w:val="none" w:sz="0" w:space="0" w:color="auto"/>
+          <w:left w:val="none" w:sz="0" w:space="0" w:color="auto"/>
+          <w:bottom w:val="none" w:sz="0" w:space="0" w:color="auto"/>
+          <w:right w:val="none" w:sz="0" w:space="0" w:color="auto"/>
+          <w:insideH w:val="none" w:sz="0" w:space="0" w:color="auto"/>
+          <w:insideV w:val="none" w:sz="0" w:space="0" w:color="auto"/>
+        </w:tblBorders>
         <w:tblLook w:val="04A0" w:firstRow="1" w:lastRow="0" w:firstColumn="1" w:lastColumn="0" w:noHBand="0" w:noVBand="1"/>
       </w:tblPr>
       <w:tblGrid>
@@ -1943,7 +1959,47 @@
                 <w:szCs w:val="18"/>
                 <w:lang w:val="en-US"/>
               </w:rPr>
-              <w:t>If a client resquets that the caterer coordinate the venue rental &amp; décor, entertainment, photography, valet parking, flower arranging, or other aspects of planning the event, there will be a small fee charged for this service to account for the labor needed to plan the event as agreed upon in writing by the parties at the time of such request.</w:t>
+              <w:t xml:space="preserve">If a client </w:t>
+            </w:r>
+            <w:proofErr w:type="spellStart"/>
+            <w:r>
+              <w:rPr>
+                <w:rFonts w:ascii="Open Sans Medium" w:hAnsi="Open Sans Medium" w:cs="Open Sans Medium"/>
+                <w:sz w:val="18"/>
+                <w:szCs w:val="18"/>
+                <w:lang w:val="en-US"/>
+              </w:rPr>
+              <w:t>resquets</w:t>
+            </w:r>
+            <w:proofErr w:type="spellEnd"/>
+            <w:r>
+              <w:rPr>
+                <w:rFonts w:ascii="Open Sans Medium" w:hAnsi="Open Sans Medium" w:cs="Open Sans Medium"/>
+                <w:sz w:val="18"/>
+                <w:szCs w:val="18"/>
+                <w:lang w:val="en-US"/>
+              </w:rPr>
+              <w:t xml:space="preserve"> that the caterer </w:t>
+            </w:r>
+            <w:proofErr w:type="gramStart"/>
+            <w:r>
+              <w:rPr>
+                <w:rFonts w:ascii="Open Sans Medium" w:hAnsi="Open Sans Medium" w:cs="Open Sans Medium"/>
+                <w:sz w:val="18"/>
+                <w:szCs w:val="18"/>
+                <w:lang w:val="en-US"/>
+              </w:rPr>
+              <w:t>coordinate</w:t>
+            </w:r>
+            <w:proofErr w:type="gramEnd"/>
+            <w:r>
+              <w:rPr>
+                <w:rFonts w:ascii="Open Sans Medium" w:hAnsi="Open Sans Medium" w:cs="Open Sans Medium"/>
+                <w:sz w:val="18"/>
+                <w:szCs w:val="18"/>
+                <w:lang w:val="en-US"/>
+              </w:rPr>
+              <w:t xml:space="preserve"> the venue rental &amp; décor, entertainment, photography, valet parking, flower arranging, or other aspects of planning the event, there will be a small fee charged for this service to account for the labor needed to plan the event as agreed upon in writing by the parties at the time of such request.</w:t>
             </w:r>
           </w:p>
           <w:p>
@@ -2149,6 +2205,7 @@
                 <w:lang w:val="en-US"/>
               </w:rPr>
             </w:pPr>
+            <w:proofErr w:type="spellStart"/>
             <w:r>
               <w:rPr>
                 <w:rFonts w:ascii="Open Sans Medium" w:hAnsi="Open Sans Medium" w:cs="Open Sans Medium"/>
@@ -2156,7 +2213,17 @@
                 <w:szCs w:val="18"/>
                 <w:lang w:val="en-US"/>
               </w:rPr>
-              <w:t>Foodesign Conceptual Events and the Client acknowledge and agree that this proposal is governed by the Master Caterer Agreement executed between the parties.</w:t>
+              <w:t>Foodesign</w:t>
+            </w:r>
+            <w:proofErr w:type="spellEnd"/>
+            <w:r>
+              <w:rPr>
+                <w:rFonts w:ascii="Open Sans Medium" w:hAnsi="Open Sans Medium" w:cs="Open Sans Medium"/>
+                <w:sz w:val="18"/>
+                <w:szCs w:val="18"/>
+                <w:lang w:val="en-US"/>
+              </w:rPr>
+              <w:t xml:space="preserve"> Conceptual Events and the Client acknowledge and agree that this proposal is governed by the Master Caterer Agreement executed between the parties.</w:t>
             </w:r>
           </w:p>
           <w:p>
@@ -2199,7 +2266,27 @@
                 <w:szCs w:val="18"/>
                 <w:lang w:val="en-US"/>
               </w:rPr>
-              <w:t>The undersigned, as a duly authorized representative of the Client, Math for America, hereby contract the services of Foodesign Conceptual Events as listed and quoted in this proposal on behalf of the Client according to the terms and conditions herein.</w:t>
+              <w:t xml:space="preserve">The undersigned, as a duly authorized representative of the Client, Math for America, hereby contract the services of </w:t>
+            </w:r>
+            <w:proofErr w:type="spellStart"/>
+            <w:r>
+              <w:rPr>
+                <w:rFonts w:ascii="Open Sans Medium" w:hAnsi="Open Sans Medium" w:cs="Open Sans Medium"/>
+                <w:sz w:val="18"/>
+                <w:szCs w:val="18"/>
+                <w:lang w:val="en-US"/>
+              </w:rPr>
+              <w:t>Foodesign</w:t>
+            </w:r>
+            <w:proofErr w:type="spellEnd"/>
+            <w:r>
+              <w:rPr>
+                <w:rFonts w:ascii="Open Sans Medium" w:hAnsi="Open Sans Medium" w:cs="Open Sans Medium"/>
+                <w:sz w:val="18"/>
+                <w:szCs w:val="18"/>
+                <w:lang w:val="en-US"/>
+              </w:rPr>
+              <w:t xml:space="preserve"> Conceptual Events as listed and quoted in this proposal on behalf of the Client according to the terms and conditions herein.</w:t>
             </w:r>
           </w:p>
           <w:p>
@@ -2872,7 +2959,15 @@
             <w:szCs w:val="18"/>
             <w:lang w:val="en-US"/>
           </w:rPr>
-          <w:t xml:space="preserve">Simons Society of Fellows Dinner </w:t>
+          <w:t>{{CLIENT_NAME}}</w:t>
+        </w:r>
+        <w:r>
+          <w:rPr>
+            <w:sz w:val="18"/>
+            <w:szCs w:val="18"/>
+            <w:lang w:val="en-US"/>
+          </w:rPr>
+          <w:t xml:space="preserve"> </w:t>
         </w:r>
       </w:p>
     </w:sdtContent>

</xml_diff>

<commit_message>
refactor: adjust vertical spacing for headers and financial sections in estimate generator
</commit_message>
<xml_diff>
--- a/estimate_template.docx
+++ b/estimate_template.docx
@@ -191,14 +191,14 @@
         <w:tblLook w:val="04a0" w:noVBand="1" w:noHBand="0" w:lastColumn="0" w:firstColumn="1" w:lastRow="0" w:firstRow="1"/>
       </w:tblPr>
       <w:tblGrid>
-        <w:gridCol w:w="3297"/>
-        <w:gridCol w:w="7232"/>
+        <w:gridCol w:w="3296"/>
+        <w:gridCol w:w="7233"/>
       </w:tblGrid>
       <w:tr>
         <w:trPr/>
         <w:tc>
           <w:tcPr>
-            <w:tcW w:w="3297" w:type="dxa"/>
+            <w:tcW w:w="3296" w:type="dxa"/>
             <w:tcBorders>
               <w:top w:val="nil"/>
               <w:left w:val="nil"/>
@@ -211,6 +211,7 @@
               <w:pStyle w:val="Normal"/>
               <w:pageBreakBefore/>
               <w:widowControl/>
+              <w:suppressAutoHyphens w:val="true"/>
               <w:spacing w:lineRule="auto" w:line="240" w:before="0" w:after="0"/>
               <w:jc w:val="left"/>
               <w:rPr>
@@ -225,21 +226,20 @@
             </w:pPr>
             <w:r>
               <w:rPr>
-                <w:rFonts w:eastAsia="Aptos" w:cs="Open Sans" w:ascii="Open Sans" w:hAnsi="Open Sans"/>
+                <w:rFonts w:cs="Open Sans" w:ascii="Open Sans" w:hAnsi="Open Sans"/>
                 <w:b/>
                 <w:i/>
                 <w:color w:val="612D4B"/>
-                <w:kern w:val="2"/>
                 <w:sz w:val="26"/>
-                <w:szCs w:val="24"/>
-                <w:lang w:val="en-US" w:eastAsia="en-US" w:bidi="ar-SA"/>
-              </w:rPr>
-            </w:r>
-          </w:p>
-          <w:p>
-            <w:pPr>
-              <w:pStyle w:val="Normal"/>
-              <w:widowControl/>
+                <w:lang w:val="en-US"/>
+              </w:rPr>
+            </w:r>
+          </w:p>
+          <w:p>
+            <w:pPr>
+              <w:pStyle w:val="Normal"/>
+              <w:widowControl/>
+              <w:suppressAutoHyphens w:val="true"/>
               <w:spacing w:lineRule="auto" w:line="240" w:before="0" w:after="0"/>
               <w:jc w:val="left"/>
               <w:rPr>
@@ -254,21 +254,20 @@
             </w:pPr>
             <w:r>
               <w:rPr>
-                <w:rFonts w:eastAsia="Aptos" w:cs="Open Sans" w:ascii="Open Sans" w:hAnsi="Open Sans"/>
+                <w:rFonts w:cs="Open Sans" w:ascii="Open Sans" w:hAnsi="Open Sans"/>
                 <w:b/>
                 <w:i/>
                 <w:color w:val="612D4B"/>
-                <w:kern w:val="2"/>
                 <w:sz w:val="26"/>
-                <w:szCs w:val="24"/>
-                <w:lang w:val="en-US" w:eastAsia="en-US" w:bidi="ar-SA"/>
-              </w:rPr>
-            </w:r>
-          </w:p>
-          <w:p>
-            <w:pPr>
-              <w:pStyle w:val="Normal"/>
-              <w:widowControl/>
+                <w:lang w:val="en-US"/>
+              </w:rPr>
+            </w:r>
+          </w:p>
+          <w:p>
+            <w:pPr>
+              <w:pStyle w:val="Normal"/>
+              <w:widowControl/>
+              <w:suppressAutoHyphens w:val="true"/>
               <w:spacing w:lineRule="auto" w:line="240" w:before="0" w:after="0"/>
               <w:jc w:val="left"/>
               <w:rPr>
@@ -283,21 +282,20 @@
             </w:pPr>
             <w:r>
               <w:rPr>
-                <w:rFonts w:eastAsia="Aptos" w:cs="Open Sans" w:ascii="Open Sans" w:hAnsi="Open Sans"/>
+                <w:rFonts w:cs="Open Sans" w:ascii="Open Sans" w:hAnsi="Open Sans"/>
                 <w:b/>
                 <w:i/>
                 <w:color w:val="612D4B"/>
-                <w:kern w:val="2"/>
                 <w:sz w:val="26"/>
-                <w:szCs w:val="24"/>
-                <w:lang w:val="en-US" w:eastAsia="en-US" w:bidi="ar-SA"/>
-              </w:rPr>
-            </w:r>
-          </w:p>
-          <w:p>
-            <w:pPr>
-              <w:pStyle w:val="Normal"/>
-              <w:widowControl/>
+                <w:lang w:val="en-US"/>
+              </w:rPr>
+            </w:r>
+          </w:p>
+          <w:p>
+            <w:pPr>
+              <w:pStyle w:val="Normal"/>
+              <w:widowControl/>
+              <w:suppressAutoHyphens w:val="true"/>
               <w:spacing w:lineRule="auto" w:line="240" w:before="0" w:after="0"/>
               <w:jc w:val="left"/>
               <w:rPr>
@@ -325,29 +323,30 @@
             <w:pPr>
               <w:pStyle w:val="Normal"/>
               <w:widowControl/>
-              <w:spacing w:lineRule="auto" w:line="240" w:before="0" w:after="0"/>
-              <w:jc w:val="left"/>
-              <w:rPr>
-                <w:rFonts w:ascii="Open Sans" w:hAnsi="Open Sans" w:cs="Open Sans"/>
-                <w:sz w:val="18"/>
-                <w:szCs w:val="18"/>
-                <w:lang w:val="en-US"/>
-              </w:rPr>
-            </w:pPr>
-            <w:r>
-              <w:rPr>
-                <w:rFonts w:eastAsia="Aptos" w:cs="Open Sans" w:ascii="Open Sans" w:hAnsi="Open Sans"/>
-                <w:kern w:val="2"/>
-                <w:sz w:val="18"/>
-                <w:szCs w:val="18"/>
-                <w:lang w:val="en-US" w:eastAsia="en-US" w:bidi="ar-SA"/>
-              </w:rPr>
-            </w:r>
-          </w:p>
-          <w:p>
-            <w:pPr>
-              <w:pStyle w:val="Normal"/>
-              <w:widowControl/>
+              <w:suppressAutoHyphens w:val="true"/>
+              <w:spacing w:lineRule="auto" w:line="240" w:before="0" w:after="0"/>
+              <w:jc w:val="left"/>
+              <w:rPr>
+                <w:rFonts w:ascii="Open Sans" w:hAnsi="Open Sans" w:cs="Open Sans"/>
+                <w:sz w:val="18"/>
+                <w:szCs w:val="18"/>
+                <w:lang w:val="en-US"/>
+              </w:rPr>
+            </w:pPr>
+            <w:r>
+              <w:rPr>
+                <w:rFonts w:cs="Open Sans" w:ascii="Open Sans" w:hAnsi="Open Sans"/>
+                <w:sz w:val="18"/>
+                <w:szCs w:val="18"/>
+                <w:lang w:val="en-US"/>
+              </w:rPr>
+            </w:r>
+          </w:p>
+          <w:p>
+            <w:pPr>
+              <w:pStyle w:val="Normal"/>
+              <w:widowControl/>
+              <w:suppressAutoHyphens w:val="true"/>
               <w:spacing w:lineRule="auto" w:line="240" w:before="0" w:after="0"/>
               <w:jc w:val="left"/>
               <w:rPr>
@@ -374,6 +373,7 @@
             <w:pPr>
               <w:pStyle w:val="Normal"/>
               <w:widowControl/>
+              <w:suppressAutoHyphens w:val="true"/>
               <w:spacing w:lineRule="auto" w:line="240" w:before="0" w:after="0"/>
               <w:jc w:val="left"/>
               <w:rPr>
@@ -400,6 +400,7 @@
             <w:pPr>
               <w:pStyle w:val="Normal"/>
               <w:widowControl/>
+              <w:suppressAutoHyphens w:val="true"/>
               <w:spacing w:lineRule="auto" w:line="240" w:before="0" w:after="0"/>
               <w:jc w:val="left"/>
               <w:rPr>
@@ -424,6 +425,7 @@
             <w:pPr>
               <w:pStyle w:val="Normal"/>
               <w:widowControl/>
+              <w:suppressAutoHyphens w:val="true"/>
               <w:spacing w:lineRule="auto" w:line="240" w:before="0" w:after="0"/>
               <w:jc w:val="left"/>
               <w:rPr>
@@ -448,29 +450,30 @@
             <w:pPr>
               <w:pStyle w:val="Normal"/>
               <w:widowControl/>
-              <w:spacing w:lineRule="auto" w:line="240" w:before="0" w:after="0"/>
-              <w:jc w:val="left"/>
-              <w:rPr>
-                <w:rFonts w:ascii="Open Sans" w:hAnsi="Open Sans" w:cs="Open Sans"/>
-                <w:sz w:val="18"/>
-                <w:szCs w:val="18"/>
-                <w:lang w:val="en-US"/>
-              </w:rPr>
-            </w:pPr>
-            <w:r>
-              <w:rPr>
-                <w:rFonts w:eastAsia="Aptos" w:cs="Open Sans" w:ascii="Open Sans" w:hAnsi="Open Sans"/>
-                <w:kern w:val="2"/>
-                <w:sz w:val="18"/>
-                <w:szCs w:val="18"/>
-                <w:lang w:val="en-US" w:eastAsia="en-US" w:bidi="ar-SA"/>
-              </w:rPr>
-            </w:r>
-          </w:p>
-          <w:p>
-            <w:pPr>
-              <w:pStyle w:val="Normal"/>
-              <w:widowControl/>
+              <w:suppressAutoHyphens w:val="true"/>
+              <w:spacing w:lineRule="auto" w:line="240" w:before="0" w:after="0"/>
+              <w:jc w:val="left"/>
+              <w:rPr>
+                <w:rFonts w:ascii="Open Sans" w:hAnsi="Open Sans" w:cs="Open Sans"/>
+                <w:sz w:val="18"/>
+                <w:szCs w:val="18"/>
+                <w:lang w:val="en-US"/>
+              </w:rPr>
+            </w:pPr>
+            <w:r>
+              <w:rPr>
+                <w:rFonts w:cs="Open Sans" w:ascii="Open Sans" w:hAnsi="Open Sans"/>
+                <w:sz w:val="18"/>
+                <w:szCs w:val="18"/>
+                <w:lang w:val="en-US"/>
+              </w:rPr>
+            </w:r>
+          </w:p>
+          <w:p>
+            <w:pPr>
+              <w:pStyle w:val="Normal"/>
+              <w:widowControl/>
+              <w:suppressAutoHyphens w:val="true"/>
               <w:spacing w:lineRule="auto" w:line="240" w:before="0" w:after="0"/>
               <w:jc w:val="left"/>
               <w:rPr>
@@ -499,6 +502,7 @@
             <w:pPr>
               <w:pStyle w:val="Normal"/>
               <w:widowControl/>
+              <w:suppressAutoHyphens w:val="true"/>
               <w:spacing w:lineRule="auto" w:line="240" w:before="0" w:after="0"/>
               <w:jc w:val="left"/>
               <w:rPr>
@@ -523,6 +527,7 @@
             <w:pPr>
               <w:pStyle w:val="Normal"/>
               <w:widowControl/>
+              <w:suppressAutoHyphens w:val="true"/>
               <w:spacing w:lineRule="auto" w:line="240" w:before="0" w:after="0"/>
               <w:jc w:val="left"/>
               <w:rPr>
@@ -547,6 +552,7 @@
             <w:pPr>
               <w:pStyle w:val="Normal"/>
               <w:widowControl/>
+              <w:suppressAutoHyphens w:val="true"/>
               <w:spacing w:lineRule="auto" w:line="240" w:before="0" w:after="0"/>
               <w:jc w:val="left"/>
               <w:rPr>
@@ -571,29 +577,30 @@
             <w:pPr>
               <w:pStyle w:val="Normal"/>
               <w:widowControl/>
-              <w:spacing w:lineRule="auto" w:line="240" w:before="0" w:after="0"/>
-              <w:jc w:val="left"/>
-              <w:rPr>
-                <w:rFonts w:ascii="Open Sans" w:hAnsi="Open Sans" w:cs="Open Sans"/>
-                <w:sz w:val="18"/>
-                <w:szCs w:val="18"/>
-                <w:lang w:val="en-US"/>
-              </w:rPr>
-            </w:pPr>
-            <w:r>
-              <w:rPr>
-                <w:rFonts w:eastAsia="Aptos" w:cs="Open Sans" w:ascii="Open Sans" w:hAnsi="Open Sans"/>
-                <w:kern w:val="2"/>
-                <w:sz w:val="18"/>
-                <w:szCs w:val="18"/>
-                <w:lang w:val="en-US" w:eastAsia="en-US" w:bidi="ar-SA"/>
-              </w:rPr>
-            </w:r>
-          </w:p>
-          <w:p>
-            <w:pPr>
-              <w:pStyle w:val="Normal"/>
-              <w:widowControl/>
+              <w:suppressAutoHyphens w:val="true"/>
+              <w:spacing w:lineRule="auto" w:line="240" w:before="0" w:after="0"/>
+              <w:jc w:val="left"/>
+              <w:rPr>
+                <w:rFonts w:ascii="Open Sans" w:hAnsi="Open Sans" w:cs="Open Sans"/>
+                <w:sz w:val="18"/>
+                <w:szCs w:val="18"/>
+                <w:lang w:val="en-US"/>
+              </w:rPr>
+            </w:pPr>
+            <w:r>
+              <w:rPr>
+                <w:rFonts w:cs="Open Sans" w:ascii="Open Sans" w:hAnsi="Open Sans"/>
+                <w:sz w:val="18"/>
+                <w:szCs w:val="18"/>
+                <w:lang w:val="en-US"/>
+              </w:rPr>
+            </w:r>
+          </w:p>
+          <w:p>
+            <w:pPr>
+              <w:pStyle w:val="Normal"/>
+              <w:widowControl/>
+              <w:suppressAutoHyphens w:val="true"/>
               <w:spacing w:lineRule="auto" w:line="240" w:before="0" w:after="0"/>
               <w:jc w:val="left"/>
               <w:rPr>
@@ -620,30 +627,52 @@
             <w:pPr>
               <w:pStyle w:val="Normal"/>
               <w:widowControl/>
-              <w:spacing w:lineRule="auto" w:line="240" w:before="0" w:after="0"/>
-              <w:jc w:val="left"/>
-              <w:rPr>
-                <w:rFonts w:ascii="Open Sans" w:hAnsi="Open Sans" w:cs="Open Sans"/>
-                <w:sz w:val="18"/>
-                <w:szCs w:val="18"/>
-                <w:lang w:val="en-US"/>
-              </w:rPr>
-            </w:pPr>
-            <w:r>
-              <w:rPr>
-                <w:rFonts w:eastAsia="Aptos" w:cs="Open Sans" w:ascii="Open Sans" w:hAnsi="Open Sans"/>
-                <w:kern w:val="2"/>
-                <w:sz w:val="18"/>
-                <w:szCs w:val="18"/>
-                <w:lang w:val="en-US" w:eastAsia="en-US" w:bidi="ar-SA"/>
-              </w:rPr>
-              <w:t>{{EVENT_ADDRES}}</w:t>
-            </w:r>
-          </w:p>
-          <w:p>
-            <w:pPr>
-              <w:pStyle w:val="Normal"/>
-              <w:widowControl/>
+              <w:suppressAutoHyphens w:val="true"/>
+              <w:spacing w:lineRule="auto" w:line="240" w:before="0" w:after="0"/>
+              <w:jc w:val="left"/>
+              <w:rPr>
+                <w:rFonts w:ascii="Open Sans" w:hAnsi="Open Sans" w:cs="Open Sans"/>
+                <w:sz w:val="18"/>
+                <w:szCs w:val="18"/>
+                <w:lang w:val="en-US"/>
+              </w:rPr>
+            </w:pPr>
+            <w:r>
+              <w:rPr>
+                <w:rFonts w:eastAsia="Aptos" w:cs="Open Sans" w:ascii="Open Sans" w:hAnsi="Open Sans"/>
+                <w:kern w:val="2"/>
+                <w:sz w:val="18"/>
+                <w:szCs w:val="18"/>
+                <w:lang w:val="en-US" w:eastAsia="en-US" w:bidi="ar-SA"/>
+              </w:rPr>
+              <w:t>{{EVENT_ADDRES</w:t>
+            </w:r>
+            <w:r>
+              <w:rPr>
+                <w:rFonts w:eastAsia="Aptos" w:cs="Open Sans" w:ascii="Open Sans" w:hAnsi="Open Sans"/>
+                <w:kern w:val="2"/>
+                <w:sz w:val="18"/>
+                <w:szCs w:val="18"/>
+                <w:lang w:val="en-US" w:eastAsia="en-US" w:bidi="ar-SA"/>
+              </w:rPr>
+              <w:t>S</w:t>
+            </w:r>
+            <w:r>
+              <w:rPr>
+                <w:rFonts w:eastAsia="Aptos" w:cs="Open Sans" w:ascii="Open Sans" w:hAnsi="Open Sans"/>
+                <w:kern w:val="2"/>
+                <w:sz w:val="18"/>
+                <w:szCs w:val="18"/>
+                <w:lang w:val="en-US" w:eastAsia="en-US" w:bidi="ar-SA"/>
+              </w:rPr>
+              <w:t>}}</w:t>
+            </w:r>
+          </w:p>
+          <w:p>
+            <w:pPr>
+              <w:pStyle w:val="Normal"/>
+              <w:widowControl/>
+              <w:suppressAutoHyphens w:val="true"/>
               <w:spacing w:lineRule="auto" w:line="240" w:before="0" w:after="0"/>
               <w:jc w:val="left"/>
               <w:rPr>
@@ -668,6 +697,7 @@
             <w:pPr>
               <w:pStyle w:val="Normal"/>
               <w:widowControl/>
+              <w:suppressAutoHyphens w:val="true"/>
               <w:spacing w:lineRule="auto" w:line="240" w:before="0" w:after="0"/>
               <w:jc w:val="left"/>
               <w:rPr>
@@ -692,6 +722,7 @@
             <w:pPr>
               <w:pStyle w:val="Normal"/>
               <w:widowControl/>
+              <w:suppressAutoHyphens w:val="true"/>
               <w:spacing w:lineRule="auto" w:line="240" w:before="0" w:after="0"/>
               <w:jc w:val="left"/>
               <w:rPr>
@@ -718,6 +749,7 @@
             <w:pPr>
               <w:pStyle w:val="Normal"/>
               <w:widowControl/>
+              <w:suppressAutoHyphens w:val="true"/>
               <w:spacing w:lineRule="auto" w:line="240" w:before="0" w:after="0"/>
               <w:jc w:val="left"/>
               <w:rPr>
@@ -732,17 +764,17 @@
               <w:rPr>
                 <w:rFonts w:eastAsia="" w:cs="Open Sans" w:eastAsiaTheme="majorEastAsia" w:ascii="Open Sans" w:hAnsi="Open Sans"/>
                 <w:color w:val="EE0000"/>
-                <w:kern w:val="2"/>
                 <w:sz w:val="22"/>
                 <w:szCs w:val="22"/>
-                <w:lang w:val="en-US" w:eastAsia="en-US" w:bidi="ar-SA"/>
-              </w:rPr>
-            </w:r>
-          </w:p>
-          <w:p>
-            <w:pPr>
-              <w:pStyle w:val="Normal"/>
-              <w:widowControl/>
+                <w:lang w:val="en-US"/>
+              </w:rPr>
+            </w:r>
+          </w:p>
+          <w:p>
+            <w:pPr>
+              <w:pStyle w:val="Normal"/>
+              <w:widowControl/>
+              <w:suppressAutoHyphens w:val="true"/>
               <w:spacing w:lineRule="auto" w:line="240" w:before="0" w:after="0"/>
               <w:jc w:val="left"/>
               <w:rPr>
@@ -757,17 +789,16 @@
               <w:rPr>
                 <w:rFonts w:eastAsia="" w:cs="Open Sans" w:eastAsiaTheme="majorEastAsia" w:ascii="Open Sans" w:hAnsi="Open Sans"/>
                 <w:color w:val="EE0000"/>
-                <w:kern w:val="2"/>
                 <w:sz w:val="22"/>
                 <w:szCs w:val="22"/>
-                <w:lang w:val="en-US" w:eastAsia="en-US" w:bidi="ar-SA"/>
+                <w:lang w:val="en-US"/>
               </w:rPr>
             </w:r>
           </w:p>
         </w:tc>
         <w:tc>
           <w:tcPr>
-            <w:tcW w:w="7232" w:type="dxa"/>
+            <w:tcW w:w="7233" w:type="dxa"/>
             <w:tcBorders>
               <w:top w:val="nil"/>
               <w:left w:val="nil"/>
@@ -779,6 +810,7 @@
             <w:pPr>
               <w:pStyle w:val="Normal"/>
               <w:widowControl/>
+              <w:suppressAutoHyphens w:val="true"/>
               <w:spacing w:lineRule="auto" w:line="240" w:before="0" w:after="0"/>
               <w:jc w:val="both"/>
               <w:rPr>
@@ -789,19 +821,17 @@
             </w:pPr>
             <w:r>
               <w:rPr>
-                <w:rFonts w:eastAsia="Aptos" w:cs="Open Sans" w:ascii="Open Sans" w:hAnsi="Open Sans"/>
+                <w:rFonts w:cs="Open Sans" w:ascii="Open Sans" w:hAnsi="Open Sans"/>
                 <w:color w:val="323232"/>
-                <w:kern w:val="2"/>
-                <w:sz w:val="24"/>
-                <w:szCs w:val="24"/>
-                <w:lang w:val="en-US" w:eastAsia="en-US" w:bidi="ar-SA"/>
-              </w:rPr>
-            </w:r>
-          </w:p>
-          <w:p>
-            <w:pPr>
-              <w:pStyle w:val="Normal"/>
-              <w:widowControl/>
+                <w:lang w:val="en-US"/>
+              </w:rPr>
+            </w:r>
+          </w:p>
+          <w:p>
+            <w:pPr>
+              <w:pStyle w:val="Normal"/>
+              <w:widowControl/>
+              <w:suppressAutoHyphens w:val="true"/>
               <w:spacing w:lineRule="auto" w:line="240" w:before="0" w:after="0"/>
               <w:jc w:val="both"/>
               <w:rPr>
@@ -812,19 +842,17 @@
             </w:pPr>
             <w:r>
               <w:rPr>
-                <w:rFonts w:eastAsia="Aptos" w:cs="Open Sans" w:ascii="Open Sans" w:hAnsi="Open Sans"/>
+                <w:rFonts w:cs="Open Sans" w:ascii="Open Sans" w:hAnsi="Open Sans"/>
                 <w:color w:val="323232"/>
-                <w:kern w:val="2"/>
-                <w:sz w:val="24"/>
-                <w:szCs w:val="24"/>
-                <w:lang w:val="en-US" w:eastAsia="en-US" w:bidi="ar-SA"/>
-              </w:rPr>
-            </w:r>
-          </w:p>
-          <w:p>
-            <w:pPr>
-              <w:pStyle w:val="Normal"/>
-              <w:widowControl/>
+                <w:lang w:val="en-US"/>
+              </w:rPr>
+            </w:r>
+          </w:p>
+          <w:p>
+            <w:pPr>
+              <w:pStyle w:val="Normal"/>
+              <w:widowControl/>
+              <w:suppressAutoHyphens w:val="true"/>
               <w:spacing w:lineRule="auto" w:line="240" w:before="0" w:after="0"/>
               <w:jc w:val="both"/>
               <w:rPr>
@@ -835,19 +863,17 @@
             </w:pPr>
             <w:r>
               <w:rPr>
-                <w:rFonts w:eastAsia="Aptos" w:cs="Open Sans" w:ascii="Open Sans" w:hAnsi="Open Sans"/>
+                <w:rFonts w:cs="Open Sans" w:ascii="Open Sans" w:hAnsi="Open Sans"/>
                 <w:color w:val="323232"/>
-                <w:kern w:val="2"/>
-                <w:sz w:val="24"/>
-                <w:szCs w:val="24"/>
-                <w:lang w:val="en-US" w:eastAsia="en-US" w:bidi="ar-SA"/>
-              </w:rPr>
-            </w:r>
-          </w:p>
-          <w:p>
-            <w:pPr>
-              <w:pStyle w:val="Normal"/>
-              <w:widowControl/>
+                <w:lang w:val="en-US"/>
+              </w:rPr>
+            </w:r>
+          </w:p>
+          <w:p>
+            <w:pPr>
+              <w:pStyle w:val="Normal"/>
+              <w:widowControl/>
+              <w:suppressAutoHyphens w:val="true"/>
               <w:spacing w:lineRule="auto" w:line="240" w:before="0" w:after="0"/>
               <w:jc w:val="both"/>
               <w:rPr>
@@ -874,6 +900,7 @@
             <w:pPr>
               <w:pStyle w:val="Normal"/>
               <w:widowControl/>
+              <w:suppressAutoHyphens w:val="true"/>
               <w:spacing w:lineRule="auto" w:line="240" w:before="0" w:after="0"/>
               <w:jc w:val="left"/>
               <w:rPr>
@@ -885,11 +912,10 @@
             </w:pPr>
             <w:r>
               <w:rPr>
-                <w:rFonts w:eastAsia="Aptos" w:cs="Open Sans" w:ascii="Open Sans" w:hAnsi="Open Sans"/>
-                <w:kern w:val="2"/>
+                <w:rFonts w:cs="Open Sans" w:ascii="Open Sans" w:hAnsi="Open Sans"/>
                 <w:sz w:val="20"/>
                 <w:szCs w:val="20"/>
-                <w:lang w:val="en-US" w:eastAsia="en-US" w:bidi="ar-SA"/>
+                <w:lang w:val="en-US"/>
               </w:rPr>
             </w:r>
           </w:p>
@@ -936,7 +962,6 @@
                 <w:color w:val="323232"/>
                 <w:sz w:val="20"/>
                 <w:szCs w:val="20"/>
-                <w:lang w:eastAsia="en-US" w:bidi="ar-SA"/>
               </w:rPr>
             </w:r>
           </w:p>
@@ -1007,7 +1032,6 @@
                 <w:color w:val="323232"/>
                 <w:sz w:val="20"/>
                 <w:szCs w:val="20"/>
-                <w:lang w:eastAsia="en-US" w:bidi="ar-SA"/>
               </w:rPr>
             </w:r>
           </w:p>
@@ -1030,7 +1054,6 @@
                 <w:color w:val="323232"/>
                 <w:sz w:val="20"/>
                 <w:szCs w:val="20"/>
-                <w:lang w:eastAsia="en-US" w:bidi="ar-SA"/>
               </w:rPr>
             </w:r>
           </w:p>
@@ -1062,6 +1085,7 @@
             <w:pPr>
               <w:pStyle w:val="Normal"/>
               <w:widowControl/>
+              <w:suppressAutoHyphens w:val="true"/>
               <w:spacing w:lineRule="auto" w:line="240" w:before="0" w:after="0"/>
               <w:jc w:val="left"/>
               <w:rPr>
@@ -1215,6 +1239,7 @@
               <w:pStyle w:val="Normal"/>
               <w:pageBreakBefore/>
               <w:widowControl/>
+              <w:suppressAutoHyphens w:val="true"/>
               <w:spacing w:lineRule="auto" w:line="240" w:before="0" w:after="0"/>
               <w:jc w:val="left"/>
               <w:rPr>
@@ -1242,29 +1267,30 @@
             <w:pPr>
               <w:pStyle w:val="Normal"/>
               <w:widowControl/>
-              <w:spacing w:lineRule="auto" w:line="240" w:before="0" w:after="0"/>
-              <w:jc w:val="left"/>
-              <w:rPr>
-                <w:rFonts w:ascii="Open Sans" w:hAnsi="Open Sans" w:cs="Open Sans"/>
-                <w:sz w:val="18"/>
-                <w:szCs w:val="18"/>
-                <w:lang w:val="en-US"/>
-              </w:rPr>
-            </w:pPr>
-            <w:r>
-              <w:rPr>
-                <w:rFonts w:eastAsia="Aptos" w:cs="Open Sans" w:ascii="Open Sans" w:hAnsi="Open Sans"/>
-                <w:kern w:val="2"/>
-                <w:sz w:val="18"/>
-                <w:szCs w:val="18"/>
-                <w:lang w:val="en-US" w:eastAsia="en-US" w:bidi="ar-SA"/>
-              </w:rPr>
-            </w:r>
-          </w:p>
-          <w:p>
-            <w:pPr>
-              <w:pStyle w:val="Normal"/>
-              <w:widowControl/>
+              <w:suppressAutoHyphens w:val="true"/>
+              <w:spacing w:lineRule="auto" w:line="240" w:before="0" w:after="0"/>
+              <w:jc w:val="left"/>
+              <w:rPr>
+                <w:rFonts w:ascii="Open Sans" w:hAnsi="Open Sans" w:cs="Open Sans"/>
+                <w:sz w:val="18"/>
+                <w:szCs w:val="18"/>
+                <w:lang w:val="en-US"/>
+              </w:rPr>
+            </w:pPr>
+            <w:r>
+              <w:rPr>
+                <w:rFonts w:cs="Open Sans" w:ascii="Open Sans" w:hAnsi="Open Sans"/>
+                <w:sz w:val="18"/>
+                <w:szCs w:val="18"/>
+                <w:lang w:val="en-US"/>
+              </w:rPr>
+            </w:r>
+          </w:p>
+          <w:p>
+            <w:pPr>
+              <w:pStyle w:val="Normal"/>
+              <w:widowControl/>
+              <w:suppressAutoHyphens w:val="true"/>
               <w:spacing w:lineRule="auto" w:line="240" w:before="0" w:after="0"/>
               <w:jc w:val="left"/>
               <w:rPr>
@@ -1291,6 +1317,7 @@
             <w:pPr>
               <w:pStyle w:val="Normal"/>
               <w:widowControl/>
+              <w:suppressAutoHyphens w:val="true"/>
               <w:spacing w:lineRule="auto" w:line="240" w:before="0" w:after="0"/>
               <w:jc w:val="left"/>
               <w:rPr>
@@ -1317,6 +1344,7 @@
             <w:pPr>
               <w:pStyle w:val="Normal"/>
               <w:widowControl/>
+              <w:suppressAutoHyphens w:val="true"/>
               <w:spacing w:lineRule="auto" w:line="240" w:before="0" w:after="0"/>
               <w:jc w:val="left"/>
               <w:rPr>
@@ -1341,6 +1369,7 @@
             <w:pPr>
               <w:pStyle w:val="Normal"/>
               <w:widowControl/>
+              <w:suppressAutoHyphens w:val="true"/>
               <w:spacing w:lineRule="auto" w:line="240" w:before="0" w:after="0"/>
               <w:jc w:val="left"/>
               <w:rPr>
@@ -1365,29 +1394,30 @@
             <w:pPr>
               <w:pStyle w:val="Normal"/>
               <w:widowControl/>
-              <w:spacing w:lineRule="auto" w:line="240" w:before="0" w:after="0"/>
-              <w:jc w:val="left"/>
-              <w:rPr>
-                <w:rFonts w:ascii="Open Sans" w:hAnsi="Open Sans" w:cs="Open Sans"/>
-                <w:sz w:val="18"/>
-                <w:szCs w:val="18"/>
-                <w:lang w:val="en-US"/>
-              </w:rPr>
-            </w:pPr>
-            <w:r>
-              <w:rPr>
-                <w:rFonts w:eastAsia="Aptos" w:cs="Open Sans" w:ascii="Open Sans" w:hAnsi="Open Sans"/>
-                <w:kern w:val="2"/>
-                <w:sz w:val="18"/>
-                <w:szCs w:val="18"/>
-                <w:lang w:val="en-US" w:eastAsia="en-US" w:bidi="ar-SA"/>
-              </w:rPr>
-            </w:r>
-          </w:p>
-          <w:p>
-            <w:pPr>
-              <w:pStyle w:val="Normal"/>
-              <w:widowControl/>
+              <w:suppressAutoHyphens w:val="true"/>
+              <w:spacing w:lineRule="auto" w:line="240" w:before="0" w:after="0"/>
+              <w:jc w:val="left"/>
+              <w:rPr>
+                <w:rFonts w:ascii="Open Sans" w:hAnsi="Open Sans" w:cs="Open Sans"/>
+                <w:sz w:val="18"/>
+                <w:szCs w:val="18"/>
+                <w:lang w:val="en-US"/>
+              </w:rPr>
+            </w:pPr>
+            <w:r>
+              <w:rPr>
+                <w:rFonts w:cs="Open Sans" w:ascii="Open Sans" w:hAnsi="Open Sans"/>
+                <w:sz w:val="18"/>
+                <w:szCs w:val="18"/>
+                <w:lang w:val="en-US"/>
+              </w:rPr>
+            </w:r>
+          </w:p>
+          <w:p>
+            <w:pPr>
+              <w:pStyle w:val="Normal"/>
+              <w:widowControl/>
+              <w:suppressAutoHyphens w:val="true"/>
               <w:spacing w:lineRule="auto" w:line="240" w:before="0" w:after="0"/>
               <w:jc w:val="left"/>
               <w:rPr>
@@ -1416,6 +1446,7 @@
             <w:pPr>
               <w:pStyle w:val="Normal"/>
               <w:widowControl/>
+              <w:suppressAutoHyphens w:val="true"/>
               <w:spacing w:lineRule="auto" w:line="240" w:before="0" w:after="0"/>
               <w:jc w:val="left"/>
               <w:rPr>
@@ -1440,6 +1471,7 @@
             <w:pPr>
               <w:pStyle w:val="Normal"/>
               <w:widowControl/>
+              <w:suppressAutoHyphens w:val="true"/>
               <w:spacing w:lineRule="auto" w:line="240" w:before="0" w:after="0"/>
               <w:jc w:val="left"/>
               <w:rPr>
@@ -1464,6 +1496,7 @@
             <w:pPr>
               <w:pStyle w:val="Normal"/>
               <w:widowControl/>
+              <w:suppressAutoHyphens w:val="true"/>
               <w:spacing w:lineRule="auto" w:line="240" w:before="0" w:after="0"/>
               <w:jc w:val="left"/>
               <w:rPr>
@@ -1488,29 +1521,30 @@
             <w:pPr>
               <w:pStyle w:val="Normal"/>
               <w:widowControl/>
-              <w:spacing w:lineRule="auto" w:line="240" w:before="0" w:after="0"/>
-              <w:jc w:val="left"/>
-              <w:rPr>
-                <w:rFonts w:ascii="Open Sans" w:hAnsi="Open Sans" w:cs="Open Sans"/>
-                <w:sz w:val="18"/>
-                <w:szCs w:val="18"/>
-                <w:lang w:val="en-US"/>
-              </w:rPr>
-            </w:pPr>
-            <w:r>
-              <w:rPr>
-                <w:rFonts w:eastAsia="Aptos" w:cs="Open Sans" w:ascii="Open Sans" w:hAnsi="Open Sans"/>
-                <w:kern w:val="2"/>
-                <w:sz w:val="18"/>
-                <w:szCs w:val="18"/>
-                <w:lang w:val="en-US" w:eastAsia="en-US" w:bidi="ar-SA"/>
-              </w:rPr>
-            </w:r>
-          </w:p>
-          <w:p>
-            <w:pPr>
-              <w:pStyle w:val="Normal"/>
-              <w:widowControl/>
+              <w:suppressAutoHyphens w:val="true"/>
+              <w:spacing w:lineRule="auto" w:line="240" w:before="0" w:after="0"/>
+              <w:jc w:val="left"/>
+              <w:rPr>
+                <w:rFonts w:ascii="Open Sans" w:hAnsi="Open Sans" w:cs="Open Sans"/>
+                <w:sz w:val="18"/>
+                <w:szCs w:val="18"/>
+                <w:lang w:val="en-US"/>
+              </w:rPr>
+            </w:pPr>
+            <w:r>
+              <w:rPr>
+                <w:rFonts w:cs="Open Sans" w:ascii="Open Sans" w:hAnsi="Open Sans"/>
+                <w:sz w:val="18"/>
+                <w:szCs w:val="18"/>
+                <w:lang w:val="en-US"/>
+              </w:rPr>
+            </w:r>
+          </w:p>
+          <w:p>
+            <w:pPr>
+              <w:pStyle w:val="Normal"/>
+              <w:widowControl/>
+              <w:suppressAutoHyphens w:val="true"/>
               <w:spacing w:lineRule="auto" w:line="240" w:before="0" w:after="0"/>
               <w:jc w:val="left"/>
               <w:rPr>
@@ -1537,30 +1571,52 @@
             <w:pPr>
               <w:pStyle w:val="Normal"/>
               <w:widowControl/>
-              <w:spacing w:lineRule="auto" w:line="240" w:before="0" w:after="0"/>
-              <w:jc w:val="left"/>
-              <w:rPr>
-                <w:rFonts w:ascii="Open Sans" w:hAnsi="Open Sans" w:cs="Open Sans"/>
-                <w:sz w:val="18"/>
-                <w:szCs w:val="18"/>
-                <w:lang w:val="en-US"/>
-              </w:rPr>
-            </w:pPr>
-            <w:r>
-              <w:rPr>
-                <w:rFonts w:eastAsia="Aptos" w:cs="Open Sans" w:ascii="Open Sans" w:hAnsi="Open Sans"/>
-                <w:kern w:val="2"/>
-                <w:sz w:val="18"/>
-                <w:szCs w:val="18"/>
-                <w:lang w:val="en-US" w:eastAsia="en-US" w:bidi="ar-SA"/>
-              </w:rPr>
-              <w:t>{{EVENT_ADDRES}}</w:t>
-            </w:r>
-          </w:p>
-          <w:p>
-            <w:pPr>
-              <w:pStyle w:val="Normal"/>
-              <w:widowControl/>
+              <w:suppressAutoHyphens w:val="true"/>
+              <w:spacing w:lineRule="auto" w:line="240" w:before="0" w:after="0"/>
+              <w:jc w:val="left"/>
+              <w:rPr>
+                <w:rFonts w:ascii="Open Sans" w:hAnsi="Open Sans" w:cs="Open Sans"/>
+                <w:sz w:val="18"/>
+                <w:szCs w:val="18"/>
+                <w:lang w:val="en-US"/>
+              </w:rPr>
+            </w:pPr>
+            <w:r>
+              <w:rPr>
+                <w:rFonts w:eastAsia="Aptos" w:cs="Open Sans" w:ascii="Open Sans" w:hAnsi="Open Sans"/>
+                <w:kern w:val="2"/>
+                <w:sz w:val="18"/>
+                <w:szCs w:val="18"/>
+                <w:lang w:val="en-US" w:eastAsia="en-US" w:bidi="ar-SA"/>
+              </w:rPr>
+              <w:t>{{EVENT_ADDRES</w:t>
+            </w:r>
+            <w:r>
+              <w:rPr>
+                <w:rFonts w:eastAsia="Aptos" w:cs="Open Sans" w:ascii="Open Sans" w:hAnsi="Open Sans"/>
+                <w:kern w:val="2"/>
+                <w:sz w:val="18"/>
+                <w:szCs w:val="18"/>
+                <w:lang w:val="en-US" w:eastAsia="en-US" w:bidi="ar-SA"/>
+              </w:rPr>
+              <w:t>S</w:t>
+            </w:r>
+            <w:r>
+              <w:rPr>
+                <w:rFonts w:eastAsia="Aptos" w:cs="Open Sans" w:ascii="Open Sans" w:hAnsi="Open Sans"/>
+                <w:kern w:val="2"/>
+                <w:sz w:val="18"/>
+                <w:szCs w:val="18"/>
+                <w:lang w:val="en-US" w:eastAsia="en-US" w:bidi="ar-SA"/>
+              </w:rPr>
+              <w:t>}}</w:t>
+            </w:r>
+          </w:p>
+          <w:p>
+            <w:pPr>
+              <w:pStyle w:val="Normal"/>
+              <w:widowControl/>
+              <w:suppressAutoHyphens w:val="true"/>
               <w:spacing w:lineRule="auto" w:line="240" w:before="0" w:after="0"/>
               <w:jc w:val="left"/>
               <w:rPr>
@@ -1585,6 +1641,7 @@
             <w:pPr>
               <w:pStyle w:val="Normal"/>
               <w:widowControl/>
+              <w:suppressAutoHyphens w:val="true"/>
               <w:spacing w:lineRule="auto" w:line="240" w:before="0" w:after="0"/>
               <w:jc w:val="left"/>
               <w:rPr>
@@ -1609,6 +1666,7 @@
             <w:pPr>
               <w:pStyle w:val="Normal"/>
               <w:widowControl/>
+              <w:suppressAutoHyphens w:val="true"/>
               <w:spacing w:lineRule="auto" w:line="240" w:before="0" w:after="0"/>
               <w:jc w:val="left"/>
               <w:rPr>
@@ -1635,6 +1693,7 @@
             <w:pPr>
               <w:pStyle w:val="Normal"/>
               <w:widowControl/>
+              <w:suppressAutoHyphens w:val="true"/>
               <w:spacing w:lineRule="auto" w:line="240" w:before="0" w:after="0"/>
               <w:jc w:val="left"/>
               <w:rPr>
@@ -1649,17 +1708,17 @@
               <w:rPr>
                 <w:rFonts w:eastAsia="" w:cs="Open Sans" w:eastAsiaTheme="majorEastAsia" w:ascii="Open Sans" w:hAnsi="Open Sans"/>
                 <w:color w:val="EE0000"/>
-                <w:kern w:val="2"/>
                 <w:sz w:val="22"/>
                 <w:szCs w:val="22"/>
-                <w:lang w:val="en-US" w:eastAsia="en-US" w:bidi="ar-SA"/>
-              </w:rPr>
-            </w:r>
-          </w:p>
-          <w:p>
-            <w:pPr>
-              <w:pStyle w:val="Normal"/>
-              <w:widowControl/>
+                <w:lang w:val="en-US"/>
+              </w:rPr>
+            </w:r>
+          </w:p>
+          <w:p>
+            <w:pPr>
+              <w:pStyle w:val="Normal"/>
+              <w:widowControl/>
+              <w:suppressAutoHyphens w:val="true"/>
               <w:spacing w:lineRule="auto" w:line="240" w:before="0" w:after="0"/>
               <w:jc w:val="left"/>
               <w:rPr>
@@ -1674,10 +1733,9 @@
               <w:rPr>
                 <w:rFonts w:eastAsia="" w:cs="Open Sans" w:eastAsiaTheme="majorEastAsia" w:ascii="Open Sans" w:hAnsi="Open Sans"/>
                 <w:color w:val="EE0000"/>
-                <w:kern w:val="2"/>
                 <w:sz w:val="22"/>
                 <w:szCs w:val="22"/>
-                <w:lang w:val="en-US" w:eastAsia="en-US" w:bidi="ar-SA"/>
+                <w:lang w:val="en-US"/>
               </w:rPr>
             </w:r>
           </w:p>
@@ -1696,6 +1754,7 @@
             <w:pPr>
               <w:pStyle w:val="Normal"/>
               <w:widowControl/>
+              <w:suppressAutoHyphens w:val="true"/>
               <w:spacing w:lineRule="auto" w:line="240" w:before="0" w:after="0"/>
               <w:jc w:val="left"/>
               <w:rPr>
@@ -1724,6 +1783,7 @@
             <w:pPr>
               <w:pStyle w:val="Normal"/>
               <w:widowControl/>
+              <w:suppressAutoHyphens w:val="true"/>
               <w:spacing w:lineRule="auto" w:line="240" w:before="0" w:after="0"/>
               <w:jc w:val="left"/>
               <w:rPr>
@@ -1737,20 +1797,20 @@
             </w:pPr>
             <w:r>
               <w:rPr>
-                <w:rFonts w:eastAsia="Aptos" w:cs="Open Sans" w:ascii="Open Sans" w:hAnsi="Open Sans"/>
+                <w:rFonts w:cs="Open Sans" w:ascii="Open Sans" w:hAnsi="Open Sans"/>
                 <w:b/>
                 <w:color w:val="612D4B"/>
-                <w:kern w:val="2"/>
                 <w:sz w:val="20"/>
                 <w:szCs w:val="20"/>
-                <w:lang w:val="en-US" w:eastAsia="en-US" w:bidi="ar-SA"/>
-              </w:rPr>
-            </w:r>
-          </w:p>
-          <w:p>
-            <w:pPr>
-              <w:pStyle w:val="Normal"/>
-              <w:widowControl/>
+                <w:lang w:val="en-US"/>
+              </w:rPr>
+            </w:r>
+          </w:p>
+          <w:p>
+            <w:pPr>
+              <w:pStyle w:val="Normal"/>
+              <w:widowControl/>
+              <w:suppressAutoHyphens w:val="true"/>
               <w:spacing w:lineRule="auto" w:line="240" w:before="0" w:after="0"/>
               <w:jc w:val="left"/>
               <w:rPr>
@@ -1779,6 +1839,7 @@
             <w:pPr>
               <w:pStyle w:val="Normal"/>
               <w:widowControl/>
+              <w:suppressAutoHyphens w:val="true"/>
               <w:spacing w:lineRule="auto" w:line="240" w:before="0" w:after="0"/>
               <w:jc w:val="both"/>
               <w:rPr>
@@ -1803,33 +1864,34 @@
             <w:pPr>
               <w:pStyle w:val="Normal"/>
               <w:widowControl/>
-              <w:spacing w:lineRule="auto" w:line="240" w:before="0" w:after="0"/>
-              <w:jc w:val="left"/>
-              <w:rPr>
-                <w:rFonts w:ascii="Open Sans" w:hAnsi="Open Sans" w:cs="Open Sans"/>
-                <w:b/>
-                <w:bCs/>
-                <w:sz w:val="18"/>
-                <w:szCs w:val="18"/>
-                <w:lang w:val="en-US"/>
-              </w:rPr>
-            </w:pPr>
-            <w:r>
-              <w:rPr>
-                <w:rFonts w:eastAsia="Aptos" w:cs="Open Sans" w:ascii="Open Sans" w:hAnsi="Open Sans"/>
-                <w:b/>
-                <w:bCs/>
-                <w:kern w:val="2"/>
-                <w:sz w:val="18"/>
-                <w:szCs w:val="18"/>
-                <w:lang w:val="en-US" w:eastAsia="en-US" w:bidi="ar-SA"/>
-              </w:rPr>
-            </w:r>
-          </w:p>
-          <w:p>
-            <w:pPr>
-              <w:pStyle w:val="Normal"/>
-              <w:widowControl/>
+              <w:suppressAutoHyphens w:val="true"/>
+              <w:spacing w:lineRule="auto" w:line="240" w:before="0" w:after="0"/>
+              <w:jc w:val="left"/>
+              <w:rPr>
+                <w:rFonts w:ascii="Open Sans" w:hAnsi="Open Sans" w:cs="Open Sans"/>
+                <w:b/>
+                <w:bCs/>
+                <w:sz w:val="18"/>
+                <w:szCs w:val="18"/>
+                <w:lang w:val="en-US"/>
+              </w:rPr>
+            </w:pPr>
+            <w:r>
+              <w:rPr>
+                <w:rFonts w:cs="Open Sans" w:ascii="Open Sans" w:hAnsi="Open Sans"/>
+                <w:b/>
+                <w:bCs/>
+                <w:sz w:val="18"/>
+                <w:szCs w:val="18"/>
+                <w:lang w:val="en-US"/>
+              </w:rPr>
+            </w:r>
+          </w:p>
+          <w:p>
+            <w:pPr>
+              <w:pStyle w:val="Normal"/>
+              <w:widowControl/>
+              <w:suppressAutoHyphens w:val="true"/>
               <w:spacing w:lineRule="auto" w:line="240" w:before="0" w:after="0"/>
               <w:jc w:val="left"/>
               <w:rPr>
@@ -1862,6 +1924,7 @@
                 <w:ilvl w:val="0"/>
                 <w:numId w:val="1"/>
               </w:numPr>
+              <w:suppressAutoHyphens w:val="true"/>
               <w:spacing w:lineRule="auto" w:line="240" w:before="0" w:after="0"/>
               <w:ind w:hanging="360" w:left="290"/>
               <w:contextualSpacing/>
@@ -1892,6 +1955,7 @@
                 <w:ilvl w:val="0"/>
                 <w:numId w:val="1"/>
               </w:numPr>
+              <w:suppressAutoHyphens w:val="true"/>
               <w:spacing w:lineRule="auto" w:line="240" w:before="0" w:after="0"/>
               <w:ind w:hanging="360" w:left="290"/>
               <w:contextualSpacing/>
@@ -1918,33 +1982,34 @@
             <w:pPr>
               <w:pStyle w:val="Normal"/>
               <w:widowControl/>
-              <w:spacing w:lineRule="auto" w:line="240" w:before="0" w:after="0"/>
-              <w:jc w:val="left"/>
-              <w:rPr>
-                <w:rFonts w:ascii="Open Sans" w:hAnsi="Open Sans" w:cs="Open Sans"/>
-                <w:b/>
-                <w:bCs/>
-                <w:sz w:val="18"/>
-                <w:szCs w:val="18"/>
-                <w:lang w:val="en-US"/>
-              </w:rPr>
-            </w:pPr>
-            <w:r>
-              <w:rPr>
-                <w:rFonts w:eastAsia="Aptos" w:cs="Open Sans" w:ascii="Open Sans" w:hAnsi="Open Sans"/>
-                <w:b/>
-                <w:bCs/>
-                <w:kern w:val="2"/>
-                <w:sz w:val="18"/>
-                <w:szCs w:val="18"/>
-                <w:lang w:val="en-US" w:eastAsia="en-US" w:bidi="ar-SA"/>
-              </w:rPr>
-            </w:r>
-          </w:p>
-          <w:p>
-            <w:pPr>
-              <w:pStyle w:val="Normal"/>
-              <w:widowControl/>
+              <w:suppressAutoHyphens w:val="true"/>
+              <w:spacing w:lineRule="auto" w:line="240" w:before="0" w:after="0"/>
+              <w:jc w:val="left"/>
+              <w:rPr>
+                <w:rFonts w:ascii="Open Sans" w:hAnsi="Open Sans" w:cs="Open Sans"/>
+                <w:b/>
+                <w:bCs/>
+                <w:sz w:val="18"/>
+                <w:szCs w:val="18"/>
+                <w:lang w:val="en-US"/>
+              </w:rPr>
+            </w:pPr>
+            <w:r>
+              <w:rPr>
+                <w:rFonts w:cs="Open Sans" w:ascii="Open Sans" w:hAnsi="Open Sans"/>
+                <w:b/>
+                <w:bCs/>
+                <w:sz w:val="18"/>
+                <w:szCs w:val="18"/>
+                <w:lang w:val="en-US"/>
+              </w:rPr>
+            </w:r>
+          </w:p>
+          <w:p>
+            <w:pPr>
+              <w:pStyle w:val="Normal"/>
+              <w:widowControl/>
+              <w:suppressAutoHyphens w:val="true"/>
               <w:spacing w:lineRule="auto" w:line="240" w:before="0" w:after="0"/>
               <w:jc w:val="left"/>
               <w:rPr>
@@ -1973,6 +2038,7 @@
             <w:pPr>
               <w:pStyle w:val="Normal"/>
               <w:widowControl/>
+              <w:suppressAutoHyphens w:val="true"/>
               <w:spacing w:lineRule="auto" w:line="240" w:before="0" w:after="0"/>
               <w:jc w:val="both"/>
               <w:rPr>
@@ -1995,24 +2061,41 @@
             <w:r>
               <w:rPr>
                 <w:rFonts w:eastAsia="Aptos" w:cs="Open Sans" w:ascii="Open Sans" w:hAnsi="Open Sans"/>
-                <w:kern w:val="2"/>
-                <w:sz w:val="18"/>
-                <w:szCs w:val="18"/>
-                <w:shd w:fill="FFFF00" w:val="clear"/>
-                <w:lang w:val="en-US" w:eastAsia="en-US" w:bidi="ar-SA"/>
-              </w:rPr>
-              <w:t>{{SERVICE_CHANGE_RATE}}</w:t>
-            </w:r>
-            <w:r>
-              <w:rPr>
-                <w:rFonts w:eastAsia="Aptos" w:cs="Open Sans" w:ascii="Open Sans" w:hAnsi="Open Sans"/>
-                <w:kern w:val="2"/>
-                <w:sz w:val="18"/>
-                <w:szCs w:val="18"/>
-                <w:shd w:fill="FFFF00" w:val="clear"/>
-                <w:lang w:val="en-US" w:eastAsia="en-US" w:bidi="ar-SA"/>
-              </w:rPr>
-              <w:t xml:space="preserve"> %</w:t>
+                <w:b/>
+                <w:bCs/>
+                <w:kern w:val="2"/>
+                <w:sz w:val="18"/>
+                <w:szCs w:val="18"/>
+                <w:shd w:fill="auto" w:val="clear"/>
+                <w:lang w:val="en-US" w:eastAsia="en-US" w:bidi="ar-SA"/>
+              </w:rPr>
+              <w:t>{{SERVICE_CHA</w:t>
+            </w:r>
+            <w:r>
+              <w:rPr>
+                <w:rFonts w:eastAsia="Aptos" w:cs="Open Sans" w:ascii="Open Sans" w:hAnsi="Open Sans"/>
+                <w:b/>
+                <w:bCs/>
+                <w:kern w:val="2"/>
+                <w:sz w:val="18"/>
+                <w:szCs w:val="18"/>
+                <w:shd w:fill="auto" w:val="clear"/>
+                <w:lang w:val="en-US" w:eastAsia="en-US" w:bidi="ar-SA"/>
+              </w:rPr>
+              <w:t>R</w:t>
+            </w:r>
+            <w:r>
+              <w:rPr>
+                <w:rFonts w:eastAsia="Aptos" w:cs="Open Sans" w:ascii="Open Sans" w:hAnsi="Open Sans"/>
+                <w:b/>
+                <w:bCs/>
+                <w:kern w:val="2"/>
+                <w:sz w:val="18"/>
+                <w:szCs w:val="18"/>
+                <w:shd w:fill="auto" w:val="clear"/>
+                <w:lang w:val="en-US" w:eastAsia="en-US" w:bidi="ar-SA"/>
+              </w:rPr>
+              <w:t>GE_RATE}} %</w:t>
             </w:r>
             <w:r>
               <w:rPr>
@@ -2029,33 +2112,34 @@
             <w:pPr>
               <w:pStyle w:val="Normal"/>
               <w:widowControl/>
-              <w:spacing w:lineRule="auto" w:line="240" w:before="0" w:after="0"/>
-              <w:jc w:val="left"/>
-              <w:rPr>
-                <w:rFonts w:ascii="Open Sans" w:hAnsi="Open Sans" w:cs="Open Sans"/>
-                <w:b/>
-                <w:bCs/>
-                <w:sz w:val="18"/>
-                <w:szCs w:val="18"/>
-                <w:lang w:val="en-US"/>
-              </w:rPr>
-            </w:pPr>
-            <w:r>
-              <w:rPr>
-                <w:rFonts w:eastAsia="Aptos" w:cs="Open Sans" w:ascii="Open Sans" w:hAnsi="Open Sans"/>
-                <w:b/>
-                <w:bCs/>
-                <w:kern w:val="2"/>
-                <w:sz w:val="18"/>
-                <w:szCs w:val="18"/>
-                <w:lang w:val="en-US" w:eastAsia="en-US" w:bidi="ar-SA"/>
-              </w:rPr>
-            </w:r>
-          </w:p>
-          <w:p>
-            <w:pPr>
-              <w:pStyle w:val="Normal"/>
-              <w:widowControl/>
+              <w:suppressAutoHyphens w:val="true"/>
+              <w:spacing w:lineRule="auto" w:line="240" w:before="0" w:after="0"/>
+              <w:jc w:val="left"/>
+              <w:rPr>
+                <w:rFonts w:ascii="Open Sans" w:hAnsi="Open Sans" w:cs="Open Sans"/>
+                <w:b/>
+                <w:bCs/>
+                <w:sz w:val="18"/>
+                <w:szCs w:val="18"/>
+                <w:lang w:val="en-US"/>
+              </w:rPr>
+            </w:pPr>
+            <w:r>
+              <w:rPr>
+                <w:rFonts w:cs="Open Sans" w:ascii="Open Sans" w:hAnsi="Open Sans"/>
+                <w:b/>
+                <w:bCs/>
+                <w:sz w:val="18"/>
+                <w:szCs w:val="18"/>
+                <w:lang w:val="en-US"/>
+              </w:rPr>
+            </w:r>
+          </w:p>
+          <w:p>
+            <w:pPr>
+              <w:pStyle w:val="Normal"/>
+              <w:widowControl/>
+              <w:suppressAutoHyphens w:val="true"/>
               <w:spacing w:lineRule="auto" w:line="240" w:before="0" w:after="0"/>
               <w:jc w:val="left"/>
               <w:rPr>
@@ -2084,6 +2168,7 @@
             <w:pPr>
               <w:pStyle w:val="Normal"/>
               <w:widowControl/>
+              <w:suppressAutoHyphens w:val="true"/>
               <w:spacing w:lineRule="auto" w:line="240" w:before="0" w:after="0"/>
               <w:jc w:val="both"/>
               <w:rPr>
@@ -2108,33 +2193,34 @@
             <w:pPr>
               <w:pStyle w:val="Normal"/>
               <w:widowControl/>
-              <w:spacing w:lineRule="auto" w:line="240" w:before="0" w:after="0"/>
-              <w:jc w:val="left"/>
-              <w:rPr>
-                <w:rFonts w:ascii="Open Sans" w:hAnsi="Open Sans" w:cs="Open Sans"/>
-                <w:b/>
-                <w:bCs/>
-                <w:sz w:val="18"/>
-                <w:szCs w:val="18"/>
-                <w:lang w:val="en-US"/>
-              </w:rPr>
-            </w:pPr>
-            <w:r>
-              <w:rPr>
-                <w:rFonts w:eastAsia="Aptos" w:cs="Open Sans" w:ascii="Open Sans" w:hAnsi="Open Sans"/>
-                <w:b/>
-                <w:bCs/>
-                <w:kern w:val="2"/>
-                <w:sz w:val="18"/>
-                <w:szCs w:val="18"/>
-                <w:lang w:val="en-US" w:eastAsia="en-US" w:bidi="ar-SA"/>
-              </w:rPr>
-            </w:r>
-          </w:p>
-          <w:p>
-            <w:pPr>
-              <w:pStyle w:val="Normal"/>
-              <w:widowControl/>
+              <w:suppressAutoHyphens w:val="true"/>
+              <w:spacing w:lineRule="auto" w:line="240" w:before="0" w:after="0"/>
+              <w:jc w:val="left"/>
+              <w:rPr>
+                <w:rFonts w:ascii="Open Sans" w:hAnsi="Open Sans" w:cs="Open Sans"/>
+                <w:b/>
+                <w:bCs/>
+                <w:sz w:val="18"/>
+                <w:szCs w:val="18"/>
+                <w:lang w:val="en-US"/>
+              </w:rPr>
+            </w:pPr>
+            <w:r>
+              <w:rPr>
+                <w:rFonts w:cs="Open Sans" w:ascii="Open Sans" w:hAnsi="Open Sans"/>
+                <w:b/>
+                <w:bCs/>
+                <w:sz w:val="18"/>
+                <w:szCs w:val="18"/>
+                <w:lang w:val="en-US"/>
+              </w:rPr>
+            </w:r>
+          </w:p>
+          <w:p>
+            <w:pPr>
+              <w:pStyle w:val="Normal"/>
+              <w:widowControl/>
+              <w:suppressAutoHyphens w:val="true"/>
               <w:spacing w:lineRule="auto" w:line="240" w:before="0" w:after="0"/>
               <w:jc w:val="left"/>
               <w:rPr>
@@ -2163,6 +2249,7 @@
             <w:pPr>
               <w:pStyle w:val="Normal"/>
               <w:widowControl/>
+              <w:suppressAutoHyphens w:val="true"/>
               <w:spacing w:lineRule="auto" w:line="240" w:before="0" w:after="0"/>
               <w:jc w:val="left"/>
               <w:rPr>
@@ -2185,24 +2272,41 @@
             <w:r>
               <w:rPr>
                 <w:rFonts w:eastAsia="Aptos" w:cs="Open Sans" w:ascii="Open Sans" w:hAnsi="Open Sans"/>
-                <w:kern w:val="2"/>
-                <w:sz w:val="18"/>
-                <w:szCs w:val="18"/>
-                <w:shd w:fill="FFFF00" w:val="clear"/>
-                <w:lang w:val="en-US" w:eastAsia="en-US" w:bidi="ar-SA"/>
-              </w:rPr>
-              <w:t>{{SERVICE_CHANGE_RATE}}</w:t>
-            </w:r>
-            <w:r>
-              <w:rPr>
-                <w:rFonts w:eastAsia="Aptos" w:cs="Open Sans" w:ascii="Open Sans" w:hAnsi="Open Sans"/>
-                <w:kern w:val="2"/>
-                <w:sz w:val="18"/>
-                <w:szCs w:val="18"/>
-                <w:shd w:fill="FFFF00" w:val="clear"/>
-                <w:lang w:val="en-US" w:eastAsia="en-US" w:bidi="ar-SA"/>
-              </w:rPr>
-              <w:t xml:space="preserve"> %</w:t>
+                <w:b/>
+                <w:bCs/>
+                <w:kern w:val="2"/>
+                <w:sz w:val="18"/>
+                <w:szCs w:val="18"/>
+                <w:shd w:fill="auto" w:val="clear"/>
+                <w:lang w:val="en-US" w:eastAsia="en-US" w:bidi="ar-SA"/>
+              </w:rPr>
+              <w:t>{{SERVICE_CHA</w:t>
+            </w:r>
+            <w:r>
+              <w:rPr>
+                <w:rFonts w:eastAsia="Aptos" w:cs="Open Sans" w:ascii="Open Sans" w:hAnsi="Open Sans"/>
+                <w:b/>
+                <w:bCs/>
+                <w:kern w:val="2"/>
+                <w:sz w:val="18"/>
+                <w:szCs w:val="18"/>
+                <w:shd w:fill="auto" w:val="clear"/>
+                <w:lang w:val="en-US" w:eastAsia="en-US" w:bidi="ar-SA"/>
+              </w:rPr>
+              <w:t>R</w:t>
+            </w:r>
+            <w:r>
+              <w:rPr>
+                <w:rFonts w:eastAsia="Aptos" w:cs="Open Sans" w:ascii="Open Sans" w:hAnsi="Open Sans"/>
+                <w:b/>
+                <w:bCs/>
+                <w:kern w:val="2"/>
+                <w:sz w:val="18"/>
+                <w:szCs w:val="18"/>
+                <w:shd w:fill="auto" w:val="clear"/>
+                <w:lang w:val="en-US" w:eastAsia="en-US" w:bidi="ar-SA"/>
+              </w:rPr>
+              <w:t>GE_RATE}} %</w:t>
             </w:r>
             <w:r>
               <w:rPr>
@@ -2220,6 +2324,7 @@
                 <w:kern w:val="2"/>
                 <w:sz w:val="18"/>
                 <w:szCs w:val="18"/>
+                <w:shd w:fill="auto" w:val="clear"/>
                 <w:lang w:val="en-US" w:eastAsia="en-US" w:bidi="ar-SA"/>
               </w:rPr>
               <w:t>{</w:t>
@@ -2227,28 +2332,21 @@
             <w:r>
               <w:rPr>
                 <w:rFonts w:eastAsia="Aptos" w:cs="Open Sans" w:ascii="Open Sans" w:hAnsi="Open Sans"/>
-                <w:kern w:val="2"/>
-                <w:sz w:val="18"/>
-                <w:szCs w:val="18"/>
-                <w:shd w:fill="FFFF00" w:val="clear"/>
-                <w:lang w:val="en-US" w:eastAsia="en-US" w:bidi="ar-SA"/>
-              </w:rPr>
-              <w:t>{TAX_RATE}}</w:t>
-            </w:r>
-            <w:r>
-              <w:rPr>
-                <w:rFonts w:eastAsia="Aptos" w:cs="Open Sans" w:ascii="Open Sans" w:hAnsi="Open Sans"/>
-                <w:kern w:val="2"/>
-                <w:sz w:val="18"/>
-                <w:szCs w:val="18"/>
-                <w:shd w:fill="FFFF00" w:val="clear"/>
-                <w:lang w:val="en-US" w:eastAsia="en-US" w:bidi="ar-SA"/>
-              </w:rPr>
-              <w:t>%</w:t>
-            </w:r>
-            <w:r>
-              <w:rPr>
-                <w:rFonts w:eastAsia="Aptos" w:cs="Open Sans" w:ascii="Open Sans" w:hAnsi="Open Sans"/>
+                <w:b/>
+                <w:bCs/>
+                <w:kern w:val="2"/>
+                <w:sz w:val="18"/>
+                <w:szCs w:val="18"/>
+                <w:shd w:fill="auto" w:val="clear"/>
+                <w:lang w:val="en-US" w:eastAsia="en-US" w:bidi="ar-SA"/>
+              </w:rPr>
+              <w:t>{TAX_RATE}}%</w:t>
+            </w:r>
+            <w:r>
+              <w:rPr>
+                <w:rFonts w:eastAsia="Aptos" w:cs="Open Sans" w:ascii="Open Sans" w:hAnsi="Open Sans"/>
+                <w:b/>
+                <w:bCs/>
                 <w:kern w:val="2"/>
                 <w:sz w:val="18"/>
                 <w:szCs w:val="18"/>
@@ -2259,10 +2357,12 @@
             <w:r>
               <w:rPr>
                 <w:rFonts w:eastAsia="Aptos" w:cs="Open Sans" w:ascii="Open Sans" w:hAnsi="Open Sans"/>
-                <w:kern w:val="2"/>
-                <w:sz w:val="18"/>
-                <w:szCs w:val="18"/>
-                <w:highlight w:val="yellow"/>
+                <w:b/>
+                <w:bCs/>
+                <w:kern w:val="2"/>
+                <w:sz w:val="18"/>
+                <w:szCs w:val="18"/>
+                <w:shd w:fill="auto" w:val="clear"/>
                 <w:lang w:val="en-US" w:eastAsia="en-US" w:bidi="ar-SA"/>
               </w:rPr>
               <w:t>{{TAX_NAME}}</w:t>
@@ -2282,33 +2382,34 @@
             <w:pPr>
               <w:pStyle w:val="Normal"/>
               <w:widowControl/>
-              <w:spacing w:lineRule="auto" w:line="240" w:before="0" w:after="0"/>
-              <w:jc w:val="left"/>
-              <w:rPr>
-                <w:rFonts w:ascii="Open Sans" w:hAnsi="Open Sans" w:cs="Open Sans"/>
-                <w:b/>
-                <w:bCs/>
-                <w:sz w:val="18"/>
-                <w:szCs w:val="18"/>
-                <w:lang w:val="en-US"/>
-              </w:rPr>
-            </w:pPr>
-            <w:r>
-              <w:rPr>
-                <w:rFonts w:eastAsia="Aptos" w:cs="Open Sans" w:ascii="Open Sans" w:hAnsi="Open Sans"/>
-                <w:b/>
-                <w:bCs/>
-                <w:kern w:val="2"/>
-                <w:sz w:val="18"/>
-                <w:szCs w:val="18"/>
-                <w:lang w:val="en-US" w:eastAsia="en-US" w:bidi="ar-SA"/>
-              </w:rPr>
-            </w:r>
-          </w:p>
-          <w:p>
-            <w:pPr>
-              <w:pStyle w:val="Normal"/>
-              <w:widowControl/>
+              <w:suppressAutoHyphens w:val="true"/>
+              <w:spacing w:lineRule="auto" w:line="240" w:before="0" w:after="0"/>
+              <w:jc w:val="left"/>
+              <w:rPr>
+                <w:rFonts w:ascii="Open Sans" w:hAnsi="Open Sans" w:cs="Open Sans"/>
+                <w:b/>
+                <w:bCs/>
+                <w:sz w:val="18"/>
+                <w:szCs w:val="18"/>
+                <w:lang w:val="en-US"/>
+              </w:rPr>
+            </w:pPr>
+            <w:r>
+              <w:rPr>
+                <w:rFonts w:cs="Open Sans" w:ascii="Open Sans" w:hAnsi="Open Sans"/>
+                <w:b/>
+                <w:bCs/>
+                <w:sz w:val="18"/>
+                <w:szCs w:val="18"/>
+                <w:lang w:val="en-US"/>
+              </w:rPr>
+            </w:r>
+          </w:p>
+          <w:p>
+            <w:pPr>
+              <w:pStyle w:val="Normal"/>
+              <w:widowControl/>
+              <w:suppressAutoHyphens w:val="true"/>
               <w:spacing w:lineRule="auto" w:line="240" w:before="0" w:after="0"/>
               <w:jc w:val="left"/>
               <w:rPr>
@@ -2337,6 +2438,7 @@
             <w:pPr>
               <w:pStyle w:val="Normal"/>
               <w:widowControl/>
+              <w:suppressAutoHyphens w:val="true"/>
               <w:spacing w:lineRule="auto" w:line="240" w:before="0" w:after="0"/>
               <w:jc w:val="both"/>
               <w:rPr>
@@ -2361,33 +2463,34 @@
             <w:pPr>
               <w:pStyle w:val="Normal"/>
               <w:widowControl/>
-              <w:spacing w:lineRule="auto" w:line="240" w:before="0" w:after="0"/>
-              <w:jc w:val="left"/>
-              <w:rPr>
-                <w:rFonts w:ascii="Open Sans" w:hAnsi="Open Sans" w:cs="Open Sans"/>
-                <w:b/>
-                <w:bCs/>
-                <w:sz w:val="18"/>
-                <w:szCs w:val="18"/>
-                <w:lang w:val="en-US"/>
-              </w:rPr>
-            </w:pPr>
-            <w:r>
-              <w:rPr>
-                <w:rFonts w:eastAsia="Aptos" w:cs="Open Sans" w:ascii="Open Sans" w:hAnsi="Open Sans"/>
-                <w:b/>
-                <w:bCs/>
-                <w:kern w:val="2"/>
-                <w:sz w:val="18"/>
-                <w:szCs w:val="18"/>
-                <w:lang w:val="en-US" w:eastAsia="en-US" w:bidi="ar-SA"/>
-              </w:rPr>
-            </w:r>
-          </w:p>
-          <w:p>
-            <w:pPr>
-              <w:pStyle w:val="Normal"/>
-              <w:widowControl/>
+              <w:suppressAutoHyphens w:val="true"/>
+              <w:spacing w:lineRule="auto" w:line="240" w:before="0" w:after="0"/>
+              <w:jc w:val="left"/>
+              <w:rPr>
+                <w:rFonts w:ascii="Open Sans" w:hAnsi="Open Sans" w:cs="Open Sans"/>
+                <w:b/>
+                <w:bCs/>
+                <w:sz w:val="18"/>
+                <w:szCs w:val="18"/>
+                <w:lang w:val="en-US"/>
+              </w:rPr>
+            </w:pPr>
+            <w:r>
+              <w:rPr>
+                <w:rFonts w:cs="Open Sans" w:ascii="Open Sans" w:hAnsi="Open Sans"/>
+                <w:b/>
+                <w:bCs/>
+                <w:sz w:val="18"/>
+                <w:szCs w:val="18"/>
+                <w:lang w:val="en-US"/>
+              </w:rPr>
+            </w:r>
+          </w:p>
+          <w:p>
+            <w:pPr>
+              <w:pStyle w:val="Normal"/>
+              <w:widowControl/>
+              <w:suppressAutoHyphens w:val="true"/>
               <w:spacing w:lineRule="auto" w:line="240" w:before="0" w:after="0"/>
               <w:jc w:val="left"/>
               <w:rPr>
@@ -2416,6 +2519,7 @@
             <w:pPr>
               <w:pStyle w:val="Normal"/>
               <w:widowControl/>
+              <w:suppressAutoHyphens w:val="true"/>
               <w:spacing w:lineRule="auto" w:line="240" w:before="0" w:after="0"/>
               <w:jc w:val="both"/>
               <w:rPr>
@@ -2440,6 +2544,7 @@
             <w:pPr>
               <w:pStyle w:val="Normal"/>
               <w:widowControl/>
+              <w:suppressAutoHyphens w:val="true"/>
               <w:spacing w:lineRule="auto" w:line="240" w:before="0" w:after="0"/>
               <w:jc w:val="both"/>
               <w:rPr>
@@ -2453,20 +2558,20 @@
             </w:pPr>
             <w:r>
               <w:rPr>
-                <w:rFonts w:eastAsia="Aptos" w:cs="Open Sans" w:ascii="Open Sans" w:hAnsi="Open Sans"/>
-                <w:b/>
-                <w:bCs/>
-                <w:kern w:val="2"/>
-                <w:sz w:val="18"/>
-                <w:szCs w:val="18"/>
-                <w:lang w:val="en-US" w:eastAsia="en-US" w:bidi="ar-SA"/>
-              </w:rPr>
-            </w:r>
-          </w:p>
-          <w:p>
-            <w:pPr>
-              <w:pStyle w:val="Normal"/>
-              <w:widowControl/>
+                <w:rFonts w:cs="Open Sans" w:ascii="Open Sans" w:hAnsi="Open Sans"/>
+                <w:b/>
+                <w:bCs/>
+                <w:sz w:val="18"/>
+                <w:szCs w:val="18"/>
+                <w:lang w:val="en-US"/>
+              </w:rPr>
+            </w:r>
+          </w:p>
+          <w:p>
+            <w:pPr>
+              <w:pStyle w:val="Normal"/>
+              <w:widowControl/>
+              <w:suppressAutoHyphens w:val="true"/>
               <w:spacing w:lineRule="auto" w:line="240" w:before="0" w:after="0"/>
               <w:jc w:val="both"/>
               <w:rPr>
@@ -2517,6 +2622,7 @@
             <w:pPr>
               <w:pStyle w:val="Normal"/>
               <w:widowControl/>
+              <w:suppressAutoHyphens w:val="true"/>
               <w:spacing w:lineRule="auto" w:line="240" w:before="0" w:after="0"/>
               <w:jc w:val="both"/>
               <w:rPr>
@@ -2553,6 +2659,7 @@
             <w:pPr>
               <w:pStyle w:val="Normal"/>
               <w:widowControl/>
+              <w:suppressAutoHyphens w:val="true"/>
               <w:spacing w:lineRule="auto" w:line="240" w:before="0" w:after="0"/>
               <w:jc w:val="both"/>
               <w:rPr>
@@ -2564,18 +2671,18 @@
             </w:pPr>
             <w:r>
               <w:rPr>
-                <w:rFonts w:eastAsia="Aptos" w:cs="Open Sans" w:ascii="Open Sans" w:hAnsi="Open Sans"/>
-                <w:kern w:val="2"/>
-                <w:sz w:val="18"/>
-                <w:szCs w:val="18"/>
-                <w:lang w:val="en-US" w:eastAsia="en-US" w:bidi="ar-SA"/>
-              </w:rPr>
-            </w:r>
-          </w:p>
-          <w:p>
-            <w:pPr>
-              <w:pStyle w:val="Normal"/>
-              <w:widowControl/>
+                <w:rFonts w:cs="Open Sans" w:ascii="Open Sans" w:hAnsi="Open Sans"/>
+                <w:sz w:val="18"/>
+                <w:szCs w:val="18"/>
+                <w:lang w:val="en-US"/>
+              </w:rPr>
+            </w:r>
+          </w:p>
+          <w:p>
+            <w:pPr>
+              <w:pStyle w:val="Normal"/>
+              <w:widowControl/>
+              <w:suppressAutoHyphens w:val="true"/>
               <w:spacing w:lineRule="auto" w:line="240" w:before="0" w:after="0"/>
               <w:jc w:val="both"/>
               <w:rPr>
@@ -2587,18 +2694,18 @@
             </w:pPr>
             <w:r>
               <w:rPr>
-                <w:rFonts w:eastAsia="Aptos" w:cs="Open Sans" w:ascii="Open Sans" w:hAnsi="Open Sans"/>
-                <w:kern w:val="2"/>
-                <w:sz w:val="18"/>
-                <w:szCs w:val="18"/>
-                <w:lang w:val="en-US" w:eastAsia="en-US" w:bidi="ar-SA"/>
-              </w:rPr>
-            </w:r>
-          </w:p>
-          <w:p>
-            <w:pPr>
-              <w:pStyle w:val="Normal"/>
-              <w:widowControl/>
+                <w:rFonts w:cs="Open Sans" w:ascii="Open Sans" w:hAnsi="Open Sans"/>
+                <w:sz w:val="18"/>
+                <w:szCs w:val="18"/>
+                <w:lang w:val="en-US"/>
+              </w:rPr>
+            </w:r>
+          </w:p>
+          <w:p>
+            <w:pPr>
+              <w:pStyle w:val="Normal"/>
+              <w:widowControl/>
+              <w:suppressAutoHyphens w:val="true"/>
               <w:spacing w:lineRule="auto" w:line="240" w:before="0" w:after="0"/>
               <w:jc w:val="both"/>
               <w:rPr>
@@ -2610,18 +2717,18 @@
             </w:pPr>
             <w:r>
               <w:rPr>
-                <w:rFonts w:eastAsia="Aptos" w:cs="Open Sans" w:ascii="Open Sans" w:hAnsi="Open Sans"/>
-                <w:kern w:val="2"/>
-                <w:sz w:val="18"/>
-                <w:szCs w:val="18"/>
-                <w:lang w:val="en-US" w:eastAsia="en-US" w:bidi="ar-SA"/>
-              </w:rPr>
-            </w:r>
-          </w:p>
-          <w:p>
-            <w:pPr>
-              <w:pStyle w:val="Normal"/>
-              <w:widowControl/>
+                <w:rFonts w:cs="Open Sans" w:ascii="Open Sans" w:hAnsi="Open Sans"/>
+                <w:sz w:val="18"/>
+                <w:szCs w:val="18"/>
+                <w:lang w:val="en-US"/>
+              </w:rPr>
+            </w:r>
+          </w:p>
+          <w:p>
+            <w:pPr>
+              <w:pStyle w:val="Normal"/>
+              <w:widowControl/>
+              <w:suppressAutoHyphens w:val="true"/>
               <w:spacing w:lineRule="auto" w:line="240" w:before="0" w:after="0"/>
               <w:jc w:val="both"/>
               <w:rPr>
@@ -2633,311 +2740,311 @@
             </w:pPr>
             <w:r>
               <w:rPr>
-                <w:rFonts w:eastAsia="Aptos" w:cs="Open Sans" w:ascii="Open Sans" w:hAnsi="Open Sans"/>
-                <w:kern w:val="2"/>
-                <w:sz w:val="18"/>
-                <w:szCs w:val="18"/>
-                <w:lang w:val="en-US" w:eastAsia="en-US" w:bidi="ar-SA"/>
-              </w:rPr>
-            </w:r>
-          </w:p>
-          <w:p>
-            <w:pPr>
-              <w:pStyle w:val="Normal"/>
-              <w:widowControl/>
-              <w:spacing w:lineRule="auto" w:line="240" w:before="0" w:after="0"/>
-              <w:jc w:val="left"/>
-              <w:rPr>
-                <w:rFonts w:ascii="Open Sans" w:hAnsi="Open Sans" w:cs="Open Sans"/>
-                <w:sz w:val="18"/>
-                <w:szCs w:val="18"/>
-                <w:lang w:val="en-US"/>
-              </w:rPr>
-            </w:pPr>
-            <w:r>
-              <w:rPr>
-                <w:rFonts w:eastAsia="Aptos" w:cs="Open Sans" w:ascii="Open Sans" w:hAnsi="Open Sans"/>
-                <w:kern w:val="2"/>
-                <w:sz w:val="18"/>
-                <w:szCs w:val="18"/>
-                <w:lang w:val="en-US" w:eastAsia="en-US" w:bidi="ar-SA"/>
-              </w:rPr>
-            </w:r>
-          </w:p>
-          <w:p>
-            <w:pPr>
-              <w:pStyle w:val="Normal"/>
-              <w:widowControl/>
-              <w:spacing w:lineRule="auto" w:line="240" w:before="0" w:after="0"/>
-              <w:jc w:val="left"/>
-              <w:rPr>
-                <w:rFonts w:ascii="Open Sans" w:hAnsi="Open Sans" w:cs="Open Sans"/>
-                <w:b/>
-                <w:bCs/>
-                <w:sz w:val="18"/>
-                <w:szCs w:val="18"/>
-                <w:lang w:val="en-US"/>
-              </w:rPr>
-            </w:pPr>
-            <w:r>
-              <w:rPr>
-                <w:rFonts w:eastAsia="Aptos" w:cs="Open Sans" w:ascii="Open Sans" w:hAnsi="Open Sans"/>
-                <w:b/>
-                <w:bCs/>
-                <w:kern w:val="2"/>
-                <w:sz w:val="18"/>
-                <w:szCs w:val="18"/>
-                <w:lang w:val="en-US" w:eastAsia="en-US" w:bidi="ar-SA"/>
-              </w:rPr>
-            </w:r>
-          </w:p>
-          <w:p>
-            <w:pPr>
-              <w:pStyle w:val="Normal"/>
-              <w:widowControl/>
-              <w:spacing w:lineRule="auto" w:line="240" w:before="0" w:after="0"/>
-              <w:jc w:val="left"/>
-              <w:rPr>
-                <w:rFonts w:ascii="Open Sans" w:hAnsi="Open Sans" w:cs="Open Sans"/>
-                <w:b/>
-                <w:bCs/>
-                <w:sz w:val="18"/>
-                <w:szCs w:val="18"/>
-                <w:lang w:val="en-US"/>
-              </w:rPr>
-            </w:pPr>
-            <w:r>
-              <w:rPr>
-                <w:rFonts w:eastAsia="Aptos" w:cs="Open Sans" w:ascii="Open Sans" w:hAnsi="Open Sans"/>
-                <w:b/>
-                <w:bCs/>
-                <w:kern w:val="2"/>
-                <w:sz w:val="18"/>
-                <w:szCs w:val="18"/>
-                <w:lang w:val="en-US" w:eastAsia="en-US" w:bidi="ar-SA"/>
-              </w:rPr>
-            </w:r>
-          </w:p>
-          <w:p>
-            <w:pPr>
-              <w:pStyle w:val="Normal"/>
-              <w:widowControl/>
-              <w:spacing w:lineRule="auto" w:line="240" w:before="0" w:after="0"/>
-              <w:jc w:val="left"/>
-              <w:rPr>
-                <w:rFonts w:ascii="Open Sans" w:hAnsi="Open Sans" w:cs="Open Sans"/>
-                <w:b/>
-                <w:bCs/>
-                <w:sz w:val="18"/>
-                <w:szCs w:val="18"/>
-                <w:lang w:val="en-US"/>
-              </w:rPr>
-            </w:pPr>
-            <w:r>
-              <w:rPr>
-                <w:rFonts w:eastAsia="Aptos" w:cs="Open Sans" w:ascii="Open Sans" w:hAnsi="Open Sans"/>
-                <w:b/>
-                <w:bCs/>
-                <w:kern w:val="2"/>
-                <w:sz w:val="18"/>
-                <w:szCs w:val="18"/>
-                <w:lang w:val="en-US" w:eastAsia="en-US" w:bidi="ar-SA"/>
-              </w:rPr>
-            </w:r>
-          </w:p>
-          <w:p>
-            <w:pPr>
-              <w:pStyle w:val="Normal"/>
-              <w:widowControl/>
-              <w:spacing w:lineRule="auto" w:line="240" w:before="0" w:after="0"/>
-              <w:jc w:val="left"/>
-              <w:rPr>
-                <w:rFonts w:ascii="Open Sans" w:hAnsi="Open Sans" w:cs="Open Sans"/>
-                <w:b/>
-                <w:bCs/>
-                <w:sz w:val="18"/>
-                <w:szCs w:val="18"/>
-                <w:lang w:val="en-US"/>
-              </w:rPr>
-            </w:pPr>
-            <w:r>
-              <w:rPr>
-                <w:rFonts w:eastAsia="Aptos" w:cs="Open Sans" w:ascii="Open Sans" w:hAnsi="Open Sans"/>
-                <w:b/>
-                <w:bCs/>
-                <w:kern w:val="2"/>
-                <w:sz w:val="18"/>
-                <w:szCs w:val="18"/>
-                <w:lang w:val="en-US" w:eastAsia="en-US" w:bidi="ar-SA"/>
-              </w:rPr>
-            </w:r>
-          </w:p>
-          <w:p>
-            <w:pPr>
-              <w:pStyle w:val="Normal"/>
-              <w:widowControl/>
-              <w:spacing w:lineRule="auto" w:line="240" w:before="0" w:after="0"/>
-              <w:jc w:val="left"/>
-              <w:rPr>
-                <w:rFonts w:ascii="Open Sans" w:hAnsi="Open Sans" w:cs="Open Sans"/>
-                <w:b/>
-                <w:bCs/>
-                <w:sz w:val="18"/>
-                <w:szCs w:val="18"/>
-                <w:lang w:val="en-US"/>
-              </w:rPr>
-            </w:pPr>
-            <w:r>
-              <w:rPr>
-                <w:rFonts w:eastAsia="Aptos" w:cs="Open Sans" w:ascii="Open Sans" w:hAnsi="Open Sans"/>
-                <w:b/>
-                <w:bCs/>
-                <w:kern w:val="2"/>
-                <w:sz w:val="18"/>
-                <w:szCs w:val="18"/>
-                <w:lang w:val="en-US" w:eastAsia="en-US" w:bidi="ar-SA"/>
-              </w:rPr>
-            </w:r>
-          </w:p>
-          <w:p>
-            <w:pPr>
-              <w:pStyle w:val="Normal"/>
-              <w:widowControl/>
-              <w:spacing w:lineRule="auto" w:line="240" w:before="0" w:after="0"/>
-              <w:jc w:val="left"/>
-              <w:rPr>
-                <w:rFonts w:ascii="Open Sans" w:hAnsi="Open Sans" w:cs="Open Sans"/>
-                <w:b/>
-                <w:bCs/>
-                <w:sz w:val="18"/>
-                <w:szCs w:val="18"/>
-                <w:lang w:val="en-US"/>
-              </w:rPr>
-            </w:pPr>
-            <w:r>
-              <w:rPr>
-                <w:rFonts w:eastAsia="Aptos" w:cs="Open Sans" w:ascii="Open Sans" w:hAnsi="Open Sans"/>
-                <w:b/>
-                <w:bCs/>
-                <w:kern w:val="2"/>
-                <w:sz w:val="18"/>
-                <w:szCs w:val="18"/>
-                <w:lang w:val="en-US" w:eastAsia="en-US" w:bidi="ar-SA"/>
-              </w:rPr>
-            </w:r>
-          </w:p>
-          <w:p>
-            <w:pPr>
-              <w:pStyle w:val="Normal"/>
-              <w:widowControl/>
-              <w:spacing w:lineRule="auto" w:line="240" w:before="0" w:after="0"/>
-              <w:jc w:val="left"/>
-              <w:rPr>
-                <w:rFonts w:ascii="Open Sans" w:hAnsi="Open Sans" w:cs="Open Sans"/>
-                <w:b/>
-                <w:bCs/>
-                <w:sz w:val="18"/>
-                <w:szCs w:val="18"/>
-                <w:lang w:val="en-US"/>
-              </w:rPr>
-            </w:pPr>
-            <w:r>
-              <w:rPr>
-                <w:rFonts w:eastAsia="Aptos" w:cs="Open Sans" w:ascii="Open Sans" w:hAnsi="Open Sans"/>
-                <w:b/>
-                <w:bCs/>
-                <w:kern w:val="2"/>
-                <w:sz w:val="18"/>
-                <w:szCs w:val="18"/>
-                <w:lang w:val="en-US" w:eastAsia="en-US" w:bidi="ar-SA"/>
-              </w:rPr>
-            </w:r>
-          </w:p>
-          <w:p>
-            <w:pPr>
-              <w:pStyle w:val="Normal"/>
-              <w:widowControl/>
-              <w:spacing w:lineRule="auto" w:line="240" w:before="0" w:after="0"/>
-              <w:jc w:val="left"/>
-              <w:rPr>
-                <w:rFonts w:ascii="Open Sans" w:hAnsi="Open Sans" w:cs="Open Sans"/>
-                <w:b/>
-                <w:bCs/>
-                <w:sz w:val="18"/>
-                <w:szCs w:val="18"/>
-                <w:lang w:val="en-US"/>
-              </w:rPr>
-            </w:pPr>
-            <w:r>
-              <w:rPr>
-                <w:rFonts w:eastAsia="Aptos" w:cs="Open Sans" w:ascii="Open Sans" w:hAnsi="Open Sans"/>
-                <w:b/>
-                <w:bCs/>
-                <w:kern w:val="2"/>
-                <w:sz w:val="18"/>
-                <w:szCs w:val="18"/>
-                <w:lang w:val="en-US" w:eastAsia="en-US" w:bidi="ar-SA"/>
-              </w:rPr>
-            </w:r>
-          </w:p>
-          <w:p>
-            <w:pPr>
-              <w:pStyle w:val="Normal"/>
-              <w:widowControl/>
-              <w:spacing w:lineRule="auto" w:line="240" w:before="0" w:after="0"/>
-              <w:jc w:val="left"/>
-              <w:rPr>
-                <w:rFonts w:ascii="Open Sans" w:hAnsi="Open Sans" w:cs="Open Sans"/>
-                <w:b/>
-                <w:bCs/>
-                <w:sz w:val="18"/>
-                <w:szCs w:val="18"/>
-                <w:lang w:val="en-US"/>
-              </w:rPr>
-            </w:pPr>
-            <w:r>
-              <w:rPr>
-                <w:rFonts w:eastAsia="Aptos" w:cs="Open Sans" w:ascii="Open Sans" w:hAnsi="Open Sans"/>
-                <w:b/>
-                <w:bCs/>
-                <w:kern w:val="2"/>
-                <w:sz w:val="18"/>
-                <w:szCs w:val="18"/>
-                <w:lang w:val="en-US" w:eastAsia="en-US" w:bidi="ar-SA"/>
-              </w:rPr>
-            </w:r>
-          </w:p>
-          <w:p>
-            <w:pPr>
-              <w:pStyle w:val="Normal"/>
-              <w:widowControl/>
-              <w:spacing w:lineRule="auto" w:line="240" w:before="0" w:after="0"/>
-              <w:jc w:val="left"/>
-              <w:rPr>
-                <w:rFonts w:ascii="Open Sans" w:hAnsi="Open Sans" w:cs="Open Sans"/>
-                <w:b/>
-                <w:bCs/>
-                <w:sz w:val="18"/>
-                <w:szCs w:val="18"/>
-                <w:lang w:val="en-US"/>
-              </w:rPr>
-            </w:pPr>
-            <w:r>
-              <w:rPr>
-                <w:rFonts w:eastAsia="Aptos" w:cs="Open Sans" w:ascii="Open Sans" w:hAnsi="Open Sans"/>
-                <w:b/>
-                <w:bCs/>
-                <w:kern w:val="2"/>
-                <w:sz w:val="18"/>
-                <w:szCs w:val="18"/>
-                <w:lang w:val="en-US" w:eastAsia="en-US" w:bidi="ar-SA"/>
-              </w:rPr>
-            </w:r>
-          </w:p>
-          <w:p>
-            <w:pPr>
-              <w:pStyle w:val="Normal"/>
-              <w:widowControl/>
+                <w:rFonts w:cs="Open Sans" w:ascii="Open Sans" w:hAnsi="Open Sans"/>
+                <w:sz w:val="18"/>
+                <w:szCs w:val="18"/>
+                <w:lang w:val="en-US"/>
+              </w:rPr>
+            </w:r>
+          </w:p>
+          <w:p>
+            <w:pPr>
+              <w:pStyle w:val="Normal"/>
+              <w:widowControl/>
+              <w:suppressAutoHyphens w:val="true"/>
+              <w:spacing w:lineRule="auto" w:line="240" w:before="0" w:after="0"/>
+              <w:jc w:val="left"/>
+              <w:rPr>
+                <w:rFonts w:ascii="Open Sans" w:hAnsi="Open Sans" w:cs="Open Sans"/>
+                <w:sz w:val="18"/>
+                <w:szCs w:val="18"/>
+                <w:lang w:val="en-US"/>
+              </w:rPr>
+            </w:pPr>
+            <w:r>
+              <w:rPr>
+                <w:rFonts w:cs="Open Sans" w:ascii="Open Sans" w:hAnsi="Open Sans"/>
+                <w:sz w:val="18"/>
+                <w:szCs w:val="18"/>
+                <w:lang w:val="en-US"/>
+              </w:rPr>
+            </w:r>
+          </w:p>
+          <w:p>
+            <w:pPr>
+              <w:pStyle w:val="Normal"/>
+              <w:widowControl/>
+              <w:suppressAutoHyphens w:val="true"/>
+              <w:spacing w:lineRule="auto" w:line="240" w:before="0" w:after="0"/>
+              <w:jc w:val="left"/>
+              <w:rPr>
+                <w:rFonts w:ascii="Open Sans" w:hAnsi="Open Sans" w:cs="Open Sans"/>
+                <w:b/>
+                <w:bCs/>
+                <w:sz w:val="18"/>
+                <w:szCs w:val="18"/>
+                <w:lang w:val="en-US"/>
+              </w:rPr>
+            </w:pPr>
+            <w:r>
+              <w:rPr>
+                <w:rFonts w:cs="Open Sans" w:ascii="Open Sans" w:hAnsi="Open Sans"/>
+                <w:b/>
+                <w:bCs/>
+                <w:sz w:val="18"/>
+                <w:szCs w:val="18"/>
+                <w:lang w:val="en-US"/>
+              </w:rPr>
+            </w:r>
+          </w:p>
+          <w:p>
+            <w:pPr>
+              <w:pStyle w:val="Normal"/>
+              <w:widowControl/>
+              <w:suppressAutoHyphens w:val="true"/>
+              <w:spacing w:lineRule="auto" w:line="240" w:before="0" w:after="0"/>
+              <w:jc w:val="left"/>
+              <w:rPr>
+                <w:rFonts w:ascii="Open Sans" w:hAnsi="Open Sans" w:cs="Open Sans"/>
+                <w:b/>
+                <w:bCs/>
+                <w:sz w:val="18"/>
+                <w:szCs w:val="18"/>
+                <w:lang w:val="en-US"/>
+              </w:rPr>
+            </w:pPr>
+            <w:r>
+              <w:rPr>
+                <w:rFonts w:cs="Open Sans" w:ascii="Open Sans" w:hAnsi="Open Sans"/>
+                <w:b/>
+                <w:bCs/>
+                <w:sz w:val="18"/>
+                <w:szCs w:val="18"/>
+                <w:lang w:val="en-US"/>
+              </w:rPr>
+            </w:r>
+          </w:p>
+          <w:p>
+            <w:pPr>
+              <w:pStyle w:val="Normal"/>
+              <w:widowControl/>
+              <w:suppressAutoHyphens w:val="true"/>
+              <w:spacing w:lineRule="auto" w:line="240" w:before="0" w:after="0"/>
+              <w:jc w:val="left"/>
+              <w:rPr>
+                <w:rFonts w:ascii="Open Sans" w:hAnsi="Open Sans" w:cs="Open Sans"/>
+                <w:b/>
+                <w:bCs/>
+                <w:sz w:val="18"/>
+                <w:szCs w:val="18"/>
+                <w:lang w:val="en-US"/>
+              </w:rPr>
+            </w:pPr>
+            <w:r>
+              <w:rPr>
+                <w:rFonts w:cs="Open Sans" w:ascii="Open Sans" w:hAnsi="Open Sans"/>
+                <w:b/>
+                <w:bCs/>
+                <w:sz w:val="18"/>
+                <w:szCs w:val="18"/>
+                <w:lang w:val="en-US"/>
+              </w:rPr>
+            </w:r>
+          </w:p>
+          <w:p>
+            <w:pPr>
+              <w:pStyle w:val="Normal"/>
+              <w:widowControl/>
+              <w:suppressAutoHyphens w:val="true"/>
+              <w:spacing w:lineRule="auto" w:line="240" w:before="0" w:after="0"/>
+              <w:jc w:val="left"/>
+              <w:rPr>
+                <w:rFonts w:ascii="Open Sans" w:hAnsi="Open Sans" w:cs="Open Sans"/>
+                <w:b/>
+                <w:bCs/>
+                <w:sz w:val="18"/>
+                <w:szCs w:val="18"/>
+                <w:lang w:val="en-US"/>
+              </w:rPr>
+            </w:pPr>
+            <w:r>
+              <w:rPr>
+                <w:rFonts w:cs="Open Sans" w:ascii="Open Sans" w:hAnsi="Open Sans"/>
+                <w:b/>
+                <w:bCs/>
+                <w:sz w:val="18"/>
+                <w:szCs w:val="18"/>
+                <w:lang w:val="en-US"/>
+              </w:rPr>
+            </w:r>
+          </w:p>
+          <w:p>
+            <w:pPr>
+              <w:pStyle w:val="Normal"/>
+              <w:widowControl/>
+              <w:suppressAutoHyphens w:val="true"/>
+              <w:spacing w:lineRule="auto" w:line="240" w:before="0" w:after="0"/>
+              <w:jc w:val="left"/>
+              <w:rPr>
+                <w:rFonts w:ascii="Open Sans" w:hAnsi="Open Sans" w:cs="Open Sans"/>
+                <w:b/>
+                <w:bCs/>
+                <w:sz w:val="18"/>
+                <w:szCs w:val="18"/>
+                <w:lang w:val="en-US"/>
+              </w:rPr>
+            </w:pPr>
+            <w:r>
+              <w:rPr>
+                <w:rFonts w:cs="Open Sans" w:ascii="Open Sans" w:hAnsi="Open Sans"/>
+                <w:b/>
+                <w:bCs/>
+                <w:sz w:val="18"/>
+                <w:szCs w:val="18"/>
+                <w:lang w:val="en-US"/>
+              </w:rPr>
+            </w:r>
+          </w:p>
+          <w:p>
+            <w:pPr>
+              <w:pStyle w:val="Normal"/>
+              <w:widowControl/>
+              <w:suppressAutoHyphens w:val="true"/>
+              <w:spacing w:lineRule="auto" w:line="240" w:before="0" w:after="0"/>
+              <w:jc w:val="left"/>
+              <w:rPr>
+                <w:rFonts w:ascii="Open Sans" w:hAnsi="Open Sans" w:cs="Open Sans"/>
+                <w:b/>
+                <w:bCs/>
+                <w:sz w:val="18"/>
+                <w:szCs w:val="18"/>
+                <w:lang w:val="en-US"/>
+              </w:rPr>
+            </w:pPr>
+            <w:r>
+              <w:rPr>
+                <w:rFonts w:cs="Open Sans" w:ascii="Open Sans" w:hAnsi="Open Sans"/>
+                <w:b/>
+                <w:bCs/>
+                <w:sz w:val="18"/>
+                <w:szCs w:val="18"/>
+                <w:lang w:val="en-US"/>
+              </w:rPr>
+            </w:r>
+          </w:p>
+          <w:p>
+            <w:pPr>
+              <w:pStyle w:val="Normal"/>
+              <w:widowControl/>
+              <w:suppressAutoHyphens w:val="true"/>
+              <w:spacing w:lineRule="auto" w:line="240" w:before="0" w:after="0"/>
+              <w:jc w:val="left"/>
+              <w:rPr>
+                <w:rFonts w:ascii="Open Sans" w:hAnsi="Open Sans" w:cs="Open Sans"/>
+                <w:b/>
+                <w:bCs/>
+                <w:sz w:val="18"/>
+                <w:szCs w:val="18"/>
+                <w:lang w:val="en-US"/>
+              </w:rPr>
+            </w:pPr>
+            <w:r>
+              <w:rPr>
+                <w:rFonts w:cs="Open Sans" w:ascii="Open Sans" w:hAnsi="Open Sans"/>
+                <w:b/>
+                <w:bCs/>
+                <w:sz w:val="18"/>
+                <w:szCs w:val="18"/>
+                <w:lang w:val="en-US"/>
+              </w:rPr>
+            </w:r>
+          </w:p>
+          <w:p>
+            <w:pPr>
+              <w:pStyle w:val="Normal"/>
+              <w:widowControl/>
+              <w:suppressAutoHyphens w:val="true"/>
+              <w:spacing w:lineRule="auto" w:line="240" w:before="0" w:after="0"/>
+              <w:jc w:val="left"/>
+              <w:rPr>
+                <w:rFonts w:ascii="Open Sans" w:hAnsi="Open Sans" w:cs="Open Sans"/>
+                <w:b/>
+                <w:bCs/>
+                <w:sz w:val="18"/>
+                <w:szCs w:val="18"/>
+                <w:lang w:val="en-US"/>
+              </w:rPr>
+            </w:pPr>
+            <w:r>
+              <w:rPr>
+                <w:rFonts w:cs="Open Sans" w:ascii="Open Sans" w:hAnsi="Open Sans"/>
+                <w:b/>
+                <w:bCs/>
+                <w:sz w:val="18"/>
+                <w:szCs w:val="18"/>
+                <w:lang w:val="en-US"/>
+              </w:rPr>
+            </w:r>
+          </w:p>
+          <w:p>
+            <w:pPr>
+              <w:pStyle w:val="Normal"/>
+              <w:widowControl/>
+              <w:suppressAutoHyphens w:val="true"/>
+              <w:spacing w:lineRule="auto" w:line="240" w:before="0" w:after="0"/>
+              <w:jc w:val="left"/>
+              <w:rPr>
+                <w:rFonts w:ascii="Open Sans" w:hAnsi="Open Sans" w:cs="Open Sans"/>
+                <w:b/>
+                <w:bCs/>
+                <w:sz w:val="18"/>
+                <w:szCs w:val="18"/>
+                <w:lang w:val="en-US"/>
+              </w:rPr>
+            </w:pPr>
+            <w:r>
+              <w:rPr>
+                <w:rFonts w:cs="Open Sans" w:ascii="Open Sans" w:hAnsi="Open Sans"/>
+                <w:b/>
+                <w:bCs/>
+                <w:sz w:val="18"/>
+                <w:szCs w:val="18"/>
+                <w:lang w:val="en-US"/>
+              </w:rPr>
+            </w:r>
+          </w:p>
+          <w:p>
+            <w:pPr>
+              <w:pStyle w:val="Normal"/>
+              <w:widowControl/>
+              <w:suppressAutoHyphens w:val="true"/>
+              <w:spacing w:lineRule="auto" w:line="240" w:before="0" w:after="0"/>
+              <w:jc w:val="left"/>
+              <w:rPr>
+                <w:rFonts w:ascii="Open Sans" w:hAnsi="Open Sans" w:cs="Open Sans"/>
+                <w:b/>
+                <w:bCs/>
+                <w:sz w:val="18"/>
+                <w:szCs w:val="18"/>
+                <w:lang w:val="en-US"/>
+              </w:rPr>
+            </w:pPr>
+            <w:r>
+              <w:rPr>
+                <w:rFonts w:cs="Open Sans" w:ascii="Open Sans" w:hAnsi="Open Sans"/>
+                <w:b/>
+                <w:bCs/>
+                <w:sz w:val="18"/>
+                <w:szCs w:val="18"/>
+                <w:lang w:val="en-US"/>
+              </w:rPr>
+            </w:r>
+          </w:p>
+          <w:p>
+            <w:pPr>
+              <w:pStyle w:val="Normal"/>
+              <w:widowControl/>
+              <w:suppressAutoHyphens w:val="true"/>
               <w:spacing w:lineRule="auto" w:line="240" w:before="0" w:after="0"/>
               <w:jc w:val="left"/>
               <w:rPr>
@@ -2966,29 +3073,30 @@
             <w:pPr>
               <w:pStyle w:val="Normal"/>
               <w:widowControl/>
-              <w:spacing w:lineRule="auto" w:line="240" w:before="0" w:after="0"/>
-              <w:jc w:val="left"/>
-              <w:rPr>
-                <w:rFonts w:ascii="Open Sans" w:hAnsi="Open Sans" w:cs="Open Sans"/>
-                <w:sz w:val="18"/>
-                <w:szCs w:val="18"/>
-                <w:lang w:val="en-US"/>
-              </w:rPr>
-            </w:pPr>
-            <w:r>
-              <w:rPr>
-                <w:rFonts w:eastAsia="Aptos" w:cs="Open Sans" w:ascii="Open Sans" w:hAnsi="Open Sans"/>
-                <w:kern w:val="2"/>
-                <w:sz w:val="18"/>
-                <w:szCs w:val="18"/>
-                <w:lang w:val="en-US" w:eastAsia="en-US" w:bidi="ar-SA"/>
-              </w:rPr>
-            </w:r>
-          </w:p>
-          <w:p>
-            <w:pPr>
-              <w:pStyle w:val="Normal"/>
-              <w:widowControl/>
+              <w:suppressAutoHyphens w:val="true"/>
+              <w:spacing w:lineRule="auto" w:line="240" w:before="0" w:after="0"/>
+              <w:jc w:val="left"/>
+              <w:rPr>
+                <w:rFonts w:ascii="Open Sans" w:hAnsi="Open Sans" w:cs="Open Sans"/>
+                <w:sz w:val="18"/>
+                <w:szCs w:val="18"/>
+                <w:lang w:val="en-US"/>
+              </w:rPr>
+            </w:pPr>
+            <w:r>
+              <w:rPr>
+                <w:rFonts w:cs="Open Sans" w:ascii="Open Sans" w:hAnsi="Open Sans"/>
+                <w:sz w:val="18"/>
+                <w:szCs w:val="18"/>
+                <w:lang w:val="en-US"/>
+              </w:rPr>
+            </w:r>
+          </w:p>
+          <w:p>
+            <w:pPr>
+              <w:pStyle w:val="Normal"/>
+              <w:widowControl/>
+              <w:suppressAutoHyphens w:val="true"/>
               <w:spacing w:lineRule="auto" w:line="240" w:before="0" w:after="0"/>
               <w:jc w:val="both"/>
               <w:rPr>
@@ -3006,13 +3114,14 @@
                 <w:szCs w:val="18"/>
                 <w:lang w:val="en-US" w:eastAsia="en-US" w:bidi="ar-SA"/>
               </w:rPr>
-              <w:t xml:space="preserve">The fees and pricing quoted in this proposal are estimates based on the client’s guaranteed minimum guest count and guaranteed time duration. If more guests are served or the caterer’s services are needed for additional time not included in the client’s estimated duration, the caterer reserves the right to charge a fair price for the additional food, drink, labor and services required. If fewer guests attend or less time is needed, the caterer will still be paid according to the guaranteed minimum guest count and time duration. </w:t>
-            </w:r>
-          </w:p>
-          <w:p>
-            <w:pPr>
-              <w:pStyle w:val="Normal"/>
-              <w:widowControl/>
+              <w:t>The fees and pricing quoted in this proposal are estimates based on the client’s guaranteed minimum guest count and guaranteed time duration. If more guests are served or the caterer’s services are needed for additional time not included in the client’s estimated duration, the caterer reserves the right to charge a fair price for the additional food, drink, labor and services required. If fewer guests attend or less time is needed, the caterer will still be paid according to the guaranteed minimum guest count and time duration.</w:t>
+            </w:r>
+          </w:p>
+          <w:p>
+            <w:pPr>
+              <w:pStyle w:val="Normal"/>
+              <w:widowControl/>
+              <w:suppressAutoHyphens w:val="true"/>
               <w:spacing w:lineRule="auto" w:line="240" w:before="0" w:after="0"/>
               <w:jc w:val="both"/>
               <w:rPr>
@@ -3024,18 +3133,18 @@
             </w:pPr>
             <w:r>
               <w:rPr>
-                <w:rFonts w:eastAsia="Aptos" w:cs="Open Sans" w:ascii="Open Sans" w:hAnsi="Open Sans"/>
-                <w:kern w:val="2"/>
-                <w:sz w:val="18"/>
-                <w:szCs w:val="18"/>
-                <w:lang w:val="en-US" w:eastAsia="en-US" w:bidi="ar-SA"/>
-              </w:rPr>
-            </w:r>
-          </w:p>
-          <w:p>
-            <w:pPr>
-              <w:pStyle w:val="Normal"/>
-              <w:widowControl/>
+                <w:rFonts w:cs="Open Sans" w:ascii="Open Sans" w:hAnsi="Open Sans"/>
+                <w:sz w:val="18"/>
+                <w:szCs w:val="18"/>
+                <w:lang w:val="en-US"/>
+              </w:rPr>
+            </w:r>
+          </w:p>
+          <w:p>
+            <w:pPr>
+              <w:pStyle w:val="Normal"/>
+              <w:widowControl/>
+              <w:suppressAutoHyphens w:val="true"/>
               <w:spacing w:lineRule="auto" w:line="240" w:before="0" w:after="0"/>
               <w:jc w:val="both"/>
               <w:rPr>
@@ -3057,13 +3166,14 @@
                 <w:szCs w:val="18"/>
                 <w:lang w:val="en-US" w:eastAsia="en-US" w:bidi="ar-SA"/>
               </w:rPr>
-              <w:t xml:space="preserve">Deposit </w:t>
-            </w:r>
-          </w:p>
-          <w:p>
-            <w:pPr>
-              <w:pStyle w:val="Normal"/>
-              <w:widowControl/>
+              <w:t>Deposit</w:t>
+            </w:r>
+          </w:p>
+          <w:p>
+            <w:pPr>
+              <w:pStyle w:val="Normal"/>
+              <w:widowControl/>
+              <w:suppressAutoHyphens w:val="true"/>
               <w:spacing w:lineRule="auto" w:line="240" w:before="0" w:after="0"/>
               <w:jc w:val="both"/>
               <w:rPr>
@@ -3081,13 +3191,14 @@
                 <w:szCs w:val="18"/>
                 <w:lang w:val="en-US" w:eastAsia="en-US" w:bidi="ar-SA"/>
               </w:rPr>
-              <w:t xml:space="preserve">An initial deposit of 50% of the Final total costs is required to contract the caterer for the event. Upon cancellation of the caterer’s services within 31 days of the planned event date, a full refund of the deposit will be supplied. If the caterer’s services are canceled within 25 to 30 days of the event, 50% of the deposit will be refunded. If cancellation notice is given less than 25 days before the event, no refund of the deposit will be supplied. </w:t>
-            </w:r>
-          </w:p>
-          <w:p>
-            <w:pPr>
-              <w:pStyle w:val="Normal"/>
-              <w:widowControl/>
+              <w:t>An initial deposit of 50% of the Final total costs is required to contract the caterer for the event. Upon cancellation of the caterer’s services within 31 days of the planned event date, a full refund of the deposit will be supplied. If the caterer’s services are canceled within 25 to 30 days of the event, 50% of the deposit will be refunded. If cancellation notice is given less than 25 days before the event, no refund of the deposit will be supplied.</w:t>
+            </w:r>
+          </w:p>
+          <w:p>
+            <w:pPr>
+              <w:pStyle w:val="Normal"/>
+              <w:widowControl/>
+              <w:suppressAutoHyphens w:val="true"/>
               <w:spacing w:lineRule="auto" w:line="240" w:before="0" w:after="0"/>
               <w:jc w:val="both"/>
               <w:rPr>
@@ -3099,18 +3210,18 @@
             </w:pPr>
             <w:r>
               <w:rPr>
-                <w:rFonts w:eastAsia="Aptos" w:cs="Open Sans" w:ascii="Open Sans" w:hAnsi="Open Sans"/>
-                <w:kern w:val="2"/>
-                <w:sz w:val="18"/>
-                <w:szCs w:val="18"/>
-                <w:lang w:val="en-US" w:eastAsia="en-US" w:bidi="ar-SA"/>
-              </w:rPr>
-            </w:r>
-          </w:p>
-          <w:p>
-            <w:pPr>
-              <w:pStyle w:val="Normal"/>
-              <w:widowControl/>
+                <w:rFonts w:cs="Open Sans" w:ascii="Open Sans" w:hAnsi="Open Sans"/>
+                <w:sz w:val="18"/>
+                <w:szCs w:val="18"/>
+                <w:lang w:val="en-US"/>
+              </w:rPr>
+            </w:r>
+          </w:p>
+          <w:p>
+            <w:pPr>
+              <w:pStyle w:val="Normal"/>
+              <w:widowControl/>
+              <w:suppressAutoHyphens w:val="true"/>
               <w:spacing w:lineRule="auto" w:line="240" w:before="0" w:after="0"/>
               <w:jc w:val="both"/>
               <w:rPr>
@@ -3132,21 +3243,12 @@
               </w:rPr>
               <w:t>Terms</w:t>
             </w:r>
-            <w:r>
-              <w:rPr>
-                <w:rFonts w:eastAsia="Aptos" w:cs="Open Sans" w:ascii="Open Sans" w:hAnsi="Open Sans"/>
-                <w:kern w:val="2"/>
-                <w:sz w:val="18"/>
-                <w:szCs w:val="18"/>
-                <w:lang w:val="en-US" w:eastAsia="en-US" w:bidi="ar-SA"/>
-              </w:rPr>
-              <w:t xml:space="preserve"> </w:t>
-            </w:r>
-          </w:p>
-          <w:p>
-            <w:pPr>
-              <w:pStyle w:val="Normal"/>
-              <w:widowControl/>
+          </w:p>
+          <w:p>
+            <w:pPr>
+              <w:pStyle w:val="Normal"/>
+              <w:widowControl/>
+              <w:suppressAutoHyphens w:val="true"/>
               <w:spacing w:lineRule="auto" w:line="240" w:before="0" w:after="0"/>
               <w:jc w:val="both"/>
               <w:rPr>
@@ -3175,6 +3277,7 @@
                 <w:ilvl w:val="0"/>
                 <w:numId w:val="2"/>
               </w:numPr>
+              <w:suppressAutoHyphens w:val="true"/>
               <w:spacing w:lineRule="auto" w:line="240" w:before="0" w:after="0"/>
               <w:ind w:hanging="360" w:left="372"/>
               <w:contextualSpacing/>
@@ -3205,6 +3308,7 @@
                 <w:ilvl w:val="0"/>
                 <w:numId w:val="2"/>
               </w:numPr>
+              <w:suppressAutoHyphens w:val="true"/>
               <w:spacing w:lineRule="auto" w:line="240" w:before="0" w:after="0"/>
               <w:ind w:hanging="360" w:left="372"/>
               <w:contextualSpacing/>
@@ -3235,6 +3339,7 @@
                 <w:ilvl w:val="0"/>
                 <w:numId w:val="2"/>
               </w:numPr>
+              <w:suppressAutoHyphens w:val="true"/>
               <w:spacing w:lineRule="auto" w:line="240" w:before="0" w:after="0"/>
               <w:ind w:hanging="360" w:left="372"/>
               <w:contextualSpacing/>
@@ -3265,6 +3370,7 @@
                 <w:ilvl w:val="0"/>
                 <w:numId w:val="2"/>
               </w:numPr>
+              <w:suppressAutoHyphens w:val="true"/>
               <w:spacing w:lineRule="auto" w:line="240" w:before="0" w:after="0"/>
               <w:ind w:hanging="360" w:left="372"/>
               <w:contextualSpacing/>
@@ -3295,6 +3401,7 @@
                 <w:ilvl w:val="0"/>
                 <w:numId w:val="2"/>
               </w:numPr>
+              <w:suppressAutoHyphens w:val="true"/>
               <w:spacing w:lineRule="auto" w:line="240" w:before="0" w:after="0"/>
               <w:ind w:hanging="360" w:left="372"/>
               <w:contextualSpacing/>
@@ -3314,13 +3421,14 @@
                 <w:szCs w:val="18"/>
                 <w:lang w:val="en-US" w:eastAsia="en-US" w:bidi="ar-SA"/>
               </w:rPr>
-              <w:t xml:space="preserve">Foodesign Conceptual Events, will not be liable for a failure to perform this contract due to delays, strikes, storms, accidents, venue accessibility, or other causes beyond its control </w:t>
+              <w:t>Foodesign Conceptual Events, will not be liable for a failure to perform this contract due to delays, strikes, storms, accidents, venue accessibility, or other causes beyond its control</w:t>
             </w:r>
           </w:p>
           <w:p>
             <w:pPr>
               <w:pStyle w:val="ListParagraph"/>
               <w:widowControl/>
+              <w:suppressAutoHyphens w:val="true"/>
               <w:spacing w:lineRule="auto" w:line="240" w:before="0" w:after="0"/>
               <w:ind w:left="372"/>
               <w:contextualSpacing/>
@@ -3334,11 +3442,10 @@
             </w:pPr>
             <w:r>
               <w:rPr>
-                <w:rFonts w:eastAsia="Aptos" w:cs="Open Sans" w:ascii="Open Sans" w:hAnsi="Open Sans"/>
-                <w:kern w:val="2"/>
-                <w:sz w:val="18"/>
-                <w:szCs w:val="18"/>
-                <w:lang w:val="en-US" w:eastAsia="en-US" w:bidi="ar-SA"/>
+                <w:rFonts w:cs="Open Sans" w:ascii="Open Sans" w:hAnsi="Open Sans"/>
+                <w:sz w:val="18"/>
+                <w:szCs w:val="18"/>
+                <w:lang w:val="en-US"/>
               </w:rPr>
             </w:r>
           </w:p>
@@ -3346,6 +3453,7 @@
             <w:pPr>
               <w:pStyle w:val="ListParagraph"/>
               <w:widowControl/>
+              <w:suppressAutoHyphens w:val="true"/>
               <w:spacing w:lineRule="auto" w:line="240" w:before="0" w:after="0"/>
               <w:ind w:left="372"/>
               <w:contextualSpacing/>
@@ -3372,6 +3480,7 @@
             <w:pPr>
               <w:pStyle w:val="ListParagraph"/>
               <w:widowControl/>
+              <w:suppressAutoHyphens w:val="true"/>
               <w:spacing w:lineRule="auto" w:line="240" w:before="0" w:after="0"/>
               <w:ind w:left="372"/>
               <w:contextualSpacing/>
@@ -3385,11 +3494,10 @@
             </w:pPr>
             <w:r>
               <w:rPr>
-                <w:rFonts w:eastAsia="Aptos" w:cs="Open Sans" w:ascii="Open Sans" w:hAnsi="Open Sans"/>
-                <w:kern w:val="2"/>
-                <w:sz w:val="18"/>
-                <w:szCs w:val="18"/>
-                <w:lang w:val="en-US" w:eastAsia="en-US" w:bidi="ar-SA"/>
+                <w:rFonts w:cs="Open Sans" w:ascii="Open Sans" w:hAnsi="Open Sans"/>
+                <w:sz w:val="18"/>
+                <w:szCs w:val="18"/>
+                <w:lang w:val="en-US"/>
               </w:rPr>
             </w:r>
           </w:p>
@@ -3397,6 +3505,7 @@
             <w:pPr>
               <w:pStyle w:val="ListParagraph"/>
               <w:widowControl/>
+              <w:suppressAutoHyphens w:val="true"/>
               <w:spacing w:lineRule="auto" w:line="240" w:before="0" w:after="0"/>
               <w:ind w:left="372"/>
               <w:contextualSpacing/>
@@ -3416,13 +3525,14 @@
                 <w:szCs w:val="18"/>
                 <w:lang w:val="en-US" w:eastAsia="en-US" w:bidi="ar-SA"/>
               </w:rPr>
-              <w:t xml:space="preserve">__________________________________________ </w:t>
+              <w:t>__________________________________________</w:t>
             </w:r>
           </w:p>
           <w:p>
             <w:pPr>
               <w:pStyle w:val="ListParagraph"/>
               <w:widowControl/>
+              <w:suppressAutoHyphens w:val="true"/>
               <w:spacing w:lineRule="auto" w:line="240" w:before="0" w:after="0"/>
               <w:ind w:left="372"/>
               <w:contextualSpacing/>
@@ -3640,7 +3750,7 @@
         <w:szCs w:val="12"/>
         <w:color w:themeColor="text2" w:themeShade="bf" w:val="0A1D30"/>
       </w:rPr>
-      <w:instrText xml:space="preserve"> NUMPAGES \* ARABIC </w:instrText>
+      <w:instrText xml:space="preserve"> NUMPAGES </w:instrText>
     </w:r>
     <w:r>
       <w:rPr>
@@ -3866,7 +3976,7 @@
                     <wp:posOffset>2089785</wp:posOffset>
                   </wp:positionH>
                   <wp:positionV relativeFrom="paragraph">
-                    <wp:posOffset>6985</wp:posOffset>
+                    <wp:posOffset>6350</wp:posOffset>
                   </wp:positionV>
                   <wp:extent cx="3858260" cy="1271905"/>
                   <wp:effectExtent l="0" t="0" r="0" b="5080"/>
@@ -3924,7 +4034,7 @@
                   <v:path o:extrusionok="f" gradientshapeok="t" o:connecttype="rect"/>
                   <o:lock v:ext="edit" aspectratio="t"/>
                 </v:shapetype>
-                <v:shape id="shape_0" ID="Imagen 3" stroked="f" o:allowincell="f" style="position:absolute;margin-left:164.55pt;margin-top:0.55pt;width:303.75pt;height:100.1pt;mso-wrap-style:none;v-text-anchor:middle;rotation:180" wp14:anchorId="66026393" type="_x0000_t75">
+                <v:shape id="shape_0" ID="Imagen 3" stroked="f" o:allowincell="f" style="position:absolute;margin-left:164.55pt;margin-top:0.5pt;width:303.75pt;height:100.1pt;mso-wrap-style:none;v-text-anchor:middle;rotation:180" wp14:anchorId="66026393" type="_x0000_t75">
                   <v:imagedata r:id="rId2" o:detectmouseclick="t"/>
                   <v:stroke color="#3465a4" joinstyle="round" endcap="flat"/>
                   <w10:wrap type="none"/>
@@ -4969,6 +5079,7 @@
     <w:rsid w:val="00771543"/>
     <w:pPr>
       <w:widowControl/>
+      <w:suppressAutoHyphens w:val="true"/>
       <w:bidi w:val="0"/>
       <w:spacing w:lineRule="auto" w:line="278" w:before="0" w:after="160"/>
       <w:jc w:val="left"/>
@@ -5655,6 +5766,7 @@
     <w:rsid w:val="00546840"/>
     <w:pPr>
       <w:widowControl/>
+      <w:suppressAutoHyphens w:val="true"/>
       <w:bidi w:val="0"/>
       <w:spacing w:lineRule="auto" w:line="240" w:before="0" w:after="0"/>
       <w:jc w:val="left"/>

</xml_diff>

<commit_message>
chore: update lock file timestamp for estimate template
</commit_message>
<xml_diff>
--- a/estimate_template.docx
+++ b/estimate_template.docx
@@ -191,14 +191,14 @@
         <w:tblLook w:val="04a0" w:noVBand="1" w:noHBand="0" w:lastColumn="0" w:firstColumn="1" w:lastRow="0" w:firstRow="1"/>
       </w:tblPr>
       <w:tblGrid>
-        <w:gridCol w:w="3296"/>
-        <w:gridCol w:w="7233"/>
+        <w:gridCol w:w="3295"/>
+        <w:gridCol w:w="7234"/>
       </w:tblGrid>
       <w:tr>
         <w:trPr/>
         <w:tc>
           <w:tcPr>
-            <w:tcW w:w="3296" w:type="dxa"/>
+            <w:tcW w:w="3295" w:type="dxa"/>
             <w:tcBorders>
               <w:top w:val="nil"/>
               <w:left w:val="nil"/>
@@ -645,27 +645,7 @@
                 <w:szCs w:val="18"/>
                 <w:lang w:val="en-US" w:eastAsia="en-US" w:bidi="ar-SA"/>
               </w:rPr>
-              <w:t>{{EVENT_ADDRES</w:t>
-            </w:r>
-            <w:r>
-              <w:rPr>
-                <w:rFonts w:eastAsia="Aptos" w:cs="Open Sans" w:ascii="Open Sans" w:hAnsi="Open Sans"/>
-                <w:kern w:val="2"/>
-                <w:sz w:val="18"/>
-                <w:szCs w:val="18"/>
-                <w:lang w:val="en-US" w:eastAsia="en-US" w:bidi="ar-SA"/>
-              </w:rPr>
-              <w:t>S</w:t>
-            </w:r>
-            <w:r>
-              <w:rPr>
-                <w:rFonts w:eastAsia="Aptos" w:cs="Open Sans" w:ascii="Open Sans" w:hAnsi="Open Sans"/>
-                <w:kern w:val="2"/>
-                <w:sz w:val="18"/>
-                <w:szCs w:val="18"/>
-                <w:lang w:val="en-US" w:eastAsia="en-US" w:bidi="ar-SA"/>
-              </w:rPr>
-              <w:t>}}</w:t>
+              <w:t>{{EVENT_ADDRESS}}</w:t>
             </w:r>
           </w:p>
           <w:p>
@@ -798,7 +778,7 @@
         </w:tc>
         <w:tc>
           <w:tcPr>
-            <w:tcW w:w="7233" w:type="dxa"/>
+            <w:tcW w:w="7234" w:type="dxa"/>
             <w:tcBorders>
               <w:top w:val="nil"/>
               <w:left w:val="nil"/>
@@ -1589,27 +1569,7 @@
                 <w:szCs w:val="18"/>
                 <w:lang w:val="en-US" w:eastAsia="en-US" w:bidi="ar-SA"/>
               </w:rPr>
-              <w:t>{{EVENT_ADDRES</w:t>
-            </w:r>
-            <w:r>
-              <w:rPr>
-                <w:rFonts w:eastAsia="Aptos" w:cs="Open Sans" w:ascii="Open Sans" w:hAnsi="Open Sans"/>
-                <w:kern w:val="2"/>
-                <w:sz w:val="18"/>
-                <w:szCs w:val="18"/>
-                <w:lang w:val="en-US" w:eastAsia="en-US" w:bidi="ar-SA"/>
-              </w:rPr>
-              <w:t>S</w:t>
-            </w:r>
-            <w:r>
-              <w:rPr>
-                <w:rFonts w:eastAsia="Aptos" w:cs="Open Sans" w:ascii="Open Sans" w:hAnsi="Open Sans"/>
-                <w:kern w:val="2"/>
-                <w:sz w:val="18"/>
-                <w:szCs w:val="18"/>
-                <w:lang w:val="en-US" w:eastAsia="en-US" w:bidi="ar-SA"/>
-              </w:rPr>
-              <w:t>}}</w:t>
+              <w:t>{{EVENT_ADDRESS}}</w:t>
             </w:r>
           </w:p>
           <w:p>
@@ -2069,7 +2029,179 @@
                 <w:shd w:fill="auto" w:val="clear"/>
                 <w:lang w:val="en-US" w:eastAsia="en-US" w:bidi="ar-SA"/>
               </w:rPr>
-              <w:t>{{SERVICE_CHA</w:t>
+              <w:t>{{SERVICE_CHARGE_RATE}}</w:t>
+            </w:r>
+            <w:r>
+              <w:rPr>
+                <w:rFonts w:eastAsia="Aptos" w:cs="Open Sans" w:ascii="Open Sans" w:hAnsi="Open Sans"/>
+                <w:kern w:val="2"/>
+                <w:sz w:val="18"/>
+                <w:szCs w:val="18"/>
+                <w:lang w:val="en-US" w:eastAsia="en-US" w:bidi="ar-SA"/>
+              </w:rPr>
+              <w:t xml:space="preserve"> is Indicated in your proposal of service. This fee covers all administration, insurance fees, transportation, site visits, trucking, &amp; supplemental costs associated with the event planning.</w:t>
+            </w:r>
+          </w:p>
+          <w:p>
+            <w:pPr>
+              <w:pStyle w:val="Normal"/>
+              <w:widowControl/>
+              <w:suppressAutoHyphens w:val="true"/>
+              <w:spacing w:lineRule="auto" w:line="240" w:before="0" w:after="0"/>
+              <w:jc w:val="left"/>
+              <w:rPr>
+                <w:rFonts w:ascii="Open Sans" w:hAnsi="Open Sans" w:cs="Open Sans"/>
+                <w:b/>
+                <w:bCs/>
+                <w:sz w:val="18"/>
+                <w:szCs w:val="18"/>
+                <w:lang w:val="en-US"/>
+              </w:rPr>
+            </w:pPr>
+            <w:r>
+              <w:rPr>
+                <w:rFonts w:cs="Open Sans" w:ascii="Open Sans" w:hAnsi="Open Sans"/>
+                <w:b/>
+                <w:bCs/>
+                <w:sz w:val="18"/>
+                <w:szCs w:val="18"/>
+                <w:lang w:val="en-US"/>
+              </w:rPr>
+            </w:r>
+          </w:p>
+          <w:p>
+            <w:pPr>
+              <w:pStyle w:val="Normal"/>
+              <w:widowControl/>
+              <w:suppressAutoHyphens w:val="true"/>
+              <w:spacing w:lineRule="auto" w:line="240" w:before="0" w:after="0"/>
+              <w:jc w:val="left"/>
+              <w:rPr>
+                <w:rFonts w:ascii="Open Sans" w:hAnsi="Open Sans" w:cs="Open Sans"/>
+                <w:b/>
+                <w:bCs/>
+                <w:sz w:val="18"/>
+                <w:szCs w:val="18"/>
+                <w:lang w:val="en-US"/>
+              </w:rPr>
+            </w:pPr>
+            <w:r>
+              <w:rPr>
+                <w:rFonts w:eastAsia="Aptos" w:cs="Open Sans" w:ascii="Open Sans" w:hAnsi="Open Sans"/>
+                <w:b/>
+                <w:bCs/>
+                <w:kern w:val="2"/>
+                <w:sz w:val="18"/>
+                <w:szCs w:val="18"/>
+                <w:lang w:val="en-US" w:eastAsia="en-US" w:bidi="ar-SA"/>
+              </w:rPr>
+              <w:t>Gratuities</w:t>
+            </w:r>
+          </w:p>
+          <w:p>
+            <w:pPr>
+              <w:pStyle w:val="Normal"/>
+              <w:widowControl/>
+              <w:suppressAutoHyphens w:val="true"/>
+              <w:spacing w:lineRule="auto" w:line="240" w:before="0" w:after="0"/>
+              <w:jc w:val="both"/>
+              <w:rPr>
+                <w:rFonts w:ascii="Open Sans" w:hAnsi="Open Sans" w:cs="Open Sans"/>
+                <w:sz w:val="18"/>
+                <w:szCs w:val="18"/>
+                <w:lang w:val="en-US"/>
+              </w:rPr>
+            </w:pPr>
+            <w:r>
+              <w:rPr>
+                <w:rFonts w:eastAsia="Aptos" w:cs="Open Sans" w:ascii="Open Sans" w:hAnsi="Open Sans"/>
+                <w:kern w:val="2"/>
+                <w:sz w:val="18"/>
+                <w:szCs w:val="18"/>
+                <w:lang w:val="en-US" w:eastAsia="en-US" w:bidi="ar-SA"/>
+              </w:rPr>
+              <w:t>Gratuities are not included in the proposal and are at the sole discretion of the client.</w:t>
+            </w:r>
+          </w:p>
+          <w:p>
+            <w:pPr>
+              <w:pStyle w:val="Normal"/>
+              <w:widowControl/>
+              <w:suppressAutoHyphens w:val="true"/>
+              <w:spacing w:lineRule="auto" w:line="240" w:before="0" w:after="0"/>
+              <w:jc w:val="left"/>
+              <w:rPr>
+                <w:rFonts w:ascii="Open Sans" w:hAnsi="Open Sans" w:cs="Open Sans"/>
+                <w:b/>
+                <w:bCs/>
+                <w:sz w:val="18"/>
+                <w:szCs w:val="18"/>
+                <w:lang w:val="en-US"/>
+              </w:rPr>
+            </w:pPr>
+            <w:r>
+              <w:rPr>
+                <w:rFonts w:cs="Open Sans" w:ascii="Open Sans" w:hAnsi="Open Sans"/>
+                <w:b/>
+                <w:bCs/>
+                <w:sz w:val="18"/>
+                <w:szCs w:val="18"/>
+                <w:lang w:val="en-US"/>
+              </w:rPr>
+            </w:r>
+          </w:p>
+          <w:p>
+            <w:pPr>
+              <w:pStyle w:val="Normal"/>
+              <w:widowControl/>
+              <w:suppressAutoHyphens w:val="true"/>
+              <w:spacing w:lineRule="auto" w:line="240" w:before="0" w:after="0"/>
+              <w:jc w:val="left"/>
+              <w:rPr>
+                <w:rFonts w:ascii="Open Sans" w:hAnsi="Open Sans" w:cs="Open Sans"/>
+                <w:b/>
+                <w:bCs/>
+                <w:sz w:val="18"/>
+                <w:szCs w:val="18"/>
+                <w:lang w:val="en-US"/>
+              </w:rPr>
+            </w:pPr>
+            <w:r>
+              <w:rPr>
+                <w:rFonts w:eastAsia="Aptos" w:cs="Open Sans" w:ascii="Open Sans" w:hAnsi="Open Sans"/>
+                <w:b/>
+                <w:bCs/>
+                <w:kern w:val="2"/>
+                <w:sz w:val="18"/>
+                <w:szCs w:val="18"/>
+                <w:lang w:val="en-US" w:eastAsia="en-US" w:bidi="ar-SA"/>
+              </w:rPr>
+              <w:t>Taxes and Insurance</w:t>
+            </w:r>
+          </w:p>
+          <w:p>
+            <w:pPr>
+              <w:pStyle w:val="Normal"/>
+              <w:widowControl/>
+              <w:suppressAutoHyphens w:val="true"/>
+              <w:spacing w:lineRule="auto" w:line="240" w:before="0" w:after="0"/>
+              <w:jc w:val="left"/>
+              <w:rPr>
+                <w:rFonts w:ascii="Open Sans" w:hAnsi="Open Sans" w:cs="Open Sans"/>
+                <w:sz w:val="18"/>
+                <w:szCs w:val="18"/>
+                <w:lang w:val="en-US"/>
+              </w:rPr>
+            </w:pPr>
+            <w:r>
+              <w:rPr>
+                <w:rFonts w:eastAsia="Aptos" w:cs="Open Sans" w:ascii="Open Sans" w:hAnsi="Open Sans"/>
+                <w:kern w:val="2"/>
+                <w:sz w:val="18"/>
+                <w:szCs w:val="18"/>
+                <w:lang w:val="en-US" w:eastAsia="en-US" w:bidi="ar-SA"/>
+              </w:rPr>
+              <w:t xml:space="preserve">All prices are subject to an </w:t>
             </w:r>
             <w:r>
               <w:rPr>
@@ -2082,192 +2214,28 @@
                 <w:shd w:fill="auto" w:val="clear"/>
                 <w:lang w:val="en-US" w:eastAsia="en-US" w:bidi="ar-SA"/>
               </w:rPr>
-              <w:t>R</w:t>
-            </w:r>
-            <w:r>
-              <w:rPr>
-                <w:rFonts w:eastAsia="Aptos" w:cs="Open Sans" w:ascii="Open Sans" w:hAnsi="Open Sans"/>
-                <w:b/>
-                <w:bCs/>
+              <w:t>{{SERVICE_CHARGE_RATE}}</w:t>
+            </w:r>
+            <w:r>
+              <w:rPr>
+                <w:rFonts w:eastAsia="Aptos" w:cs="Open Sans" w:ascii="Open Sans" w:hAnsi="Open Sans"/>
+                <w:kern w:val="2"/>
+                <w:sz w:val="18"/>
+                <w:szCs w:val="18"/>
+                <w:lang w:val="en-US" w:eastAsia="en-US" w:bidi="ar-SA"/>
+              </w:rPr>
+              <w:t xml:space="preserve"> service and </w:t>
+            </w:r>
+            <w:r>
+              <w:rPr>
+                <w:rFonts w:eastAsia="Aptos" w:cs="Open Sans" w:ascii="Open Sans" w:hAnsi="Open Sans"/>
                 <w:kern w:val="2"/>
                 <w:sz w:val="18"/>
                 <w:szCs w:val="18"/>
                 <w:shd w:fill="auto" w:val="clear"/>
                 <w:lang w:val="en-US" w:eastAsia="en-US" w:bidi="ar-SA"/>
               </w:rPr>
-              <w:t>GE_RATE}} %</w:t>
-            </w:r>
-            <w:r>
-              <w:rPr>
-                <w:rFonts w:eastAsia="Aptos" w:cs="Open Sans" w:ascii="Open Sans" w:hAnsi="Open Sans"/>
-                <w:kern w:val="2"/>
-                <w:sz w:val="18"/>
-                <w:szCs w:val="18"/>
-                <w:lang w:val="en-US" w:eastAsia="en-US" w:bidi="ar-SA"/>
-              </w:rPr>
-              <w:t xml:space="preserve"> is Indicated in your proposal of service. This fee covers all administration, insurance fees, transportation, site visits, trucking, &amp; supplemental costs associated with the event planning.</w:t>
-            </w:r>
-          </w:p>
-          <w:p>
-            <w:pPr>
-              <w:pStyle w:val="Normal"/>
-              <w:widowControl/>
-              <w:suppressAutoHyphens w:val="true"/>
-              <w:spacing w:lineRule="auto" w:line="240" w:before="0" w:after="0"/>
-              <w:jc w:val="left"/>
-              <w:rPr>
-                <w:rFonts w:ascii="Open Sans" w:hAnsi="Open Sans" w:cs="Open Sans"/>
-                <w:b/>
-                <w:bCs/>
-                <w:sz w:val="18"/>
-                <w:szCs w:val="18"/>
-                <w:lang w:val="en-US"/>
-              </w:rPr>
-            </w:pPr>
-            <w:r>
-              <w:rPr>
-                <w:rFonts w:cs="Open Sans" w:ascii="Open Sans" w:hAnsi="Open Sans"/>
-                <w:b/>
-                <w:bCs/>
-                <w:sz w:val="18"/>
-                <w:szCs w:val="18"/>
-                <w:lang w:val="en-US"/>
-              </w:rPr>
-            </w:r>
-          </w:p>
-          <w:p>
-            <w:pPr>
-              <w:pStyle w:val="Normal"/>
-              <w:widowControl/>
-              <w:suppressAutoHyphens w:val="true"/>
-              <w:spacing w:lineRule="auto" w:line="240" w:before="0" w:after="0"/>
-              <w:jc w:val="left"/>
-              <w:rPr>
-                <w:rFonts w:ascii="Open Sans" w:hAnsi="Open Sans" w:cs="Open Sans"/>
-                <w:b/>
-                <w:bCs/>
-                <w:sz w:val="18"/>
-                <w:szCs w:val="18"/>
-                <w:lang w:val="en-US"/>
-              </w:rPr>
-            </w:pPr>
-            <w:r>
-              <w:rPr>
-                <w:rFonts w:eastAsia="Aptos" w:cs="Open Sans" w:ascii="Open Sans" w:hAnsi="Open Sans"/>
-                <w:b/>
-                <w:bCs/>
-                <w:kern w:val="2"/>
-                <w:sz w:val="18"/>
-                <w:szCs w:val="18"/>
-                <w:lang w:val="en-US" w:eastAsia="en-US" w:bidi="ar-SA"/>
-              </w:rPr>
-              <w:t>Gratuities</w:t>
-            </w:r>
-          </w:p>
-          <w:p>
-            <w:pPr>
-              <w:pStyle w:val="Normal"/>
-              <w:widowControl/>
-              <w:suppressAutoHyphens w:val="true"/>
-              <w:spacing w:lineRule="auto" w:line="240" w:before="0" w:after="0"/>
-              <w:jc w:val="both"/>
-              <w:rPr>
-                <w:rFonts w:ascii="Open Sans" w:hAnsi="Open Sans" w:cs="Open Sans"/>
-                <w:sz w:val="18"/>
-                <w:szCs w:val="18"/>
-                <w:lang w:val="en-US"/>
-              </w:rPr>
-            </w:pPr>
-            <w:r>
-              <w:rPr>
-                <w:rFonts w:eastAsia="Aptos" w:cs="Open Sans" w:ascii="Open Sans" w:hAnsi="Open Sans"/>
-                <w:kern w:val="2"/>
-                <w:sz w:val="18"/>
-                <w:szCs w:val="18"/>
-                <w:lang w:val="en-US" w:eastAsia="en-US" w:bidi="ar-SA"/>
-              </w:rPr>
-              <w:t>Gratuities are not included in the proposal and are at the sole discretion of the client.</w:t>
-            </w:r>
-          </w:p>
-          <w:p>
-            <w:pPr>
-              <w:pStyle w:val="Normal"/>
-              <w:widowControl/>
-              <w:suppressAutoHyphens w:val="true"/>
-              <w:spacing w:lineRule="auto" w:line="240" w:before="0" w:after="0"/>
-              <w:jc w:val="left"/>
-              <w:rPr>
-                <w:rFonts w:ascii="Open Sans" w:hAnsi="Open Sans" w:cs="Open Sans"/>
-                <w:b/>
-                <w:bCs/>
-                <w:sz w:val="18"/>
-                <w:szCs w:val="18"/>
-                <w:lang w:val="en-US"/>
-              </w:rPr>
-            </w:pPr>
-            <w:r>
-              <w:rPr>
-                <w:rFonts w:cs="Open Sans" w:ascii="Open Sans" w:hAnsi="Open Sans"/>
-                <w:b/>
-                <w:bCs/>
-                <w:sz w:val="18"/>
-                <w:szCs w:val="18"/>
-                <w:lang w:val="en-US"/>
-              </w:rPr>
-            </w:r>
-          </w:p>
-          <w:p>
-            <w:pPr>
-              <w:pStyle w:val="Normal"/>
-              <w:widowControl/>
-              <w:suppressAutoHyphens w:val="true"/>
-              <w:spacing w:lineRule="auto" w:line="240" w:before="0" w:after="0"/>
-              <w:jc w:val="left"/>
-              <w:rPr>
-                <w:rFonts w:ascii="Open Sans" w:hAnsi="Open Sans" w:cs="Open Sans"/>
-                <w:b/>
-                <w:bCs/>
-                <w:sz w:val="18"/>
-                <w:szCs w:val="18"/>
-                <w:lang w:val="en-US"/>
-              </w:rPr>
-            </w:pPr>
-            <w:r>
-              <w:rPr>
-                <w:rFonts w:eastAsia="Aptos" w:cs="Open Sans" w:ascii="Open Sans" w:hAnsi="Open Sans"/>
-                <w:b/>
-                <w:bCs/>
-                <w:kern w:val="2"/>
-                <w:sz w:val="18"/>
-                <w:szCs w:val="18"/>
-                <w:lang w:val="en-US" w:eastAsia="en-US" w:bidi="ar-SA"/>
-              </w:rPr>
-              <w:t>Taxes and Insurance</w:t>
-            </w:r>
-          </w:p>
-          <w:p>
-            <w:pPr>
-              <w:pStyle w:val="Normal"/>
-              <w:widowControl/>
-              <w:suppressAutoHyphens w:val="true"/>
-              <w:spacing w:lineRule="auto" w:line="240" w:before="0" w:after="0"/>
-              <w:jc w:val="left"/>
-              <w:rPr>
-                <w:rFonts w:ascii="Open Sans" w:hAnsi="Open Sans" w:cs="Open Sans"/>
-                <w:sz w:val="18"/>
-                <w:szCs w:val="18"/>
-                <w:lang w:val="en-US"/>
-              </w:rPr>
-            </w:pPr>
-            <w:r>
-              <w:rPr>
-                <w:rFonts w:eastAsia="Aptos" w:cs="Open Sans" w:ascii="Open Sans" w:hAnsi="Open Sans"/>
-                <w:kern w:val="2"/>
-                <w:sz w:val="18"/>
-                <w:szCs w:val="18"/>
-                <w:lang w:val="en-US" w:eastAsia="en-US" w:bidi="ar-SA"/>
-              </w:rPr>
-              <w:t xml:space="preserve">All prices are subject to an </w:t>
+              <w:t>{</w:t>
             </w:r>
             <w:r>
               <w:rPr>
@@ -2280,67 +2248,7 @@
                 <w:shd w:fill="auto" w:val="clear"/>
                 <w:lang w:val="en-US" w:eastAsia="en-US" w:bidi="ar-SA"/>
               </w:rPr>
-              <w:t>{{SERVICE_CHA</w:t>
-            </w:r>
-            <w:r>
-              <w:rPr>
-                <w:rFonts w:eastAsia="Aptos" w:cs="Open Sans" w:ascii="Open Sans" w:hAnsi="Open Sans"/>
-                <w:b/>
-                <w:bCs/>
-                <w:kern w:val="2"/>
-                <w:sz w:val="18"/>
-                <w:szCs w:val="18"/>
-                <w:shd w:fill="auto" w:val="clear"/>
-                <w:lang w:val="en-US" w:eastAsia="en-US" w:bidi="ar-SA"/>
-              </w:rPr>
-              <w:t>R</w:t>
-            </w:r>
-            <w:r>
-              <w:rPr>
-                <w:rFonts w:eastAsia="Aptos" w:cs="Open Sans" w:ascii="Open Sans" w:hAnsi="Open Sans"/>
-                <w:b/>
-                <w:bCs/>
-                <w:kern w:val="2"/>
-                <w:sz w:val="18"/>
-                <w:szCs w:val="18"/>
-                <w:shd w:fill="auto" w:val="clear"/>
-                <w:lang w:val="en-US" w:eastAsia="en-US" w:bidi="ar-SA"/>
-              </w:rPr>
-              <w:t>GE_RATE}} %</w:t>
-            </w:r>
-            <w:r>
-              <w:rPr>
-                <w:rFonts w:eastAsia="Aptos" w:cs="Open Sans" w:ascii="Open Sans" w:hAnsi="Open Sans"/>
-                <w:kern w:val="2"/>
-                <w:sz w:val="18"/>
-                <w:szCs w:val="18"/>
-                <w:lang w:val="en-US" w:eastAsia="en-US" w:bidi="ar-SA"/>
-              </w:rPr>
-              <w:t xml:space="preserve"> service and </w:t>
-            </w:r>
-            <w:r>
-              <w:rPr>
-                <w:rFonts w:eastAsia="Aptos" w:cs="Open Sans" w:ascii="Open Sans" w:hAnsi="Open Sans"/>
-                <w:kern w:val="2"/>
-                <w:sz w:val="18"/>
-                <w:szCs w:val="18"/>
-                <w:shd w:fill="auto" w:val="clear"/>
-                <w:lang w:val="en-US" w:eastAsia="en-US" w:bidi="ar-SA"/>
-              </w:rPr>
-              <w:t>{</w:t>
-            </w:r>
-            <w:r>
-              <w:rPr>
-                <w:rFonts w:eastAsia="Aptos" w:cs="Open Sans" w:ascii="Open Sans" w:hAnsi="Open Sans"/>
-                <w:b/>
-                <w:bCs/>
-                <w:kern w:val="2"/>
-                <w:sz w:val="18"/>
-                <w:szCs w:val="18"/>
-                <w:shd w:fill="auto" w:val="clear"/>
-                <w:lang w:val="en-US" w:eastAsia="en-US" w:bidi="ar-SA"/>
-              </w:rPr>
-              <w:t>{TAX_RATE}}%</w:t>
+              <w:t>{TAX_RATE}}</w:t>
             </w:r>
             <w:r>
               <w:rPr>
@@ -3976,7 +3884,7 @@
                     <wp:posOffset>2089785</wp:posOffset>
                   </wp:positionH>
                   <wp:positionV relativeFrom="paragraph">
-                    <wp:posOffset>6350</wp:posOffset>
+                    <wp:posOffset>5715</wp:posOffset>
                   </wp:positionV>
                   <wp:extent cx="3858260" cy="1271905"/>
                   <wp:effectExtent l="0" t="0" r="0" b="5080"/>
@@ -4034,7 +3942,7 @@
                   <v:path o:extrusionok="f" gradientshapeok="t" o:connecttype="rect"/>
                   <o:lock v:ext="edit" aspectratio="t"/>
                 </v:shapetype>
-                <v:shape id="shape_0" ID="Imagen 3" stroked="f" o:allowincell="f" style="position:absolute;margin-left:164.55pt;margin-top:0.5pt;width:303.75pt;height:100.1pt;mso-wrap-style:none;v-text-anchor:middle;rotation:180" wp14:anchorId="66026393" type="_x0000_t75">
+                <v:shape id="shape_0" ID="Imagen 3" stroked="f" o:allowincell="f" style="position:absolute;margin-left:164.55pt;margin-top:0.45pt;width:303.75pt;height:100.1pt;mso-wrap-style:none;v-text-anchor:middle;rotation:180" wp14:anchorId="66026393" type="_x0000_t75">
                   <v:imagedata r:id="rId2" o:detectmouseclick="t"/>
                   <v:stroke color="#3465a4" joinstyle="round" endcap="flat"/>
                   <w10:wrap type="none"/>

</xml_diff>

<commit_message>
chore: update estimate template documents with latest formatting changes
</commit_message>
<xml_diff>
--- a/estimate_template.docx
+++ b/estimate_template.docx
@@ -118,7 +118,7 @@
         <w:pStyle w:val="Default"/>
         <w:spacing w:after="0" w:line="240" w:lineRule="auto"/>
         <w:rPr>
-          <w:rFonts w:ascii="Open Sans" w:hAnsi="Open Sans" w:cs="Open Sans" w:hint="eastAsia"/>
+          <w:rFonts w:ascii="Open Sans" w:hAnsi="Open Sans" w:cs="Open Sans"/>
         </w:rPr>
       </w:pPr>
     </w:p>
@@ -127,7 +127,7 @@
         <w:pStyle w:val="Default"/>
         <w:spacing w:after="0" w:line="240" w:lineRule="auto"/>
         <w:rPr>
-          <w:rFonts w:ascii="Open Sans" w:hAnsi="Open Sans" w:cs="Open Sans" w:hint="eastAsia"/>
+          <w:rFonts w:ascii="Open Sans" w:hAnsi="Open Sans" w:cs="Open Sans"/>
           <w:b/>
           <w:color w:val="612D4A"/>
           <w:sz w:val="57"/>
@@ -139,7 +139,7 @@
         <w:pStyle w:val="Default"/>
         <w:spacing w:after="0" w:line="240" w:lineRule="auto"/>
         <w:rPr>
-          <w:rFonts w:ascii="Open Sans" w:hAnsi="Open Sans" w:cs="Open Sans" w:hint="eastAsia"/>
+          <w:rFonts w:ascii="Open Sans" w:hAnsi="Open Sans" w:cs="Open Sans"/>
           <w:b/>
           <w:color w:val="612D4A"/>
           <w:sz w:val="57"/>
@@ -156,7 +156,6 @@
           <w:lang w:val="en-US"/>
         </w:rPr>
       </w:pPr>
-      <w:proofErr w:type="spellStart"/>
       <w:r>
         <w:rPr>
           <w:rFonts w:ascii="Open Sans" w:hAnsi="Open Sans" w:cs="Open Sans"/>
@@ -165,62 +164,7 @@
           <w:sz w:val="57"/>
           <w:szCs w:val="57"/>
         </w:rPr>
-        <w:t>Foodesign</w:t>
-      </w:r>
-      <w:proofErr w:type="spellEnd"/>
-      <w:r>
-        <w:rPr>
-          <w:rFonts w:ascii="Open Sans" w:hAnsi="Open Sans" w:cs="Open Sans"/>
-          <w:b/>
-          <w:color w:val="612D4A"/>
-          <w:sz w:val="57"/>
-          <w:szCs w:val="57"/>
-        </w:rPr>
-        <w:t xml:space="preserve"> Conceptual </w:t>
-      </w:r>
-      <w:proofErr w:type="spellStart"/>
-      <w:r>
-        <w:rPr>
-          <w:rFonts w:ascii="Open Sans" w:hAnsi="Open Sans" w:cs="Open Sans"/>
-          <w:b/>
-          <w:color w:val="612D4A"/>
-          <w:sz w:val="57"/>
-          <w:szCs w:val="57"/>
-        </w:rPr>
-        <w:t>Events</w:t>
-      </w:r>
-      <w:proofErr w:type="spellEnd"/>
-      <w:r>
-        <w:rPr>
-          <w:rFonts w:ascii="Open Sans" w:hAnsi="Open Sans" w:cs="Open Sans"/>
-          <w:b/>
-          <w:color w:val="612D4A"/>
-          <w:sz w:val="57"/>
-          <w:szCs w:val="57"/>
-        </w:rPr>
-        <w:t xml:space="preserve"> </w:t>
-      </w:r>
-      <w:proofErr w:type="spellStart"/>
-      <w:r>
-        <w:rPr>
-          <w:rFonts w:ascii="Open Sans" w:hAnsi="Open Sans" w:cs="Open Sans"/>
-          <w:b/>
-          <w:color w:val="612D4A"/>
-          <w:sz w:val="57"/>
-          <w:szCs w:val="57"/>
-        </w:rPr>
-        <w:t>Proposal</w:t>
-      </w:r>
-      <w:proofErr w:type="spellEnd"/>
-      <w:r>
-        <w:rPr>
-          <w:rFonts w:ascii="Open Sans" w:hAnsi="Open Sans" w:cs="Open Sans"/>
-          <w:b/>
-          <w:color w:val="612D4A"/>
-          <w:sz w:val="57"/>
-          <w:szCs w:val="57"/>
-        </w:rPr>
-        <w:t>.</w:t>
+        <w:t>Foodesign Conceptual Events Proposal.</w:t>
       </w:r>
       <w:r>
         <w:br w:type="page"/>
@@ -517,14 +461,6 @@
             <w:pPr>
               <w:spacing w:after="0" w:line="240" w:lineRule="auto"/>
               <w:rPr>
-                <w:rFonts w:ascii="Open Sans" w:hAnsi="Open Sans" w:cs="Open Sans"/>
-                <w:sz w:val="18"/>
-                <w:szCs w:val="18"/>
-                <w:lang w:val="en-US"/>
-              </w:rPr>
-            </w:pPr>
-            <w:r>
-              <w:rPr>
                 <w:rFonts w:ascii="Open Sans" w:eastAsia="Aptos" w:hAnsi="Open Sans" w:cs="Open Sans"/>
                 <w:b/>
                 <w:color w:val="612D4B"/>
@@ -532,7 +468,39 @@
                 <w:szCs w:val="18"/>
                 <w:lang w:val="en-US"/>
               </w:rPr>
+            </w:pPr>
+            <w:r>
+              <w:rPr>
+                <w:rFonts w:ascii="Open Sans" w:eastAsia="Aptos" w:hAnsi="Open Sans" w:cs="Open Sans"/>
+                <w:b/>
+                <w:color w:val="612D4B"/>
+                <w:sz w:val="18"/>
+                <w:szCs w:val="18"/>
+                <w:lang w:val="en-US"/>
+              </w:rPr>
               <w:t>Event Details</w:t>
+            </w:r>
+          </w:p>
+          <w:p>
+            <w:pPr>
+              <w:spacing w:after="0" w:line="0" w:lineRule="atLeast"/>
+              <w:rPr>
+                <w:rFonts w:ascii="Open Sans" w:eastAsia="Aptos" w:hAnsi="Open Sans" w:cs="Open Sans"/>
+                <w:b/>
+                <w:color w:val="612D4B"/>
+                <w:sz w:val="18"/>
+                <w:szCs w:val="18"/>
+                <w:lang w:val="en-US"/>
+              </w:rPr>
+            </w:pPr>
+            <w:r>
+              <w:rPr>
+                <w:rFonts w:ascii="Open Sans" w:eastAsia="Aptos" w:hAnsi="Open Sans" w:cs="Open Sans"/>
+                <w:sz w:val="18"/>
+                <w:szCs w:val="18"/>
+                <w:lang w:val="en-US"/>
+              </w:rPr>
+              <w:t>{{EVENT_NAME}}</w:t>
             </w:r>
           </w:p>
           <w:p>
@@ -863,7 +831,6 @@
                 <w:lang w:val="en-US"/>
               </w:rPr>
             </w:pPr>
-            <w:proofErr w:type="spellStart"/>
             <w:r>
               <w:rPr>
                 <w:rFonts w:ascii="Open Sans" w:eastAsiaTheme="minorEastAsia" w:hAnsi="Open Sans" w:cs="Open Sans"/>
@@ -872,18 +839,7 @@
                 <w:szCs w:val="20"/>
                 <w:lang w:val="en-US"/>
               </w:rPr>
-              <w:t>Foodesign</w:t>
-            </w:r>
-            <w:proofErr w:type="spellEnd"/>
-            <w:r>
-              <w:rPr>
-                <w:rFonts w:ascii="Open Sans" w:eastAsiaTheme="minorEastAsia" w:hAnsi="Open Sans" w:cs="Open Sans"/>
-                <w:color w:val="323232"/>
-                <w:sz w:val="20"/>
-                <w:szCs w:val="20"/>
-                <w:lang w:val="en-US"/>
-              </w:rPr>
-              <w:t xml:space="preserve"> Conceptual Event</w:t>
+              <w:t>Foodesign Conceptual Event</w:t>
             </w:r>
             <w:r>
               <w:rPr>
@@ -1207,14 +1163,6 @@
             <w:pPr>
               <w:spacing w:after="0" w:line="240" w:lineRule="auto"/>
               <w:rPr>
-                <w:rFonts w:ascii="Open Sans" w:hAnsi="Open Sans" w:cs="Open Sans"/>
-                <w:sz w:val="18"/>
-                <w:szCs w:val="18"/>
-                <w:lang w:val="en-US"/>
-              </w:rPr>
-            </w:pPr>
-            <w:r>
-              <w:rPr>
                 <w:rFonts w:ascii="Open Sans" w:eastAsia="Aptos" w:hAnsi="Open Sans" w:cs="Open Sans"/>
                 <w:b/>
                 <w:color w:val="612D4B"/>
@@ -1222,7 +1170,39 @@
                 <w:szCs w:val="18"/>
                 <w:lang w:val="en-US"/>
               </w:rPr>
+            </w:pPr>
+            <w:r>
+              <w:rPr>
+                <w:rFonts w:ascii="Open Sans" w:eastAsia="Aptos" w:hAnsi="Open Sans" w:cs="Open Sans"/>
+                <w:b/>
+                <w:color w:val="612D4B"/>
+                <w:sz w:val="18"/>
+                <w:szCs w:val="18"/>
+                <w:lang w:val="en-US"/>
+              </w:rPr>
               <w:t>Event Details</w:t>
+            </w:r>
+          </w:p>
+          <w:p>
+            <w:pPr>
+              <w:spacing w:after="0" w:line="0" w:lineRule="atLeast"/>
+              <w:rPr>
+                <w:rFonts w:ascii="Open Sans" w:eastAsia="Aptos" w:hAnsi="Open Sans" w:cs="Open Sans"/>
+                <w:b/>
+                <w:color w:val="612D4B"/>
+                <w:sz w:val="18"/>
+                <w:szCs w:val="18"/>
+                <w:lang w:val="en-US"/>
+              </w:rPr>
+            </w:pPr>
+            <w:r>
+              <w:rPr>
+                <w:rFonts w:ascii="Open Sans" w:eastAsia="Aptos" w:hAnsi="Open Sans" w:cs="Open Sans"/>
+                <w:sz w:val="18"/>
+                <w:szCs w:val="18"/>
+                <w:lang w:val="en-US"/>
+              </w:rPr>
+              <w:t>{{EVENT_NAME}}</w:t>
             </w:r>
           </w:p>
           <w:p>
@@ -1429,27 +1409,7 @@
                 <w:szCs w:val="18"/>
                 <w:lang w:val="en-US"/>
               </w:rPr>
-              <w:t xml:space="preserve">If a client </w:t>
-            </w:r>
-            <w:proofErr w:type="spellStart"/>
-            <w:r>
-              <w:rPr>
-                <w:rFonts w:ascii="Open Sans" w:eastAsia="Aptos" w:hAnsi="Open Sans" w:cs="Open Sans"/>
-                <w:sz w:val="18"/>
-                <w:szCs w:val="18"/>
-                <w:lang w:val="en-US"/>
-              </w:rPr>
-              <w:t>resquets</w:t>
-            </w:r>
-            <w:proofErr w:type="spellEnd"/>
-            <w:r>
-              <w:rPr>
-                <w:rFonts w:ascii="Open Sans" w:eastAsia="Aptos" w:hAnsi="Open Sans" w:cs="Open Sans"/>
-                <w:sz w:val="18"/>
-                <w:szCs w:val="18"/>
-                <w:lang w:val="en-US"/>
-              </w:rPr>
-              <w:t xml:space="preserve"> that the caterer coordinate the venue rental &amp; décor, entertainment, photography, valet parking, flower arranging, or other aspects of planning the event, there will be a small fee charged for this service to account for the labor needed to plan the event as agreed upon in writing by the parties at the time of such request.</w:t>
+              <w:t>If a client resquets that the caterer coordinate the venue rental &amp; décor, entertainment, photography, valet parking, flower arranging, or other aspects of planning the event, there will be a small fee charged for this service to account for the labor needed to plan the event as agreed upon in writing by the parties at the time of such request.</w:t>
             </w:r>
           </w:p>
           <w:p>
@@ -1822,25 +1782,14 @@
                 <w:lang w:val="en-US"/>
               </w:rPr>
             </w:pPr>
-            <w:proofErr w:type="spellStart"/>
-            <w:r>
-              <w:rPr>
-                <w:rFonts w:ascii="Open Sans" w:eastAsia="Aptos" w:hAnsi="Open Sans" w:cs="Open Sans"/>
-                <w:sz w:val="18"/>
-                <w:szCs w:val="18"/>
-                <w:lang w:val="en-US"/>
-              </w:rPr>
-              <w:t>Foodesign</w:t>
-            </w:r>
-            <w:proofErr w:type="spellEnd"/>
-            <w:r>
-              <w:rPr>
-                <w:rFonts w:ascii="Open Sans" w:eastAsia="Aptos" w:hAnsi="Open Sans" w:cs="Open Sans"/>
-                <w:sz w:val="18"/>
-                <w:szCs w:val="18"/>
-                <w:lang w:val="en-US"/>
-              </w:rPr>
-              <w:t xml:space="preserve"> Conceptual Events and the Client acknowledge and agree that this proposal is governed by the Master Caterer Agreement executed between the parties.</w:t>
+            <w:r>
+              <w:rPr>
+                <w:rFonts w:ascii="Open Sans" w:eastAsia="Aptos" w:hAnsi="Open Sans" w:cs="Open Sans"/>
+                <w:sz w:val="18"/>
+                <w:szCs w:val="18"/>
+                <w:lang w:val="en-US"/>
+              </w:rPr>
+              <w:t>Foodesign Conceptual Events and the Client acknowledge and agree that this proposal is governed by the Master Caterer Agreement executed between the parties.</w:t>
             </w:r>
           </w:p>
           <w:p>
@@ -1898,27 +1847,7 @@
                 <w:szCs w:val="18"/>
                 <w:lang w:val="en-US"/>
               </w:rPr>
-              <w:t xml:space="preserve">The undersigned, as a duly authorized representative of the Client, {{CLIENT_NAME}}, hereby contract the services of </w:t>
-            </w:r>
-            <w:proofErr w:type="spellStart"/>
-            <w:r>
-              <w:rPr>
-                <w:rFonts w:ascii="Open Sans" w:eastAsia="Aptos" w:hAnsi="Open Sans" w:cs="Open Sans"/>
-                <w:sz w:val="18"/>
-                <w:szCs w:val="18"/>
-                <w:lang w:val="en-US"/>
-              </w:rPr>
-              <w:t>Foodesign</w:t>
-            </w:r>
-            <w:proofErr w:type="spellEnd"/>
-            <w:r>
-              <w:rPr>
-                <w:rFonts w:ascii="Open Sans" w:eastAsia="Aptos" w:hAnsi="Open Sans" w:cs="Open Sans"/>
-                <w:sz w:val="18"/>
-                <w:szCs w:val="18"/>
-                <w:lang w:val="en-US"/>
-              </w:rPr>
-              <w:t xml:space="preserve"> Conceptual Events as listed and quoted in this proposal on behalf of the Client according to the terms and conditions herein.</w:t>
+              <w:t>The undersigned, as a duly authorized representative of the Client, {{CLIENT_NAME}}, hereby contract the services of Foodesign Conceptual Events as listed and quoted in this proposal on behalf of the Client according to the terms and conditions herein.</w:t>
             </w:r>
           </w:p>
           <w:p>
@@ -2051,18 +1980,6 @@
           <w:p>
             <w:pPr>
               <w:spacing w:after="0" w:line="240" w:lineRule="auto"/>
-              <w:jc w:val="both"/>
-              <w:rPr>
-                <w:rFonts w:ascii="Open Sans" w:hAnsi="Open Sans" w:cs="Open Sans"/>
-                <w:sz w:val="18"/>
-                <w:szCs w:val="18"/>
-                <w:lang w:val="en-US"/>
-              </w:rPr>
-            </w:pPr>
-          </w:p>
-          <w:p>
-            <w:pPr>
-              <w:spacing w:after="0" w:line="240" w:lineRule="auto"/>
               <w:rPr>
                 <w:rFonts w:ascii="Open Sans" w:hAnsi="Open Sans" w:cs="Open Sans"/>
                 <w:b/>
@@ -2072,7 +1989,6 @@
                 <w:lang w:val="en-US"/>
               </w:rPr>
             </w:pPr>
-            <w:proofErr w:type="spellStart"/>
             <w:r>
               <w:rPr>
                 <w:rFonts w:ascii="Open Sans" w:eastAsia="Aptos" w:hAnsi="Open Sans" w:cs="Open Sans"/>
@@ -2082,19 +1998,8 @@
                 <w:szCs w:val="18"/>
                 <w:lang w:val="en-US"/>
               </w:rPr>
-              <w:t>Foodesign</w:t>
-            </w:r>
-            <w:proofErr w:type="spellEnd"/>
-            <w:r>
-              <w:rPr>
-                <w:rFonts w:ascii="Open Sans" w:eastAsia="Aptos" w:hAnsi="Open Sans" w:cs="Open Sans"/>
-                <w:b/>
-                <w:bCs/>
-                <w:sz w:val="18"/>
-                <w:szCs w:val="18"/>
-                <w:lang w:val="en-US"/>
-              </w:rPr>
-              <w:t xml:space="preserve"> Conceptual Events Policies</w:t>
+              <w:lastRenderedPageBreak/>
+              <w:t>Foodesign Conceptual Events Policies</w:t>
             </w:r>
           </w:p>
           <w:p>
@@ -2341,25 +2246,14 @@
                 <w:lang w:val="en-US"/>
               </w:rPr>
             </w:pPr>
-            <w:proofErr w:type="spellStart"/>
-            <w:r>
-              <w:rPr>
-                <w:rFonts w:ascii="Open Sans" w:eastAsia="Aptos" w:hAnsi="Open Sans" w:cs="Open Sans"/>
-                <w:sz w:val="18"/>
-                <w:szCs w:val="18"/>
-                <w:lang w:val="en-US"/>
-              </w:rPr>
-              <w:t>Foodesign</w:t>
-            </w:r>
-            <w:proofErr w:type="spellEnd"/>
-            <w:r>
-              <w:rPr>
-                <w:rFonts w:ascii="Open Sans" w:eastAsia="Aptos" w:hAnsi="Open Sans" w:cs="Open Sans"/>
-                <w:sz w:val="18"/>
-                <w:szCs w:val="18"/>
-                <w:lang w:val="en-US"/>
-              </w:rPr>
-              <w:t xml:space="preserve"> Conceptual Events accept cash, MasterCard, Visa, Amex or Personal Checks as Payment Options. If Mastercard, Visa, or AMEX is the preferred payment method, a 3.8% credit card fee will be added to the total amount.</w:t>
+            <w:r>
+              <w:rPr>
+                <w:rFonts w:ascii="Open Sans" w:eastAsia="Aptos" w:hAnsi="Open Sans" w:cs="Open Sans"/>
+                <w:sz w:val="18"/>
+                <w:szCs w:val="18"/>
+                <w:lang w:val="en-US"/>
+              </w:rPr>
+              <w:t>Foodesign Conceptual Events accept cash, MasterCard, Visa, Amex or Personal Checks as Payment Options. If Mastercard, Visa, or AMEX is the preferred payment method, a 3.8% credit card fee will be added to the total amount.</w:t>
             </w:r>
           </w:p>
           <w:p>
@@ -2379,25 +2273,14 @@
                 <w:lang w:val="en-US"/>
               </w:rPr>
             </w:pPr>
-            <w:proofErr w:type="spellStart"/>
-            <w:r>
-              <w:rPr>
-                <w:rFonts w:ascii="Open Sans" w:eastAsia="Aptos" w:hAnsi="Open Sans" w:cs="Open Sans"/>
-                <w:sz w:val="18"/>
-                <w:szCs w:val="18"/>
-                <w:lang w:val="en-US"/>
-              </w:rPr>
-              <w:t>Foodesign</w:t>
-            </w:r>
-            <w:proofErr w:type="spellEnd"/>
-            <w:r>
-              <w:rPr>
-                <w:rFonts w:ascii="Open Sans" w:eastAsia="Aptos" w:hAnsi="Open Sans" w:cs="Open Sans"/>
-                <w:sz w:val="18"/>
-                <w:szCs w:val="18"/>
-                <w:lang w:val="en-US"/>
-              </w:rPr>
-              <w:t xml:space="preserve"> Conceptual Events, will not be liable for a failure to perform this contract due to delays, strikes, storms, accidents, venue accessibility, or other causes beyond its control</w:t>
+            <w:r>
+              <w:rPr>
+                <w:rFonts w:ascii="Open Sans" w:eastAsia="Aptos" w:hAnsi="Open Sans" w:cs="Open Sans"/>
+                <w:sz w:val="18"/>
+                <w:szCs w:val="18"/>
+                <w:lang w:val="en-US"/>
+              </w:rPr>
+              <w:t>Foodesign Conceptual Events, will not be liable for a failure to perform this contract due to delays, strikes, storms, accidents, venue accessibility, or other causes beyond its control</w:t>
             </w:r>
           </w:p>
           <w:p>
@@ -2471,6 +2354,24 @@
                 <w:szCs w:val="18"/>
                 <w:lang w:val="en-US"/>
               </w:rPr>
+              <w:t>__________________________________________</w:t>
+            </w:r>
+            <w:r>
+              <w:rPr>
+                <w:rFonts w:ascii="Open Sans" w:eastAsia="Aptos" w:hAnsi="Open Sans" w:cs="Open Sans"/>
+                <w:sz w:val="18"/>
+                <w:szCs w:val="18"/>
+                <w:lang w:val="en-US"/>
+              </w:rPr>
+              <w:br/>
+            </w:r>
+            <w:r>
+              <w:rPr>
+                <w:rFonts w:ascii="Open Sans" w:eastAsia="Aptos" w:hAnsi="Open Sans" w:cs="Open Sans"/>
+                <w:sz w:val="18"/>
+                <w:szCs w:val="18"/>
+                <w:lang w:val="en-US"/>
+              </w:rPr>
               <w:t>Client’s Signature &amp; Dat</w:t>
             </w:r>
             <w:r>
@@ -2480,16 +2381,7 @@
                 <w:szCs w:val="18"/>
                 <w:lang w:val="en-US"/>
               </w:rPr>
-              <w:t xml:space="preserve">e </w:t>
-            </w:r>
-            <w:r>
-              <w:rPr>
-                <w:rFonts w:ascii="Open Sans" w:eastAsia="Aptos" w:hAnsi="Open Sans" w:cs="Open Sans"/>
-                <w:sz w:val="18"/>
-                <w:szCs w:val="18"/>
-                <w:lang w:val="en-US"/>
-              </w:rPr>
-              <w:t>__________________________________________</w:t>
+              <w:t>e</w:t>
             </w:r>
           </w:p>
         </w:tc>

</xml_diff>